<commit_message>
Level 1 branding, Course levels menu, book in English and Vietnamese
Co-Authored-By: Claude Opus 5.5 <noreply@anthropic.com>
</commit_message>
<xml_diff>
--- a/en/files/assignments/Manuscript_Brief.docx
+++ b/en/files/assignments/Manuscript_Brief.docx
@@ -15,7 +15,7 @@
         <w:pStyle w:val="Subtitle"/>
       </w:pPr>
       <w:r>
-        <w:t>Foundations of Clinical Research: From Clinical Question to Publication</w:t>
+        <w:t>Foundations of Clinical Research — Level 1: From Clinical Question to Publication</w:t>
       </w:r>
     </w:p>
     <w:p>
@@ -3861,7 +3861,7 @@
         <w:color w:val="04242F"/>
         <w:sz w:val="16"/>
       </w:rPr>
-      <w:t>Foundations of Clinical Research  ·  Group manuscript brief</w:t>
+      <w:t>Foundations of Clinical Research — Level 1  ·  Group manuscript brief</w:t>
     </w:r>
     <w:r>
       <w:tab/>

</xml_diff>

<commit_message>
Natural-writing style pass across the site
Co-Authored-By: Claude Opus 5.5 <noreply@anthropic.com>
</commit_message>
<xml_diff>
--- a/en/files/assignments/Manuscript_Brief.docx
+++ b/en/files/assignments/Manuscript_Brief.docx
@@ -7,7 +7,7 @@
         <w:pStyle w:val="Title"/>
       </w:pPr>
       <w:r>
-        <w:t>Group Manuscript — Assignment Brief (Group Product 2)</w:t>
+        <w:t>Group Manuscript: Assignment Brief (Group Product 2)</w:t>
       </w:r>
     </w:p>
     <w:p>
@@ -15,7 +15,7 @@
         <w:pStyle w:val="Subtitle"/>
       </w:pPr>
       <w:r>
-        <w:t>Foundations of Clinical Research — Level 1: From Clinical Question to Publication</w:t>
+        <w:t>Foundations of Clinical Research · Level 1: From Clinical Question to Publication</w:t>
       </w:r>
     </w:p>
     <w:p>
@@ -26,13 +26,16 @@
         <w:t>Organisation:</w:t>
       </w:r>
       <w:r>
-        <w:t xml:space="preserve"> Neudata — </w:t>
+        <w:t xml:space="preserve"> Neudata (</w:t>
       </w:r>
       <w:r>
         <w:rPr>
           <w:i/>
         </w:rPr>
         <w:t>#ClearDataClearImpact</w:t>
+      </w:r>
+      <w:r>
+        <w:t>)</w:t>
       </w:r>
     </w:p>
     <w:p>
@@ -43,7 +46,7 @@
         <w:t>Assessment type:</w:t>
       </w:r>
       <w:r>
-        <w:t xml:space="preserve"> Group assignment — analysed in Sessions 5–6, written in Sessions 7–8, peer reviewed in the 2 weeks after Session 8</w:t>
+        <w:t xml:space="preserve"> Group assignment, analysed in Sessions 5–6, written in Sessions 7–8, peer reviewed in the 2 weeks after Session 8</w:t>
       </w:r>
     </w:p>
     <w:p>
@@ -54,7 +57,7 @@
         <w:t>Groups:</w:t>
       </w:r>
       <w:r>
-        <w:t xml:space="preserve"> the same 5 groups as for the proposal; each group answers a </w:t>
+        <w:t xml:space="preserve"> the same 5 groups as for the proposal. Each group answers a </w:t>
       </w:r>
       <w:r>
         <w:rPr>
@@ -132,7 +135,7 @@
         <w:t>has</w:t>
       </w:r>
       <w:r>
-        <w:t xml:space="preserve"> been done and turn them into a paper that a journal could review. You will practise everything from Sessions 5–8 — reading Table 1 and regression outputs, writing Methods and Results, calibrated language in the Discussion, the abstract and title, a reporting checklist, peer review and responding to reviewers.</w:t>
+        <w:t xml:space="preserve"> been done and turn them into a paper that a journal could review. You will practise everything from Sessions 5–8: reading Table 1 and regression outputs, writing Methods and Results, calibrated language in the Discussion, the abstract and title, a reporting checklist, peer review and responding to reviewers.</w:t>
       </w:r>
     </w:p>
     <w:p>
@@ -177,7 +180,7 @@
         <w:rPr>
           <w:b/>
         </w:rPr>
-        <w:t>Important — simulated data.</w:t>
+        <w:t>Important: simulated data.</w:t>
       </w:r>
       <w:r>
         <w:t xml:space="preserve"> FLUID-ICU is a </w:t>
@@ -2007,8 +2010,8 @@
       </w:tblPr>
       <w:tblGrid>
         <w:gridCol w:w="1615"/>
-        <w:gridCol w:w="1275"/>
-        <w:gridCol w:w="6520"/>
+        <w:gridCol w:w="1299"/>
+        <w:gridCol w:w="6496"/>
       </w:tblGrid>
       <w:tr>
         <w:trPr>
@@ -2043,7 +2046,7 @@
         </w:tc>
         <w:tc>
           <w:tcPr>
-            <w:tcW w:type="dxa" w:w="1276"/>
+            <w:tcW w:type="dxa" w:w="1299"/>
             <w:tcBorders>
               <w:top w:val="single" w:sz="4" w:color="04242F"/>
               <w:left w:val="single" w:sz="4" w:color="04242F"/>
@@ -2069,7 +2072,7 @@
         </w:tc>
         <w:tc>
           <w:tcPr>
-            <w:tcW w:type="dxa" w:w="6520"/>
+            <w:tcW w:type="dxa" w:w="6496"/>
             <w:tcBorders>
               <w:top w:val="single" w:sz="4" w:color="04242F"/>
               <w:left w:val="single" w:sz="4" w:color="04242F"/>
@@ -2123,7 +2126,7 @@
         </w:tc>
         <w:tc>
           <w:tcPr>
-            <w:tcW w:type="dxa" w:w="1276"/>
+            <w:tcW w:type="dxa" w:w="1299"/>
             <w:tcBorders>
               <w:top w:val="single" w:sz="4" w:color="D5DDE1"/>
               <w:left w:val="single" w:sz="4" w:color="D5DDE1"/>
@@ -2140,13 +2143,13 @@
               <w:rPr>
                 <w:sz w:val="17"/>
               </w:rPr>
-              <w:t>—</w:t>
+              <w:t>No target</w:t>
             </w:r>
           </w:p>
         </w:tc>
         <w:tc>
           <w:tcPr>
-            <w:tcW w:type="dxa" w:w="6520"/>
+            <w:tcW w:type="dxa" w:w="6496"/>
             <w:tcBorders>
               <w:top w:val="single" w:sz="4" w:color="D5DDE1"/>
               <w:left w:val="single" w:sz="4" w:color="D5DDE1"/>
@@ -2198,7 +2201,7 @@
         </w:tc>
         <w:tc>
           <w:tcPr>
-            <w:tcW w:type="dxa" w:w="1276"/>
+            <w:tcW w:type="dxa" w:w="1299"/>
             <w:tcBorders>
               <w:top w:val="single" w:sz="4" w:color="D5DDE1"/>
               <w:left w:val="single" w:sz="4" w:color="D5DDE1"/>
@@ -2222,7 +2225,7 @@
         </w:tc>
         <w:tc>
           <w:tcPr>
-            <w:tcW w:type="dxa" w:w="6520"/>
+            <w:tcW w:type="dxa" w:w="6496"/>
             <w:tcBorders>
               <w:top w:val="single" w:sz="4" w:color="D5DDE1"/>
               <w:left w:val="single" w:sz="4" w:color="D5DDE1"/>
@@ -2274,7 +2277,7 @@
         </w:tc>
         <w:tc>
           <w:tcPr>
-            <w:tcW w:type="dxa" w:w="1276"/>
+            <w:tcW w:type="dxa" w:w="1299"/>
             <w:tcBorders>
               <w:top w:val="single" w:sz="4" w:color="D5DDE1"/>
               <w:left w:val="single" w:sz="4" w:color="D5DDE1"/>
@@ -2297,7 +2300,7 @@
         </w:tc>
         <w:tc>
           <w:tcPr>
-            <w:tcW w:type="dxa" w:w="6520"/>
+            <w:tcW w:type="dxa" w:w="6496"/>
             <w:tcBorders>
               <w:top w:val="single" w:sz="4" w:color="D5DDE1"/>
               <w:left w:val="single" w:sz="4" w:color="D5DDE1"/>
@@ -2314,7 +2317,7 @@
               <w:rPr>
                 <w:sz w:val="17"/>
               </w:rPr>
-              <w:t>Three paragraphs: what is known → what is not known → the aim</w:t>
+              <w:t>Three paragraphs: what is known, then what is not known, then the aim</w:t>
             </w:r>
           </w:p>
         </w:tc>
@@ -2349,7 +2352,7 @@
         </w:tc>
         <w:tc>
           <w:tcPr>
-            <w:tcW w:type="dxa" w:w="1276"/>
+            <w:tcW w:type="dxa" w:w="1299"/>
             <w:tcBorders>
               <w:top w:val="single" w:sz="4" w:color="D5DDE1"/>
               <w:left w:val="single" w:sz="4" w:color="D5DDE1"/>
@@ -2373,7 +2376,7 @@
         </w:tc>
         <w:tc>
           <w:tcPr>
-            <w:tcW w:type="dxa" w:w="6520"/>
+            <w:tcW w:type="dxa" w:w="6496"/>
             <w:tcBorders>
               <w:top w:val="single" w:sz="4" w:color="D5DDE1"/>
               <w:left w:val="single" w:sz="4" w:color="D5DDE1"/>
@@ -2425,7 +2428,7 @@
         </w:tc>
         <w:tc>
           <w:tcPr>
-            <w:tcW w:type="dxa" w:w="1276"/>
+            <w:tcW w:type="dxa" w:w="1299"/>
             <w:tcBorders>
               <w:top w:val="single" w:sz="4" w:color="D5DDE1"/>
               <w:left w:val="single" w:sz="4" w:color="D5DDE1"/>
@@ -2448,7 +2451,7 @@
         </w:tc>
         <w:tc>
           <w:tcPr>
-            <w:tcW w:type="dxa" w:w="6520"/>
+            <w:tcW w:type="dxa" w:w="6496"/>
             <w:tcBorders>
               <w:top w:val="single" w:sz="4" w:color="D5DDE1"/>
               <w:left w:val="single" w:sz="4" w:color="D5DDE1"/>
@@ -2500,7 +2503,7 @@
         </w:tc>
         <w:tc>
           <w:tcPr>
-            <w:tcW w:type="dxa" w:w="1276"/>
+            <w:tcW w:type="dxa" w:w="1299"/>
             <w:tcBorders>
               <w:top w:val="single" w:sz="4" w:color="D5DDE1"/>
               <w:left w:val="single" w:sz="4" w:color="D5DDE1"/>
@@ -2524,7 +2527,7 @@
         </w:tc>
         <w:tc>
           <w:tcPr>
-            <w:tcW w:type="dxa" w:w="6520"/>
+            <w:tcW w:type="dxa" w:w="6496"/>
             <w:tcBorders>
               <w:top w:val="single" w:sz="4" w:color="D5DDE1"/>
               <w:left w:val="single" w:sz="4" w:color="D5DDE1"/>
@@ -2542,7 +2545,7 @@
               <w:rPr>
                 <w:sz w:val="17"/>
               </w:rPr>
-              <w:t>Main finding → comparison with literature (incl. Paper 2) → possible explanations → strengths and limitations → implications → conclusion</w:t>
+              <w:t>In this order: main finding, comparison with literature (incl. Paper 2), possible explanations, strengths and limitations, implications, conclusion</w:t>
             </w:r>
           </w:p>
         </w:tc>
@@ -2577,7 +2580,7 @@
         </w:tc>
         <w:tc>
           <w:tcPr>
-            <w:tcW w:type="dxa" w:w="1276"/>
+            <w:tcW w:type="dxa" w:w="1299"/>
             <w:tcBorders>
               <w:top w:val="single" w:sz="4" w:color="D5DDE1"/>
               <w:left w:val="single" w:sz="4" w:color="D5DDE1"/>
@@ -2601,7 +2604,7 @@
         </w:tc>
         <w:tc>
           <w:tcPr>
-            <w:tcW w:type="dxa" w:w="6520"/>
+            <w:tcW w:type="dxa" w:w="6496"/>
             <w:tcBorders>
               <w:top w:val="single" w:sz="4" w:color="D5DDE1"/>
               <w:left w:val="single" w:sz="4" w:color="D5DDE1"/>
@@ -2653,7 +2656,7 @@
         </w:tc>
         <w:tc>
           <w:tcPr>
-            <w:tcW w:type="dxa" w:w="1276"/>
+            <w:tcW w:type="dxa" w:w="1299"/>
             <w:tcBorders>
               <w:top w:val="single" w:sz="4" w:color="D5DDE1"/>
               <w:left w:val="single" w:sz="4" w:color="D5DDE1"/>
@@ -2677,7 +2680,7 @@
         </w:tc>
         <w:tc>
           <w:tcPr>
-            <w:tcW w:type="dxa" w:w="6520"/>
+            <w:tcW w:type="dxa" w:w="6496"/>
             <w:tcBorders>
               <w:top w:val="single" w:sz="4" w:color="D5DDE1"/>
               <w:left w:val="single" w:sz="4" w:color="D5DDE1"/>
@@ -2729,7 +2732,7 @@
         </w:tc>
         <w:tc>
           <w:tcPr>
-            <w:tcW w:type="dxa" w:w="1276"/>
+            <w:tcW w:type="dxa" w:w="1299"/>
             <w:tcBorders>
               <w:top w:val="single" w:sz="4" w:color="D5DDE1"/>
               <w:left w:val="single" w:sz="4" w:color="D5DDE1"/>
@@ -2752,7 +2755,7 @@
         </w:tc>
         <w:tc>
           <w:tcPr>
-            <w:tcW w:type="dxa" w:w="6520"/>
+            <w:tcW w:type="dxa" w:w="6496"/>
             <w:tcBorders>
               <w:top w:val="single" w:sz="4" w:color="D5DDE1"/>
               <w:left w:val="single" w:sz="4" w:color="D5DDE1"/>
@@ -2803,7 +2806,7 @@
         </w:tc>
         <w:tc>
           <w:tcPr>
-            <w:tcW w:type="dxa" w:w="1276"/>
+            <w:tcW w:type="dxa" w:w="1299"/>
             <w:tcBorders>
               <w:top w:val="single" w:sz="4" w:color="D5DDE1"/>
               <w:left w:val="single" w:sz="4" w:color="D5DDE1"/>
@@ -2826,7 +2829,7 @@
         </w:tc>
         <w:tc>
           <w:tcPr>
-            <w:tcW w:type="dxa" w:w="6520"/>
+            <w:tcW w:type="dxa" w:w="6496"/>
             <w:tcBorders>
               <w:top w:val="single" w:sz="4" w:color="D5DDE1"/>
               <w:left w:val="single" w:sz="4" w:color="D5DDE1"/>
@@ -3303,7 +3306,7 @@
         <w:t>Numbers:</w:t>
       </w:r>
       <w:r>
-        <w:t xml:space="preserve"> report only numbers from your results pack (or from your own reproduction with the course scripts, if you used them, and say so). Never round in ways that change the meaning; give 95% CIs with every main estimate.</w:t>
+        <w:t xml:space="preserve"> report only numbers from your results pack (or from your own reproduction with the course scripts, if you used them, and say so). Never round in ways that change the meaning. Give 95% CIs with every main estimate.</w:t>
       </w:r>
     </w:p>
     <w:p>
@@ -3345,7 +3348,7 @@
         <w:t>Originality:</w:t>
       </w:r>
       <w:r>
-        <w:t xml:space="preserve"> write in your own words; cite every source; quote sparingly and with quotation marks.</w:t>
+        <w:t xml:space="preserve"> write in your own words and cite every source. Quote sparingly and with quotation marks.</w:t>
       </w:r>
     </w:p>
     <w:p>
@@ -3398,7 +3401,7 @@
         <w:t>do not paste it into an AI tool</w:t>
       </w:r>
       <w:r>
-        <w:t xml:space="preserve"> — it is confidential.</w:t>
+        <w:t>. It is confidential.</w:t>
       </w:r>
     </w:p>
     <w:p>
@@ -3727,7 +3730,7 @@
         <w:t>1-minute manuscript pitch</w:t>
       </w:r>
       <w:r>
-        <w:t xml:space="preserve"> (question, main result with 95% CI, one-sentence conclusion) in the presentation block — see </w:t>
+        <w:t xml:space="preserve"> (question, main result with 95% CI, one-sentence conclusion) in the presentation block (see </w:t>
       </w:r>
       <w:r>
         <w:rPr>
@@ -3738,7 +3741,7 @@
         <w:t>Presentation_Guide.pdf</w:t>
       </w:r>
       <w:r>
-        <w:t>.</w:t>
+        <w:t>).</w:t>
       </w:r>
     </w:p>
     <w:p>
@@ -3861,7 +3864,7 @@
         <w:color w:val="04242F"/>
         <w:sz w:val="16"/>
       </w:rPr>
-      <w:t>Foundations of Clinical Research — Level 1  ·  Group manuscript brief</w:t>
+      <w:t>Foundations of Clinical Research · Level 1  ·  Group manuscript brief</w:t>
     </w:r>
     <w:r>
       <w:tab/>

</xml_diff>

<commit_message>
Arial font; plain bullets instead of numbered markers
Co-Authored-By: Claude Opus 5.5 <noreply@anthropic.com>
</commit_message>
<xml_diff>
--- a/en/files/assignments/Manuscript_Brief.docx
+++ b/en/files/assignments/Manuscript_Brief.docx
@@ -1135,8 +1135,8 @@
       <w:tblGrid>
         <w:gridCol w:w="1729"/>
         <w:gridCol w:w="1502"/>
-        <w:gridCol w:w="4287"/>
-        <w:gridCol w:w="1892"/>
+        <w:gridCol w:w="3976"/>
+        <w:gridCol w:w="2203"/>
       </w:tblGrid>
       <w:tr>
         <w:trPr>
@@ -1197,7 +1197,7 @@
         </w:tc>
         <w:tc>
           <w:tcPr>
-            <w:tcW w:type="dxa" w:w="4287"/>
+            <w:tcW w:type="dxa" w:w="3976"/>
             <w:tcBorders>
               <w:top w:val="single" w:sz="4" w:color="04242F"/>
               <w:left w:val="single" w:sz="4" w:color="04242F"/>
@@ -1223,7 +1223,7 @@
         </w:tc>
         <w:tc>
           <w:tcPr>
-            <w:tcW w:type="dxa" w:w="1893"/>
+            <w:tcW w:type="dxa" w:w="2203"/>
             <w:tcBorders>
               <w:top w:val="single" w:sz="4" w:color="04242F"/>
               <w:left w:val="single" w:sz="4" w:color="04242F"/>
@@ -1307,7 +1307,7 @@
         </w:tc>
         <w:tc>
           <w:tcPr>
-            <w:tcW w:type="dxa" w:w="4287"/>
+            <w:tcW w:type="dxa" w:w="3976"/>
             <w:tcBorders>
               <w:top w:val="single" w:sz="4" w:color="D5DDE1"/>
               <w:left w:val="single" w:sz="4" w:color="D5DDE1"/>
@@ -1330,7 +1330,7 @@
         </w:tc>
         <w:tc>
           <w:tcPr>
-            <w:tcW w:type="dxa" w:w="1893"/>
+            <w:tcW w:type="dxa" w:w="2203"/>
             <w:tcBorders>
               <w:top w:val="single" w:sz="4" w:color="D5DDE1"/>
               <w:left w:val="single" w:sz="4" w:color="D5DDE1"/>
@@ -1413,7 +1413,7 @@
         </w:tc>
         <w:tc>
           <w:tcPr>
-            <w:tcW w:type="dxa" w:w="4287"/>
+            <w:tcW w:type="dxa" w:w="3976"/>
             <w:tcBorders>
               <w:top w:val="single" w:sz="4" w:color="D5DDE1"/>
               <w:left w:val="single" w:sz="4" w:color="D5DDE1"/>
@@ -1437,7 +1437,7 @@
         </w:tc>
         <w:tc>
           <w:tcPr>
-            <w:tcW w:type="dxa" w:w="1893"/>
+            <w:tcW w:type="dxa" w:w="2203"/>
             <w:tcBorders>
               <w:top w:val="single" w:sz="4" w:color="D5DDE1"/>
               <w:left w:val="single" w:sz="4" w:color="D5DDE1"/>
@@ -1519,7 +1519,7 @@
         </w:tc>
         <w:tc>
           <w:tcPr>
-            <w:tcW w:type="dxa" w:w="4287"/>
+            <w:tcW w:type="dxa" w:w="3976"/>
             <w:tcBorders>
               <w:top w:val="single" w:sz="4" w:color="D5DDE1"/>
               <w:left w:val="single" w:sz="4" w:color="D5DDE1"/>
@@ -1542,7 +1542,7 @@
         </w:tc>
         <w:tc>
           <w:tcPr>
-            <w:tcW w:type="dxa" w:w="1893"/>
+            <w:tcW w:type="dxa" w:w="2203"/>
             <w:tcBorders>
               <w:top w:val="single" w:sz="4" w:color="D5DDE1"/>
               <w:left w:val="single" w:sz="4" w:color="D5DDE1"/>
@@ -1559,7 +1559,7 @@
               <w:rPr>
                 <w:sz w:val="17"/>
               </w:rPr>
-              <w:t>About 600 words + Table 1 + one further table or figure</w:t>
+              <w:t>First draft of about 600 words (final length: Methods about 550, Results about 450; see the table below) + Table 1 + one further table or figure</w:t>
             </w:r>
           </w:p>
         </w:tc>
@@ -1625,7 +1625,7 @@
         </w:tc>
         <w:tc>
           <w:tcPr>
-            <w:tcW w:type="dxa" w:w="4287"/>
+            <w:tcW w:type="dxa" w:w="3976"/>
             <w:tcBorders>
               <w:top w:val="single" w:sz="4" w:color="D5DDE1"/>
               <w:left w:val="single" w:sz="4" w:color="D5DDE1"/>
@@ -1649,7 +1649,7 @@
         </w:tc>
         <w:tc>
           <w:tcPr>
-            <w:tcW w:type="dxa" w:w="1893"/>
+            <w:tcW w:type="dxa" w:w="2203"/>
             <w:tcBorders>
               <w:top w:val="single" w:sz="4" w:color="D5DDE1"/>
               <w:left w:val="single" w:sz="4" w:color="D5DDE1"/>
@@ -1726,7 +1726,7 @@
         </w:tc>
         <w:tc>
           <w:tcPr>
-            <w:tcW w:type="dxa" w:w="4287"/>
+            <w:tcW w:type="dxa" w:w="3976"/>
             <w:tcBorders>
               <w:top w:val="single" w:sz="4" w:color="D5DDE1"/>
               <w:left w:val="single" w:sz="4" w:color="D5DDE1"/>
@@ -1749,7 +1749,7 @@
         </w:tc>
         <w:tc>
           <w:tcPr>
-            <w:tcW w:type="dxa" w:w="1893"/>
+            <w:tcW w:type="dxa" w:w="2203"/>
             <w:tcBorders>
               <w:top w:val="single" w:sz="4" w:color="D5DDE1"/>
               <w:left w:val="single" w:sz="4" w:color="D5DDE1"/>
@@ -1826,7 +1826,7 @@
         </w:tc>
         <w:tc>
           <w:tcPr>
-            <w:tcW w:type="dxa" w:w="4287"/>
+            <w:tcW w:type="dxa" w:w="3976"/>
             <w:tcBorders>
               <w:top w:val="single" w:sz="4" w:color="D5DDE1"/>
               <w:left w:val="single" w:sz="4" w:color="D5DDE1"/>
@@ -1864,7 +1864,7 @@
         </w:tc>
         <w:tc>
           <w:tcPr>
-            <w:tcW w:type="dxa" w:w="1893"/>
+            <w:tcW w:type="dxa" w:w="2203"/>
             <w:tcBorders>
               <w:top w:val="single" w:sz="4" w:color="D5DDE1"/>
               <w:left w:val="single" w:sz="4" w:color="D5DDE1"/>
@@ -1938,7 +1938,7 @@
         </w:tc>
         <w:tc>
           <w:tcPr>
-            <w:tcW w:type="dxa" w:w="4287"/>
+            <w:tcW w:type="dxa" w:w="3976"/>
             <w:tcBorders>
               <w:top w:val="single" w:sz="4" w:color="D5DDE1"/>
               <w:left w:val="single" w:sz="4" w:color="D5DDE1"/>
@@ -1960,7 +1960,7 @@
         </w:tc>
         <w:tc>
           <w:tcPr>
-            <w:tcW w:type="dxa" w:w="1893"/>
+            <w:tcW w:type="dxa" w:w="2203"/>
             <w:tcBorders>
               <w:top w:val="single" w:sz="4" w:color="D5DDE1"/>
               <w:left w:val="single" w:sz="4" w:color="D5DDE1"/>

</xml_diff>

<commit_message>
Rebuild site: reviewer comments addressed, Vietnamese materials, online format
Vietnamese pages now use Vietnamese documents and downloads throughout,
course-level pages in Vietnamese, Word exercise sheets, original papers,
visual break slides, editable table slides with key messages, and the
whole-class online format from 12 Oct.
</commit_message>
<xml_diff>
--- a/en/files/assignments/Manuscript_Brief.docx
+++ b/en/files/assignments/Manuscript_Brief.docx
@@ -7,7 +7,7 @@
         <w:pStyle w:val="Title"/>
       </w:pPr>
       <w:r>
-        <w:t>Group Manuscript: Assignment Brief (Group Product 2)</w:t>
+        <w:t>Draft Manuscript: Assignment Brief (Individual Product 2)</w:t>
       </w:r>
     </w:p>
     <w:p>
@@ -46,7 +46,7 @@
         <w:t>Assessment type:</w:t>
       </w:r>
       <w:r>
-        <w:t xml:space="preserve"> Group assignment, analysed in Sessions 5–6, written in Sessions 7–8, peer reviewed in the 2 weeks after Session 8</w:t>
+        <w:t xml:space="preserve"> Individual assignment. Results read together in Sessions 5 and 6, writing modelled live in Sessions 7 and 8 and done by you as homework, peer reviewed in the 2 weeks after Session 8.</w:t>
       </w:r>
     </w:p>
     <w:p>
@@ -54,16 +54,30 @@
         <w:rPr>
           <w:b/>
         </w:rPr>
-        <w:t>Groups:</w:t>
+        <w:t>Who:</w:t>
       </w:r>
       <w:r>
-        <w:t xml:space="preserve"> the same 5 groups as for the proposal. Each group answers a </w:t>
+        <w:t xml:space="preserve"> every participant writes their own manuscript. You choose </w:t>
       </w:r>
       <w:r>
         <w:rPr>
           <w:b/>
         </w:rPr>
-        <w:t>different question on the same dataset</w:t>
+        <w:t>one</w:t>
+      </w:r>
+      <w:r>
+        <w:t xml:space="preserve"> of the five FLUID-ICU questions (Q1 to Q5). There are no groups.</w:t>
+      </w:r>
+    </w:p>
+    <w:p>
+      <w:r>
+        <w:rPr>
+          <w:b/>
+        </w:rPr>
+        <w:t>What we give you:</w:t>
+      </w:r>
+      <w:r>
+        <w:t xml:space="preserve"> the results. For each question there is a results pack with all the tables, figures and numbers you need. You do not analyse any data: you write the paper.</w:t>
       </w:r>
     </w:p>
     <w:p>
@@ -83,7 +97,7 @@
         <w:t>2,000 words</w:t>
       </w:r>
       <w:r>
-        <w:t>, a review of another group's draft, and a response-to-reviewers letter</w:t>
+        <w:t>, a review of one classmate's draft, and a response-to-reviewers letter</w:t>
       </w:r>
     </w:p>
     <w:p>
@@ -135,12 +149,12 @@
         <w:t>has</w:t>
       </w:r>
       <w:r>
-        <w:t xml:space="preserve"> been done and turn them into a paper that a journal could review. You will practise everything from Sessions 5–8: reading Table 1 and regression outputs, writing Methods and Results, calibrated language in the Discussion, the abstract and title, a reporting checklist, peer review and responding to reviewers.</w:t>
+        <w:t xml:space="preserve"> been done and turn them into a paper that a journal could review. You will practise everything from Sessions 5 to 8: reading Table 1 and regression outputs, writing Methods and Results, calibrated language in the Discussion, the abstract and title, a reporting checklist, peer review and responding to reviewers.</w:t>
       </w:r>
     </w:p>
     <w:p>
       <w:r>
-        <w:t xml:space="preserve">Nobody needs to run any software. The instructor runs the analyses live in R in Sessions 5–6, and every group gets a </w:t>
+        <w:t xml:space="preserve">Nobody needs to run any software. The instructor runs the analyses live in R in Sessions 5 and 6, and for each question there is a </w:t>
       </w:r>
       <w:r>
         <w:rPr>
@@ -149,7 +163,7 @@
         <w:t>results pack</w:t>
       </w:r>
       <w:r>
-        <w:t xml:space="preserve"> with all the numbers, tables and figures it needs. Participants who completed the free Neudata course </w:t>
+        <w:t xml:space="preserve"> with all the numbers, tables and figures you need. Participants who completed the free Neudata course </w:t>
       </w:r>
       <w:r>
         <w:rPr>
@@ -214,7 +228,7 @@
         <w:t>600 adults with sepsis</w:t>
       </w:r>
       <w:r>
-        <w:t xml:space="preserve"> admitted to 4 ICUs. It contains demographics, comorbidities (diabetes, chronic kidney disease, heart failure, hypertension), infection source, severity (SOFA, APACHE II), lactate, mean arterial pressure, vasopressors, mechanical ventilation, daily fluid in and out on days 1–3, weight, cumulative fluid balance at day 3 (ml/kg) and positive balance (yes/no), acute kidney injury (KDIGO), renal replacement therapy, ventilator-free days, ICU length of stay and 28-day mortality with time to death or censoring.</w:t>
+        <w:t xml:space="preserve"> admitted to 4 ICUs. It contains demographics, comorbidities (diabetes, chronic kidney disease, heart failure, hypertension), infection source, severity (SOFA, APACHE II), lactate, mean arterial pressure, vasopressors, mechanical ventilation, daily fluid in and out on days 1 to 3, weight, cumulative fluid balance at day 3 (ml/kg) and positive balance (yes/no), acute kidney injury (KDIGO), renal replacement therapy, ventilator-free days, ICU length of stay and 28-day mortality with time to death or censoring.</w:t>
       </w:r>
     </w:p>
     <w:p>
@@ -230,7 +244,7 @@
         <w:t>Course/Data/</w:t>
       </w:r>
       <w:r>
-        <w:t xml:space="preserve">: the raw and clean data, the data dictionary, the </w:t>
+        <w:t xml:space="preserve"> (in the online course folder): the raw and clean data, the data dictionary, the </w:t>
       </w:r>
       <w:r>
         <w:rPr>
@@ -247,30 +261,21 @@
         <w:pStyle w:val="Heading1"/>
       </w:pPr>
       <w:r>
-        <w:t>3. The five group questions</w:t>
+        <w:t>3. The five questions: choose one</w:t>
       </w:r>
     </w:p>
     <w:p>
       <w:r>
-        <w:t xml:space="preserve">Questions are assigned in Session 5. By default Group </w:t>
+        <w:t xml:space="preserve">The five questions are introduced in Session 5. In class the instructor works through them with the whole class: Q1 in full, and Q2 to Q5 as shorter worked examples. </w:t>
       </w:r>
       <w:r>
         <w:rPr>
-          <w:i/>
+          <w:b/>
         </w:rPr>
-        <w:t>N</w:t>
+        <w:t>By the end of Session 6, choose one question for your manuscript</w:t>
       </w:r>
       <w:r>
-        <w:t xml:space="preserve"> takes Question </w:t>
-      </w:r>
-      <w:r>
-        <w:rPr>
-          <w:i/>
-        </w:rPr>
-        <w:t>N</w:t>
-      </w:r>
-      <w:r>
-        <w:t>; the course lead may swap questions to balance the groups.</w:t>
+        <w:t xml:space="preserve"> and tell the course lead (by email or the form shared in the chat). Any question may be chosen by any number of participants. Q1 is the one done in full in class, so it is the easiest start; Q2 to Q5 are a little more of a challenge.</w:t>
       </w:r>
     </w:p>
     <w:tbl>
@@ -453,7 +458,7 @@
                 <w:b/>
                 <w:sz w:val="17"/>
               </w:rPr>
-              <w:t>1</w:t>
+              <w:t>Q1</w:t>
             </w:r>
           </w:p>
         </w:tc>
@@ -545,7 +550,7 @@
               <w:rPr>
                 <w:sz w:val="17"/>
               </w:rPr>
-              <w:t>Crude and adjusted logistic regression (OR); Kaplan–Meier curves and Cox model (HR)</w:t>
+              <w:t>Crude and adjusted logistic regression (OR); Kaplan-Meier curves and Cox model (HR)</w:t>
             </w:r>
           </w:p>
         </w:tc>
@@ -575,7 +580,7 @@
                 <w:b/>
                 <w:sz w:val="17"/>
               </w:rPr>
-              <w:t>2</w:t>
+              <w:t>Q2</w:t>
             </w:r>
           </w:p>
         </w:tc>
@@ -700,7 +705,7 @@
                 <w:b/>
                 <w:sz w:val="17"/>
               </w:rPr>
-              <w:t>3</w:t>
+              <w:t>Q3</w:t>
             </w:r>
           </w:p>
         </w:tc>
@@ -822,7 +827,7 @@
                 <w:b/>
                 <w:sz w:val="17"/>
               </w:rPr>
-              <w:t>4</w:t>
+              <w:t>Q4</w:t>
             </w:r>
           </w:p>
         </w:tc>
@@ -947,7 +952,7 @@
                 <w:b/>
                 <w:sz w:val="17"/>
               </w:rPr>
-              <w:t>5</w:t>
+              <w:t>Q5</w:t>
             </w:r>
           </w:p>
         </w:tc>
@@ -1134,9 +1139,9 @@
       </w:tblPr>
       <w:tblGrid>
         <w:gridCol w:w="1729"/>
-        <w:gridCol w:w="1502"/>
-        <w:gridCol w:w="3976"/>
-        <w:gridCol w:w="2203"/>
+        <w:gridCol w:w="1539"/>
+        <w:gridCol w:w="4113"/>
+        <w:gridCol w:w="2029"/>
       </w:tblGrid>
       <w:tr>
         <w:trPr>
@@ -1171,7 +1176,7 @@
         </w:tc>
         <w:tc>
           <w:tcPr>
-            <w:tcW w:type="dxa" w:w="1502"/>
+            <w:tcW w:type="dxa" w:w="1539"/>
             <w:tcBorders>
               <w:top w:val="single" w:sz="4" w:color="04242F"/>
               <w:left w:val="single" w:sz="4" w:color="04242F"/>
@@ -1197,7 +1202,7 @@
         </w:tc>
         <w:tc>
           <w:tcPr>
-            <w:tcW w:type="dxa" w:w="3976"/>
+            <w:tcW w:type="dxa" w:w="4113"/>
             <w:tcBorders>
               <w:top w:val="single" w:sz="4" w:color="04242F"/>
               <w:left w:val="single" w:sz="4" w:color="04242F"/>
@@ -1217,13 +1222,13 @@
                 <w:color w:val="FFFFFF"/>
                 <w:sz w:val="18"/>
               </w:rPr>
-              <w:t>What your group does</w:t>
+              <w:t>What you do</w:t>
             </w:r>
           </w:p>
         </w:tc>
         <w:tc>
           <w:tcPr>
-            <w:tcW w:type="dxa" w:w="2203"/>
+            <w:tcW w:type="dxa" w:w="2029"/>
             <w:tcBorders>
               <w:top w:val="single" w:sz="4" w:color="04242F"/>
               <w:left w:val="single" w:sz="4" w:color="04242F"/>
@@ -1277,7 +1282,7 @@
         </w:tc>
         <w:tc>
           <w:tcPr>
-            <w:tcW w:type="dxa" w:w="1502"/>
+            <w:tcW w:type="dxa" w:w="1539"/>
             <w:tcBorders>
               <w:top w:val="single" w:sz="4" w:color="D5DDE1"/>
               <w:left w:val="single" w:sz="4" w:color="D5DDE1"/>
@@ -1307,7 +1312,7 @@
         </w:tc>
         <w:tc>
           <w:tcPr>
-            <w:tcW w:type="dxa" w:w="3976"/>
+            <w:tcW w:type="dxa" w:w="4113"/>
             <w:tcBorders>
               <w:top w:val="single" w:sz="4" w:color="D5DDE1"/>
               <w:left w:val="single" w:sz="4" w:color="D5DDE1"/>
@@ -1324,13 +1329,13 @@
               <w:rPr>
                 <w:sz w:val="17"/>
               </w:rPr>
-              <w:t>Receive your question; read the data dictionary, the cleaning log and your Table 1 and figures (worksheet)</w:t>
+              <w:t>With the class: read the data dictionary, the cleaning log, and Table 1 and the figures of the Q1 results pack</w:t>
             </w:r>
           </w:p>
         </w:tc>
         <w:tc>
           <w:tcPr>
-            <w:tcW w:type="dxa" w:w="2203"/>
+            <w:tcW w:type="dxa" w:w="2029"/>
             <w:tcBorders>
               <w:top w:val="single" w:sz="4" w:color="D5DDE1"/>
               <w:left w:val="single" w:sz="4" w:color="D5DDE1"/>
@@ -1376,13 +1381,13 @@
               <w:rPr>
                 <w:sz w:val="17"/>
               </w:rPr>
-              <w:t>2. Interpret the results</w:t>
+              <w:t>2. Interpret the results and choose your question</w:t>
             </w:r>
           </w:p>
         </w:tc>
         <w:tc>
           <w:tcPr>
-            <w:tcW w:type="dxa" w:w="1502"/>
+            <w:tcW w:type="dxa" w:w="1539"/>
             <w:tcBorders>
               <w:top w:val="single" w:sz="4" w:color="D5DDE1"/>
               <w:left w:val="single" w:sz="4" w:color="D5DDE1"/>
@@ -1407,13 +1412,13 @@
               <w:rPr>
                 <w:sz w:val="17"/>
               </w:rPr>
-              <w:t xml:space="preserve"> (6.2, 6.4)</w:t>
+              <w:t xml:space="preserve"> (6.2, 6.4), then homework</w:t>
             </w:r>
           </w:p>
         </w:tc>
         <w:tc>
           <w:tcPr>
-            <w:tcW w:type="dxa" w:w="3976"/>
+            <w:tcW w:type="dxa" w:w="4113"/>
             <w:tcBorders>
               <w:top w:val="single" w:sz="4" w:color="D5DDE1"/>
               <w:left w:val="single" w:sz="4" w:color="D5DDE1"/>
@@ -1431,13 +1436,13 @@
               <w:rPr>
                 <w:sz w:val="17"/>
               </w:rPr>
-              <w:t>Read your group comparisons and regression or Kaplan–Meier/Cox outputs, the crude vs adjusted estimates and the missing-data sensitivity analysis</w:t>
+              <w:t>With the class: read the comparisons, the regression and Kaplan-Meier/Cox outputs, crude vs adjusted estimates and the missing-data sensitivity analysis. After the session: choose your question and read its results pack</w:t>
             </w:r>
           </w:p>
         </w:tc>
         <w:tc>
           <w:tcPr>
-            <w:tcW w:type="dxa" w:w="2203"/>
+            <w:tcW w:type="dxa" w:w="2029"/>
             <w:tcBorders>
               <w:top w:val="single" w:sz="4" w:color="D5DDE1"/>
               <w:left w:val="single" w:sz="4" w:color="D5DDE1"/>
@@ -1455,7 +1460,7 @@
               <w:rPr>
                 <w:sz w:val="17"/>
               </w:rPr>
-              <w:t>A "key numbers" list: the main effect with 95% CI, plus 3–5 supporting results</w:t>
+              <w:t>A "key numbers" list for your question: the main effect with 95% CI, plus 3 to 5 supporting results</w:t>
             </w:r>
           </w:p>
         </w:tc>
@@ -1489,7 +1494,7 @@
         </w:tc>
         <w:tc>
           <w:tcPr>
-            <w:tcW w:type="dxa" w:w="1502"/>
+            <w:tcW w:type="dxa" w:w="1539"/>
             <w:tcBorders>
               <w:top w:val="single" w:sz="4" w:color="D5DDE1"/>
               <w:left w:val="single" w:sz="4" w:color="D5DDE1"/>
@@ -1513,13 +1518,13 @@
               <w:rPr>
                 <w:sz w:val="17"/>
               </w:rPr>
-              <w:t xml:space="preserve"> (manuscript workshop 1)</w:t>
+              <w:t xml:space="preserve"> (manuscript workshop 1: the instructor drafts Q1 live with the class), then homework</w:t>
             </w:r>
           </w:p>
         </w:tc>
         <w:tc>
           <w:tcPr>
-            <w:tcW w:type="dxa" w:w="3976"/>
+            <w:tcW w:type="dxa" w:w="4113"/>
             <w:tcBorders>
               <w:top w:val="single" w:sz="4" w:color="D5DDE1"/>
               <w:left w:val="single" w:sz="4" w:color="D5DDE1"/>
@@ -1536,13 +1541,13 @@
               <w:rPr>
                 <w:sz w:val="17"/>
               </w:rPr>
-              <w:t>Draft the Methods (design, setting, participants, variables, data sources, bias, statistical methods incl. missing data) and the Results (participants first, then descriptive, main and other analyses)</w:t>
+              <w:t>Draft the Methods (design, setting, participants, variables, data sources, bias, statistical methods incl. missing data) and the Results (participants first, then descriptive, main and other analyses) for your question</w:t>
             </w:r>
           </w:p>
         </w:tc>
         <w:tc>
           <w:tcPr>
-            <w:tcW w:type="dxa" w:w="2203"/>
+            <w:tcW w:type="dxa" w:w="2029"/>
             <w:tcBorders>
               <w:top w:val="single" w:sz="4" w:color="D5DDE1"/>
               <w:left w:val="single" w:sz="4" w:color="D5DDE1"/>
@@ -1594,7 +1599,7 @@
         </w:tc>
         <w:tc>
           <w:tcPr>
-            <w:tcW w:type="dxa" w:w="1502"/>
+            <w:tcW w:type="dxa" w:w="1539"/>
             <w:tcBorders>
               <w:top w:val="single" w:sz="4" w:color="D5DDE1"/>
               <w:left w:val="single" w:sz="4" w:color="D5DDE1"/>
@@ -1619,13 +1624,13 @@
               <w:rPr>
                 <w:sz w:val="17"/>
               </w:rPr>
-              <w:t xml:space="preserve"> (manuscript workshop 2)</w:t>
+              <w:t xml:space="preserve"> (manuscript workshop 2: modelled live on Q1), then homework</w:t>
             </w:r>
           </w:p>
         </w:tc>
         <w:tc>
           <w:tcPr>
-            <w:tcW w:type="dxa" w:w="3976"/>
+            <w:tcW w:type="dxa" w:w="4113"/>
             <w:tcBorders>
               <w:top w:val="single" w:sz="4" w:color="D5DDE1"/>
               <w:left w:val="single" w:sz="4" w:color="D5DDE1"/>
@@ -1649,7 +1654,7 @@
         </w:tc>
         <w:tc>
           <w:tcPr>
-            <w:tcW w:type="dxa" w:w="2203"/>
+            <w:tcW w:type="dxa" w:w="2029"/>
             <w:tcBorders>
               <w:top w:val="single" w:sz="4" w:color="D5DDE1"/>
               <w:left w:val="single" w:sz="4" w:color="D5DDE1"/>
@@ -1702,7 +1707,7 @@
         </w:tc>
         <w:tc>
           <w:tcPr>
-            <w:tcW w:type="dxa" w:w="1502"/>
+            <w:tcW w:type="dxa" w:w="1539"/>
             <w:tcBorders>
               <w:top w:val="single" w:sz="4" w:color="D5DDE1"/>
               <w:left w:val="single" w:sz="4" w:color="D5DDE1"/>
@@ -1726,7 +1731,7 @@
         </w:tc>
         <w:tc>
           <w:tcPr>
-            <w:tcW w:type="dxa" w:w="3976"/>
+            <w:tcW w:type="dxa" w:w="4113"/>
             <w:tcBorders>
               <w:top w:val="single" w:sz="4" w:color="D5DDE1"/>
               <w:left w:val="single" w:sz="4" w:color="D5DDE1"/>
@@ -1749,7 +1754,7 @@
         </w:tc>
         <w:tc>
           <w:tcPr>
-            <w:tcW w:type="dxa" w:w="2203"/>
+            <w:tcW w:type="dxa" w:w="2029"/>
             <w:tcBorders>
               <w:top w:val="single" w:sz="4" w:color="D5DDE1"/>
               <w:left w:val="single" w:sz="4" w:color="D5DDE1"/>
@@ -1795,13 +1800,13 @@
               <w:rPr>
                 <w:sz w:val="17"/>
               </w:rPr>
-              <w:t>6. Peer-review swap</w:t>
+              <w:t>6. Peer review</w:t>
             </w:r>
           </w:p>
         </w:tc>
         <w:tc>
           <w:tcPr>
-            <w:tcW w:type="dxa" w:w="1502"/>
+            <w:tcW w:type="dxa" w:w="1539"/>
             <w:tcBorders>
               <w:top w:val="single" w:sz="4" w:color="D5DDE1"/>
               <w:left w:val="single" w:sz="4" w:color="D5DDE1"/>
@@ -1826,7 +1831,7 @@
         </w:tc>
         <w:tc>
           <w:tcPr>
-            <w:tcW w:type="dxa" w:w="3976"/>
+            <w:tcW w:type="dxa" w:w="4113"/>
             <w:tcBorders>
               <w:top w:val="single" w:sz="4" w:color="D5DDE1"/>
               <w:left w:val="single" w:sz="4" w:color="D5DDE1"/>
@@ -1844,7 +1849,7 @@
               <w:rPr>
                 <w:sz w:val="17"/>
               </w:rPr>
-              <w:t>Review another group's draft (</w:t>
+              <w:t>Review the one classmate's draft the instructor sends you (</w:t>
             </w:r>
             <w:r>
               <w:rPr>
@@ -1864,7 +1869,7 @@
         </w:tc>
         <w:tc>
           <w:tcPr>
-            <w:tcW w:type="dxa" w:w="2203"/>
+            <w:tcW w:type="dxa" w:w="2029"/>
             <w:tcBorders>
               <w:top w:val="single" w:sz="4" w:color="D5DDE1"/>
               <w:left w:val="single" w:sz="4" w:color="D5DDE1"/>
@@ -1915,7 +1920,7 @@
         </w:tc>
         <w:tc>
           <w:tcPr>
-            <w:tcW w:type="dxa" w:w="1502"/>
+            <w:tcW w:type="dxa" w:w="1539"/>
             <w:tcBorders>
               <w:top w:val="single" w:sz="4" w:color="D5DDE1"/>
               <w:left w:val="single" w:sz="4" w:color="D5DDE1"/>
@@ -1938,7 +1943,7 @@
         </w:tc>
         <w:tc>
           <w:tcPr>
-            <w:tcW w:type="dxa" w:w="3976"/>
+            <w:tcW w:type="dxa" w:w="4113"/>
             <w:tcBorders>
               <w:top w:val="single" w:sz="4" w:color="D5DDE1"/>
               <w:left w:val="single" w:sz="4" w:color="D5DDE1"/>
@@ -1954,13 +1959,13 @@
               <w:rPr>
                 <w:sz w:val="17"/>
               </w:rPr>
-              <w:t>Respond point by point and revise your draft</w:t>
+              <w:t>Respond point by point to the review you received and revise your draft</w:t>
             </w:r>
           </w:p>
         </w:tc>
         <w:tc>
           <w:tcPr>
-            <w:tcW w:type="dxa" w:w="2203"/>
+            <w:tcW w:type="dxa" w:w="2029"/>
             <w:tcBorders>
               <w:top w:val="single" w:sz="4" w:color="D5DDE1"/>
               <w:left w:val="single" w:sz="4" w:color="D5DDE1"/>
@@ -2010,8 +2015,8 @@
       </w:tblPr>
       <w:tblGrid>
         <w:gridCol w:w="1615"/>
-        <w:gridCol w:w="1299"/>
-        <w:gridCol w:w="6496"/>
+        <w:gridCol w:w="1275"/>
+        <w:gridCol w:w="6520"/>
       </w:tblGrid>
       <w:tr>
         <w:trPr>
@@ -2046,7 +2051,7 @@
         </w:tc>
         <w:tc>
           <w:tcPr>
-            <w:tcW w:type="dxa" w:w="1299"/>
+            <w:tcW w:type="dxa" w:w="1276"/>
             <w:tcBorders>
               <w:top w:val="single" w:sz="4" w:color="04242F"/>
               <w:left w:val="single" w:sz="4" w:color="04242F"/>
@@ -2072,7 +2077,7 @@
         </w:tc>
         <w:tc>
           <w:tcPr>
-            <w:tcW w:type="dxa" w:w="6496"/>
+            <w:tcW w:type="dxa" w:w="6520"/>
             <w:tcBorders>
               <w:top w:val="single" w:sz="4" w:color="04242F"/>
               <w:left w:val="single" w:sz="4" w:color="04242F"/>
@@ -2126,7 +2131,7 @@
         </w:tc>
         <w:tc>
           <w:tcPr>
-            <w:tcW w:type="dxa" w:w="1299"/>
+            <w:tcW w:type="dxa" w:w="1276"/>
             <w:tcBorders>
               <w:top w:val="single" w:sz="4" w:color="D5DDE1"/>
               <w:left w:val="single" w:sz="4" w:color="D5DDE1"/>
@@ -2149,7 +2154,7 @@
         </w:tc>
         <w:tc>
           <w:tcPr>
-            <w:tcW w:type="dxa" w:w="6496"/>
+            <w:tcW w:type="dxa" w:w="6520"/>
             <w:tcBorders>
               <w:top w:val="single" w:sz="4" w:color="D5DDE1"/>
               <w:left w:val="single" w:sz="4" w:color="D5DDE1"/>
@@ -2166,7 +2171,7 @@
               <w:rPr>
                 <w:sz w:val="17"/>
               </w:rPr>
-              <w:t>Title, group authors with CRediT roles, word count, the simulated-data statement</w:t>
+              <w:t>Title, your name as author, a CRediT statement, word count, the simulated-data statement, an acknowledgement of the course</w:t>
             </w:r>
           </w:p>
         </w:tc>
@@ -2201,7 +2206,7 @@
         </w:tc>
         <w:tc>
           <w:tcPr>
-            <w:tcW w:type="dxa" w:w="1299"/>
+            <w:tcW w:type="dxa" w:w="1276"/>
             <w:tcBorders>
               <w:top w:val="single" w:sz="4" w:color="D5DDE1"/>
               <w:left w:val="single" w:sz="4" w:color="D5DDE1"/>
@@ -2219,13 +2224,13 @@
               <w:rPr>
                 <w:sz w:val="17"/>
               </w:rPr>
-              <w:t>≤ 250 words</w:t>
+              <w:t>250 words or fewer</w:t>
             </w:r>
           </w:p>
         </w:tc>
         <w:tc>
           <w:tcPr>
-            <w:tcW w:type="dxa" w:w="6496"/>
+            <w:tcW w:type="dxa" w:w="6520"/>
             <w:tcBorders>
               <w:top w:val="single" w:sz="4" w:color="D5DDE1"/>
               <w:left w:val="single" w:sz="4" w:color="D5DDE1"/>
@@ -2277,7 +2282,7 @@
         </w:tc>
         <w:tc>
           <w:tcPr>
-            <w:tcW w:type="dxa" w:w="1299"/>
+            <w:tcW w:type="dxa" w:w="1276"/>
             <w:tcBorders>
               <w:top w:val="single" w:sz="4" w:color="D5DDE1"/>
               <w:left w:val="single" w:sz="4" w:color="D5DDE1"/>
@@ -2300,7 +2305,7 @@
         </w:tc>
         <w:tc>
           <w:tcPr>
-            <w:tcW w:type="dxa" w:w="6496"/>
+            <w:tcW w:type="dxa" w:w="6520"/>
             <w:tcBorders>
               <w:top w:val="single" w:sz="4" w:color="D5DDE1"/>
               <w:left w:val="single" w:sz="4" w:color="D5DDE1"/>
@@ -2352,7 +2357,7 @@
         </w:tc>
         <w:tc>
           <w:tcPr>
-            <w:tcW w:type="dxa" w:w="1299"/>
+            <w:tcW w:type="dxa" w:w="1276"/>
             <w:tcBorders>
               <w:top w:val="single" w:sz="4" w:color="D5DDE1"/>
               <w:left w:val="single" w:sz="4" w:color="D5DDE1"/>
@@ -2376,7 +2381,7 @@
         </w:tc>
         <w:tc>
           <w:tcPr>
-            <w:tcW w:type="dxa" w:w="6496"/>
+            <w:tcW w:type="dxa" w:w="6520"/>
             <w:tcBorders>
               <w:top w:val="single" w:sz="4" w:color="D5DDE1"/>
               <w:left w:val="single" w:sz="4" w:color="D5DDE1"/>
@@ -2394,7 +2399,7 @@
               <w:rPr>
                 <w:sz w:val="17"/>
               </w:rPr>
-              <w:t>STROBE items 4–12; include the statistical-analysis paragraph and how missing data were handled</w:t>
+              <w:t>STROBE items 4 to 12; include the statistical-analysis paragraph and how missing data were handled</w:t>
             </w:r>
           </w:p>
         </w:tc>
@@ -2428,7 +2433,7 @@
         </w:tc>
         <w:tc>
           <w:tcPr>
-            <w:tcW w:type="dxa" w:w="1299"/>
+            <w:tcW w:type="dxa" w:w="1276"/>
             <w:tcBorders>
               <w:top w:val="single" w:sz="4" w:color="D5DDE1"/>
               <w:left w:val="single" w:sz="4" w:color="D5DDE1"/>
@@ -2451,7 +2456,7 @@
         </w:tc>
         <w:tc>
           <w:tcPr>
-            <w:tcW w:type="dxa" w:w="6496"/>
+            <w:tcW w:type="dxa" w:w="6520"/>
             <w:tcBorders>
               <w:top w:val="single" w:sz="4" w:color="D5DDE1"/>
               <w:left w:val="single" w:sz="4" w:color="D5DDE1"/>
@@ -2503,7 +2508,7 @@
         </w:tc>
         <w:tc>
           <w:tcPr>
-            <w:tcW w:type="dxa" w:w="1299"/>
+            <w:tcW w:type="dxa" w:w="1276"/>
             <w:tcBorders>
               <w:top w:val="single" w:sz="4" w:color="D5DDE1"/>
               <w:left w:val="single" w:sz="4" w:color="D5DDE1"/>
@@ -2527,7 +2532,7 @@
         </w:tc>
         <w:tc>
           <w:tcPr>
-            <w:tcW w:type="dxa" w:w="6496"/>
+            <w:tcW w:type="dxa" w:w="6520"/>
             <w:tcBorders>
               <w:top w:val="single" w:sz="4" w:color="D5DDE1"/>
               <w:left w:val="single" w:sz="4" w:color="D5DDE1"/>
@@ -2545,7 +2550,21 @@
               <w:rPr>
                 <w:sz w:val="17"/>
               </w:rPr>
-              <w:t>In this order: main finding, comparison with literature (incl. Paper 2), possible explanations, strengths and limitations, implications, conclusion</w:t>
+              <w:t xml:space="preserve">In this order: main finding, comparison with literature (incl. Paper 2, Hyun 2023, in </w:t>
+            </w:r>
+            <w:r>
+              <w:rPr>
+                <w:rFonts w:ascii="Consolas" w:hAnsi="Consolas" w:cs="Consolas" w:eastAsia="Consolas"/>
+                <w:color w:val="0B376C"/>
+                <w:sz w:val="17"/>
+              </w:rPr>
+              <w:t>Course/Papers/</w:t>
+            </w:r>
+            <w:r>
+              <w:rPr>
+                <w:sz w:val="17"/>
+              </w:rPr>
+              <w:t>), possible explanations, strengths and limitations, implications, conclusion</w:t>
             </w:r>
           </w:p>
         </w:tc>
@@ -2580,7 +2599,7 @@
         </w:tc>
         <w:tc>
           <w:tcPr>
-            <w:tcW w:type="dxa" w:w="1299"/>
+            <w:tcW w:type="dxa" w:w="1276"/>
             <w:tcBorders>
               <w:top w:val="single" w:sz="4" w:color="D5DDE1"/>
               <w:left w:val="single" w:sz="4" w:color="D5DDE1"/>
@@ -2604,7 +2623,7 @@
         </w:tc>
         <w:tc>
           <w:tcPr>
-            <w:tcW w:type="dxa" w:w="6496"/>
+            <w:tcW w:type="dxa" w:w="6520"/>
             <w:tcBorders>
               <w:top w:val="single" w:sz="4" w:color="D5DDE1"/>
               <w:left w:val="single" w:sz="4" w:color="D5DDE1"/>
@@ -2621,7 +2640,7 @@
               <w:rPr>
                 <w:sz w:val="17"/>
               </w:rPr>
-              <w:t>Introduction to Discussion (± 10%); abstract, tables and references not counted</w:t>
+              <w:t>Introduction to Discussion (plus or minus 10%); abstract, tables and references not counted</w:t>
             </w:r>
           </w:p>
         </w:tc>
@@ -2656,7 +2675,7 @@
         </w:tc>
         <w:tc>
           <w:tcPr>
-            <w:tcW w:type="dxa" w:w="1299"/>
+            <w:tcW w:type="dxa" w:w="1276"/>
             <w:tcBorders>
               <w:top w:val="single" w:sz="4" w:color="D5DDE1"/>
               <w:left w:val="single" w:sz="4" w:color="D5DDE1"/>
@@ -2680,7 +2699,7 @@
         </w:tc>
         <w:tc>
           <w:tcPr>
-            <w:tcW w:type="dxa" w:w="6496"/>
+            <w:tcW w:type="dxa" w:w="6520"/>
             <w:tcBorders>
               <w:top w:val="single" w:sz="4" w:color="D5DDE1"/>
               <w:left w:val="single" w:sz="4" w:color="D5DDE1"/>
@@ -2732,7 +2751,7 @@
         </w:tc>
         <w:tc>
           <w:tcPr>
-            <w:tcW w:type="dxa" w:w="1299"/>
+            <w:tcW w:type="dxa" w:w="1276"/>
             <w:tcBorders>
               <w:top w:val="single" w:sz="4" w:color="D5DDE1"/>
               <w:left w:val="single" w:sz="4" w:color="D5DDE1"/>
@@ -2749,13 +2768,13 @@
               <w:rPr>
                 <w:sz w:val="17"/>
               </w:rPr>
-              <w:t>10–20</w:t>
+              <w:t>10 to 20</w:t>
             </w:r>
           </w:p>
         </w:tc>
         <w:tc>
           <w:tcPr>
-            <w:tcW w:type="dxa" w:w="6496"/>
+            <w:tcW w:type="dxa" w:w="6520"/>
             <w:tcBorders>
               <w:top w:val="single" w:sz="4" w:color="D5DDE1"/>
               <w:left w:val="single" w:sz="4" w:color="D5DDE1"/>
@@ -2806,7 +2825,7 @@
         </w:tc>
         <w:tc>
           <w:tcPr>
-            <w:tcW w:type="dxa" w:w="1299"/>
+            <w:tcW w:type="dxa" w:w="1276"/>
             <w:tcBorders>
               <w:top w:val="single" w:sz="4" w:color="D5DDE1"/>
               <w:left w:val="single" w:sz="4" w:color="D5DDE1"/>
@@ -2829,7 +2848,7 @@
         </w:tc>
         <w:tc>
           <w:tcPr>
-            <w:tcW w:type="dxa" w:w="6496"/>
+            <w:tcW w:type="dxa" w:w="6520"/>
             <w:tcBorders>
               <w:top w:val="single" w:sz="4" w:color="D5DDE1"/>
               <w:left w:val="single" w:sz="4" w:color="D5DDE1"/>
@@ -2862,429 +2881,54 @@
         <w:pStyle w:val="Heading1"/>
       </w:pPr>
       <w:r>
-        <w:t>5. Roles</w:t>
+        <w:t>5. Authorship and acknowledgement</w:t>
       </w:r>
     </w:p>
     <w:p>
       <w:r>
-        <w:t>Agree roles in Session 6. Everyone reads the whole draft before submission. In a group of five, combine the Introduction and Discussion roles.</w:t>
+        <w:t>You are the single author of your manuscript. Use it to practise the authorship ideas from Session 7 (ICMJE criteria and CRediT roles):</w:t>
       </w:r>
     </w:p>
-    <w:tbl>
-      <w:tblPr>
-        <w:tblW w:type="auto" w:w="0"/>
-        <w:jc w:val="center"/>
-        <w:tblLayout w:type="fixed"/>
-        <w:tblCellMar>
-          <w:top w:w="80" w:type="dxa"/>
-          <w:left w:w="110" w:type="dxa"/>
-          <w:bottom w:w="80" w:type="dxa"/>
-          <w:right w:w="110" w:type="dxa"/>
-        </w:tblCellMar>
-        <w:tblLook w:firstColumn="1" w:firstRow="1" w:lastColumn="0" w:lastRow="0" w:noHBand="0" w:noVBand="1" w:val="04A0"/>
-      </w:tblPr>
-      <w:tblGrid>
-        <w:gridCol w:w="1729"/>
-        <w:gridCol w:w="7682"/>
-      </w:tblGrid>
-      <w:tr>
-        <w:trPr>
-          <w:cantSplit w:val="true"/>
-          <w:tblHeader w:val="true"/>
-        </w:trPr>
-        <w:tc>
-          <w:tcPr>
-            <w:tcW w:type="dxa" w:w="1729"/>
-            <w:tcBorders>
-              <w:top w:val="single" w:sz="4" w:color="04242F"/>
-              <w:left w:val="single" w:sz="4" w:color="04242F"/>
-              <w:bottom w:val="single" w:sz="4" w:color="04242F"/>
-              <w:right w:val="single" w:sz="4" w:color="04242F"/>
-            </w:tcBorders>
-            <w:shd w:val="clear" w:color="auto" w:fill="04242F"/>
-          </w:tcPr>
-          <w:p>
-            <w:pPr>
-              <w:keepNext/>
-              <w:spacing w:after="0"/>
-            </w:pPr>
-            <w:r>
-              <w:rPr>
-                <w:b/>
-                <w:color w:val="FFFFFF"/>
-                <w:sz w:val="18"/>
-              </w:rPr>
-              <w:t>Role</w:t>
-            </w:r>
-          </w:p>
-        </w:tc>
-        <w:tc>
-          <w:tcPr>
-            <w:tcW w:type="dxa" w:w="7682"/>
-            <w:tcBorders>
-              <w:top w:val="single" w:sz="4" w:color="04242F"/>
-              <w:left w:val="single" w:sz="4" w:color="04242F"/>
-              <w:bottom w:val="single" w:sz="4" w:color="04242F"/>
-              <w:right w:val="single" w:sz="4" w:color="04242F"/>
-            </w:tcBorders>
-            <w:shd w:val="clear" w:color="auto" w:fill="04242F"/>
-          </w:tcPr>
-          <w:p>
-            <w:pPr>
-              <w:keepNext/>
-              <w:spacing w:after="0"/>
-            </w:pPr>
-            <w:r>
-              <w:rPr>
-                <w:b/>
-                <w:color w:val="FFFFFF"/>
-                <w:sz w:val="18"/>
-              </w:rPr>
-              <w:t>Responsibilities</w:t>
-            </w:r>
-          </w:p>
-        </w:tc>
-      </w:tr>
-      <w:tr>
-        <w:trPr>
-          <w:cantSplit w:val="true"/>
-        </w:trPr>
-        <w:tc>
-          <w:tcPr>
-            <w:tcW w:type="dxa" w:w="1729"/>
-            <w:tcBorders>
-              <w:top w:val="single" w:sz="4" w:color="D5DDE1"/>
-              <w:left w:val="single" w:sz="4" w:color="D5DDE1"/>
-              <w:bottom w:val="single" w:sz="4" w:color="D5DDE1"/>
-              <w:right w:val="single" w:sz="4" w:color="D5DDE1"/>
-            </w:tcBorders>
-          </w:tcPr>
-          <w:p>
-            <w:pPr>
-              <w:keepNext/>
-              <w:spacing w:after="0"/>
-            </w:pPr>
-            <w:r>
-              <w:rPr>
-                <w:b/>
-                <w:sz w:val="17"/>
-              </w:rPr>
-              <w:t>Lead author (coordinator)</w:t>
-            </w:r>
-          </w:p>
-        </w:tc>
-        <w:tc>
-          <w:tcPr>
-            <w:tcW w:type="dxa" w:w="7682"/>
-            <w:tcBorders>
-              <w:top w:val="single" w:sz="4" w:color="D5DDE1"/>
-              <w:left w:val="single" w:sz="4" w:color="D5DDE1"/>
-              <w:bottom w:val="single" w:sz="4" w:color="D5DDE1"/>
-              <w:right w:val="single" w:sz="4" w:color="D5DDE1"/>
-            </w:tcBorders>
-          </w:tcPr>
-          <w:p>
-            <w:pPr>
-              <w:keepNext/>
-              <w:spacing w:after="0"/>
-            </w:pPr>
-            <w:r>
-              <w:rPr>
-                <w:sz w:val="17"/>
-              </w:rPr>
-              <w:t>Keeps the single master file, sets internal deadlines, writes the title page, submits the draft, coordinates the response to reviewers.</w:t>
-            </w:r>
-          </w:p>
-        </w:tc>
-      </w:tr>
-      <w:tr>
-        <w:trPr>
-          <w:cantSplit w:val="true"/>
-        </w:trPr>
-        <w:tc>
-          <w:tcPr>
-            <w:tcW w:type="dxa" w:w="1729"/>
-            <w:tcBorders>
-              <w:top w:val="single" w:sz="4" w:color="D5DDE1"/>
-              <w:left w:val="single" w:sz="4" w:color="D5DDE1"/>
-              <w:bottom w:val="single" w:sz="4" w:color="D5DDE1"/>
-              <w:right w:val="single" w:sz="4" w:color="D5DDE1"/>
-            </w:tcBorders>
-            <w:shd w:val="clear" w:color="auto" w:fill="F5F9FA"/>
-          </w:tcPr>
-          <w:p>
-            <w:pPr>
-              <w:keepNext/>
-              <w:spacing w:after="0"/>
-            </w:pPr>
-            <w:r>
-              <w:rPr>
-                <w:b/>
-                <w:sz w:val="17"/>
-              </w:rPr>
-              <w:t>Methods writer</w:t>
-            </w:r>
-          </w:p>
-        </w:tc>
-        <w:tc>
-          <w:tcPr>
-            <w:tcW w:type="dxa" w:w="7682"/>
-            <w:tcBorders>
-              <w:top w:val="single" w:sz="4" w:color="D5DDE1"/>
-              <w:left w:val="single" w:sz="4" w:color="D5DDE1"/>
-              <w:bottom w:val="single" w:sz="4" w:color="D5DDE1"/>
-              <w:right w:val="single" w:sz="4" w:color="D5DDE1"/>
-            </w:tcBorders>
-            <w:shd w:val="clear" w:color="auto" w:fill="F5F9FA"/>
-          </w:tcPr>
-          <w:p>
-            <w:pPr>
-              <w:keepNext/>
-              <w:spacing w:after="0"/>
-            </w:pPr>
-            <w:r>
-              <w:rPr>
-                <w:sz w:val="17"/>
-              </w:rPr>
-              <w:t>Drafts the Methods from the data dictionary, cleaning log and SAP; makes sure the statistical paragraph matches what the results pack actually did.</w:t>
-            </w:r>
-          </w:p>
-        </w:tc>
-      </w:tr>
-      <w:tr>
-        <w:trPr>
-          <w:cantSplit w:val="true"/>
-        </w:trPr>
-        <w:tc>
-          <w:tcPr>
-            <w:tcW w:type="dxa" w:w="1729"/>
-            <w:tcBorders>
-              <w:top w:val="single" w:sz="4" w:color="D5DDE1"/>
-              <w:left w:val="single" w:sz="4" w:color="D5DDE1"/>
-              <w:bottom w:val="single" w:sz="4" w:color="D5DDE1"/>
-              <w:right w:val="single" w:sz="4" w:color="D5DDE1"/>
-            </w:tcBorders>
-          </w:tcPr>
-          <w:p>
-            <w:pPr>
-              <w:keepNext/>
-              <w:spacing w:after="0"/>
-            </w:pPr>
-            <w:r>
-              <w:rPr>
-                <w:b/>
-                <w:sz w:val="17"/>
-              </w:rPr>
-              <w:t>Results and tables writer</w:t>
-            </w:r>
-          </w:p>
-        </w:tc>
-        <w:tc>
-          <w:tcPr>
-            <w:tcW w:type="dxa" w:w="7682"/>
-            <w:tcBorders>
-              <w:top w:val="single" w:sz="4" w:color="D5DDE1"/>
-              <w:left w:val="single" w:sz="4" w:color="D5DDE1"/>
-              <w:bottom w:val="single" w:sz="4" w:color="D5DDE1"/>
-              <w:right w:val="single" w:sz="4" w:color="D5DDE1"/>
-            </w:tcBorders>
-          </w:tcPr>
-          <w:p>
-            <w:pPr>
-              <w:keepNext/>
-              <w:spacing w:after="0"/>
-            </w:pPr>
-            <w:r>
-              <w:rPr>
-                <w:sz w:val="17"/>
-              </w:rPr>
-              <w:t>Drafts the Results; builds Table 1 and the other table or figure from the results pack; checks every number against the pack.</w:t>
-            </w:r>
-          </w:p>
-        </w:tc>
-      </w:tr>
-      <w:tr>
-        <w:trPr>
-          <w:cantSplit w:val="true"/>
-        </w:trPr>
-        <w:tc>
-          <w:tcPr>
-            <w:tcW w:type="dxa" w:w="1729"/>
-            <w:tcBorders>
-              <w:top w:val="single" w:sz="4" w:color="D5DDE1"/>
-              <w:left w:val="single" w:sz="4" w:color="D5DDE1"/>
-              <w:bottom w:val="single" w:sz="4" w:color="D5DDE1"/>
-              <w:right w:val="single" w:sz="4" w:color="D5DDE1"/>
-            </w:tcBorders>
-            <w:shd w:val="clear" w:color="auto" w:fill="F5F9FA"/>
-          </w:tcPr>
-          <w:p>
-            <w:pPr>
-              <w:keepNext/>
-              <w:spacing w:after="0"/>
-            </w:pPr>
-            <w:r>
-              <w:rPr>
-                <w:b/>
-                <w:sz w:val="17"/>
-              </w:rPr>
-              <w:t>Introduction and references lead</w:t>
-            </w:r>
-          </w:p>
-        </w:tc>
-        <w:tc>
-          <w:tcPr>
-            <w:tcW w:type="dxa" w:w="7682"/>
-            <w:tcBorders>
-              <w:top w:val="single" w:sz="4" w:color="D5DDE1"/>
-              <w:left w:val="single" w:sz="4" w:color="D5DDE1"/>
-              <w:bottom w:val="single" w:sz="4" w:color="D5DDE1"/>
-              <w:right w:val="single" w:sz="4" w:color="D5DDE1"/>
-            </w:tcBorders>
-            <w:shd w:val="clear" w:color="auto" w:fill="F5F9FA"/>
-          </w:tcPr>
-          <w:p>
-            <w:pPr>
-              <w:keepNext/>
-              <w:spacing w:after="0"/>
-            </w:pPr>
-            <w:r>
-              <w:rPr>
-                <w:sz w:val="17"/>
-              </w:rPr>
-              <w:t>Drafts the Introduction; manages the references in a reference manager; finds 2–3 papers for the Discussion comparison.</w:t>
-            </w:r>
-          </w:p>
-        </w:tc>
-      </w:tr>
-      <w:tr>
-        <w:trPr>
-          <w:cantSplit w:val="true"/>
-        </w:trPr>
-        <w:tc>
-          <w:tcPr>
-            <w:tcW w:type="dxa" w:w="1729"/>
-            <w:tcBorders>
-              <w:top w:val="single" w:sz="4" w:color="D5DDE1"/>
-              <w:left w:val="single" w:sz="4" w:color="D5DDE1"/>
-              <w:bottom w:val="single" w:sz="4" w:color="D5DDE1"/>
-              <w:right w:val="single" w:sz="4" w:color="D5DDE1"/>
-            </w:tcBorders>
-          </w:tcPr>
-          <w:p>
-            <w:pPr>
-              <w:keepNext/>
-              <w:spacing w:after="0"/>
-            </w:pPr>
-            <w:r>
-              <w:rPr>
-                <w:b/>
-                <w:sz w:val="17"/>
-              </w:rPr>
-              <w:t>Discussion writer</w:t>
-            </w:r>
-          </w:p>
-        </w:tc>
-        <w:tc>
-          <w:tcPr>
-            <w:tcW w:type="dxa" w:w="7682"/>
-            <w:tcBorders>
-              <w:top w:val="single" w:sz="4" w:color="D5DDE1"/>
-              <w:left w:val="single" w:sz="4" w:color="D5DDE1"/>
-              <w:bottom w:val="single" w:sz="4" w:color="D5DDE1"/>
-              <w:right w:val="single" w:sz="4" w:color="D5DDE1"/>
-            </w:tcBorders>
-          </w:tcPr>
-          <w:p>
-            <w:pPr>
-              <w:keepNext/>
-              <w:spacing w:after="0"/>
-            </w:pPr>
-            <w:r>
-              <w:rPr>
-                <w:sz w:val="17"/>
-              </w:rPr>
-              <w:t>Drafts the Discussion and Conclusion in calibrated language; leads the limitations paragraph.</w:t>
-            </w:r>
-          </w:p>
-        </w:tc>
-      </w:tr>
-      <w:tr>
-        <w:trPr>
-          <w:cantSplit w:val="true"/>
-        </w:trPr>
-        <w:tc>
-          <w:tcPr>
-            <w:tcW w:type="dxa" w:w="1729"/>
-            <w:tcBorders>
-              <w:top w:val="single" w:sz="4" w:color="D5DDE1"/>
-              <w:left w:val="single" w:sz="4" w:color="D5DDE1"/>
-              <w:bottom w:val="single" w:sz="4" w:color="D5DDE1"/>
-              <w:right w:val="single" w:sz="4" w:color="D5DDE1"/>
-            </w:tcBorders>
-            <w:shd w:val="clear" w:color="auto" w:fill="EAF2F5"/>
-          </w:tcPr>
-          <w:p>
-            <w:pPr>
-              <w:spacing w:after="0"/>
-            </w:pPr>
-            <w:r>
-              <w:rPr>
-                <w:b/>
-                <w:sz w:val="17"/>
-              </w:rPr>
-              <w:t>STROBE and consistency checker</w:t>
-            </w:r>
-          </w:p>
-        </w:tc>
-        <w:tc>
-          <w:tcPr>
-            <w:tcW w:type="dxa" w:w="7682"/>
-            <w:tcBorders>
-              <w:top w:val="single" w:sz="4" w:color="D5DDE1"/>
-              <w:left w:val="single" w:sz="4" w:color="D5DDE1"/>
-              <w:bottom w:val="single" w:sz="4" w:color="D5DDE1"/>
-              <w:right w:val="single" w:sz="4" w:color="D5DDE1"/>
-            </w:tcBorders>
-            <w:shd w:val="clear" w:color="auto" w:fill="EAF2F5"/>
-          </w:tcPr>
-          <w:p>
-            <w:pPr>
-              <w:spacing w:after="0"/>
-            </w:pPr>
-            <w:r>
-              <w:rPr>
-                <w:sz w:val="17"/>
-              </w:rPr>
-              <w:t>Completes the STROBE checklist; checks that numbers agree between abstract, text and tables; checks word counts, the AI-use statement and the simulated-data statement.</w:t>
-            </w:r>
-          </w:p>
-        </w:tc>
-      </w:tr>
-    </w:tbl>
     <w:p>
       <w:pPr>
-        <w:spacing w:after="80"/>
+        <w:pStyle w:val="ListBullet"/>
       </w:pPr>
-    </w:p>
-    <w:p>
       <w:r>
         <w:rPr>
           <w:b/>
         </w:rPr>
-        <w:t>Authorship:</w:t>
+        <w:t>CRediT statement:</w:t>
       </w:r>
       <w:r>
-        <w:t xml:space="preserve"> all group members who meet the ICMJE criteria are authors. Add a </w:t>
+        <w:t xml:space="preserve"> list your own roles and those of the people who produced the data and analysis, e.g. "Conceptualisation, writing (original draft), writing (review and editing): [your name]. Data curation, formal analysis: course instructors."</w:t>
       </w:r>
+    </w:p>
+    <w:p>
+      <w:pPr>
+        <w:pStyle w:val="ListBullet"/>
+      </w:pPr>
       <w:r>
         <w:rPr>
           <w:b/>
         </w:rPr>
-        <w:t>CRediT</w:t>
+        <w:t>Acknowledgements:</w:t>
       </w:r>
       <w:r>
-        <w:t xml:space="preserve"> statement (e.g. "Writing – original draft: …; Formal analysis: course instructors; Data curation: course instructors"). Instructors who produced the analysis are acknowledged, not listed as authors.</w:t>
+        <w:t xml:space="preserve"> the course instructors created the dataset and ran the analysis. They are acknowledged, not listed as authors, e.g. "The simulated FLUID-ICU dataset and its analysis were provided by the Neudata course </w:t>
+      </w:r>
+      <w:r>
+        <w:rPr>
+          <w:i/>
+        </w:rPr>
+        <w:t>Foundations of Clinical Research, Level 1</w:t>
+      </w:r>
+      <w:r>
+        <w:t>. We thank [name of the classmate who reviewed the draft] for their peer review."</w:t>
+      </w:r>
+    </w:p>
+    <w:p>
+      <w:r>
+        <w:t>You may discuss the results with classmates, but the text must be your own.</w:t>
       </w:r>
     </w:p>
     <w:p>
@@ -3348,7 +2992,7 @@
         <w:t>Originality:</w:t>
       </w:r>
       <w:r>
-        <w:t xml:space="preserve"> write in your own words and cite every source. Quote sparingly and with quotation marks.</w:t>
+        <w:t xml:space="preserve"> write in your own words and cite every source. Quote sparingly and with quotation marks. Two participants who chose the same question will have the same numbers, but their text must be their own.</w:t>
       </w:r>
     </w:p>
     <w:p>
@@ -3378,7 +3022,7 @@
         <w:pStyle w:val="ListBullet"/>
       </w:pPr>
       <w:r>
-        <w:t>"AI use: [tool name] was used to [improve the English / translate drafts / suggest wording]. The authors checked every sentence and reference and take full responsibility for the content."</w:t>
+        <w:t>"AI use: [tool name] was used to [improve the English / translate drafts / suggest wording]. The author checked every sentence and reference and takes full responsibility for the content."</w:t>
       </w:r>
     </w:p>
     <w:p>
@@ -3392,7 +3036,7 @@
         <w:t>not</w:t>
       </w:r>
       <w:r>
-        <w:t xml:space="preserve"> be used to produce results, invent or find references you have not read, or write the interpretation for you. AI tools cannot be authors. When you review another group's manuscript, </w:t>
+        <w:t xml:space="preserve"> be used to produce results, invent or find references you have not read, or write the interpretation for you. AI tools cannot be authors. When you review a classmate's manuscript, </w:t>
       </w:r>
       <w:r>
         <w:rPr>
@@ -3414,7 +3058,7 @@
     </w:p>
     <w:p>
       <w:r>
-        <w:t>Send everything to the course lead (or upload to the course folder):</w:t>
+        <w:t>Send everything to the course lead by email (or upload it to the online course folder):</w:t>
       </w:r>
     </w:p>
     <w:tbl>
@@ -3431,8 +3075,8 @@
         <w:tblLook w:firstColumn="1" w:firstRow="1" w:lastColumn="0" w:lastRow="0" w:noHBand="0" w:noVBand="1" w:val="04A0"/>
       </w:tblPr>
       <w:tblGrid>
-        <w:gridCol w:w="7240"/>
-        <w:gridCol w:w="2171"/>
+        <w:gridCol w:w="7322"/>
+        <w:gridCol w:w="2090"/>
       </w:tblGrid>
       <w:tr>
         <w:trPr>
@@ -3441,7 +3085,7 @@
         </w:trPr>
         <w:tc>
           <w:tcPr>
-            <w:tcW w:type="dxa" w:w="7239"/>
+            <w:tcW w:type="dxa" w:w="7321"/>
             <w:tcBorders>
               <w:top w:val="single" w:sz="4" w:color="04242F"/>
               <w:left w:val="single" w:sz="4" w:color="04242F"/>
@@ -3467,7 +3111,7 @@
         </w:tc>
         <w:tc>
           <w:tcPr>
-            <w:tcW w:type="dxa" w:w="2172"/>
+            <w:tcW w:type="dxa" w:w="2090"/>
             <w:tcBorders>
               <w:top w:val="single" w:sz="4" w:color="04242F"/>
               <w:left w:val="single" w:sz="4" w:color="04242F"/>
@@ -3498,7 +3142,7 @@
         </w:trPr>
         <w:tc>
           <w:tcPr>
-            <w:tcW w:type="dxa" w:w="7239"/>
+            <w:tcW w:type="dxa" w:w="7321"/>
             <w:tcBorders>
               <w:top w:val="single" w:sz="4" w:color="D5DDE1"/>
               <w:left w:val="single" w:sz="4" w:color="D5DDE1"/>
@@ -3517,7 +3161,7 @@
                 <w:color w:val="0B376C"/>
                 <w:sz w:val="17"/>
               </w:rPr>
-              <w:t>GroupN_Manuscript_QN_draft.docx</w:t>
+              <w:t>Surname_Manuscript_QN_draft.docx</w:t>
             </w:r>
             <w:r>
               <w:rPr>
@@ -3529,7 +3173,7 @@
         </w:tc>
         <w:tc>
           <w:tcPr>
-            <w:tcW w:type="dxa" w:w="2172"/>
+            <w:tcW w:type="dxa" w:w="2090"/>
             <w:tcBorders>
               <w:top w:val="single" w:sz="4" w:color="D5DDE1"/>
               <w:left w:val="single" w:sz="4" w:color="D5DDE1"/>
@@ -3557,7 +3201,7 @@
         </w:trPr>
         <w:tc>
           <w:tcPr>
-            <w:tcW w:type="dxa" w:w="7239"/>
+            <w:tcW w:type="dxa" w:w="7321"/>
             <w:tcBorders>
               <w:top w:val="single" w:sz="4" w:color="D5DDE1"/>
               <w:left w:val="single" w:sz="4" w:color="D5DDE1"/>
@@ -3577,7 +3221,7 @@
                 <w:color w:val="0B376C"/>
                 <w:sz w:val="17"/>
               </w:rPr>
-              <w:t>GroupN_Review_of_GroupM.docx</w:t>
+              <w:t>Surname_Review_of_[author's surname].docx</w:t>
             </w:r>
             <w:r>
               <w:rPr>
@@ -3589,7 +3233,7 @@
         </w:tc>
         <w:tc>
           <w:tcPr>
-            <w:tcW w:type="dxa" w:w="2172"/>
+            <w:tcW w:type="dxa" w:w="2090"/>
             <w:tcBorders>
               <w:top w:val="single" w:sz="4" w:color="D5DDE1"/>
               <w:left w:val="single" w:sz="4" w:color="D5DDE1"/>
@@ -3618,7 +3262,7 @@
         </w:trPr>
         <w:tc>
           <w:tcPr>
-            <w:tcW w:type="dxa" w:w="7239"/>
+            <w:tcW w:type="dxa" w:w="7321"/>
             <w:tcBorders>
               <w:top w:val="single" w:sz="4" w:color="D5DDE1"/>
               <w:left w:val="single" w:sz="4" w:color="D5DDE1"/>
@@ -3636,7 +3280,7 @@
                 <w:color w:val="0B376C"/>
                 <w:sz w:val="17"/>
               </w:rPr>
-              <w:t>GroupN_Manuscript_QN_revised.docx</w:t>
+              <w:t>Surname_Manuscript_QN_revised.docx</w:t>
             </w:r>
             <w:r>
               <w:rPr>
@@ -3650,7 +3294,7 @@
                 <w:color w:val="0B376C"/>
                 <w:sz w:val="17"/>
               </w:rPr>
-              <w:t>GroupN_Response_to_Reviewers.docx</w:t>
+              <w:t>Surname_Response_to_Reviewers.docx</w:t>
             </w:r>
             <w:r>
               <w:rPr>
@@ -3676,7 +3320,7 @@
         </w:tc>
         <w:tc>
           <w:tcPr>
-            <w:tcW w:type="dxa" w:w="2172"/>
+            <w:tcW w:type="dxa" w:w="2090"/>
             <w:tcBorders>
               <w:top w:val="single" w:sz="4" w:color="D5DDE1"/>
               <w:left w:val="single" w:sz="4" w:color="D5DDE1"/>
@@ -3705,7 +3349,16 @@
     </w:p>
     <w:p>
       <w:r>
-        <w:t>The course lead sends each group the draft it will review within 2 days of Session 8. Review pairs rotate: Group 1 reviews Group 2, Group 2 reviews Group 3, … Group 5 reviews Group 1.</w:t>
+        <w:t xml:space="preserve">Within 2 days of Session 8 the course lead sends each participant </w:t>
+      </w:r>
+      <w:r>
+        <w:rPr>
+          <w:b/>
+        </w:rPr>
+        <w:t>one</w:t>
+      </w:r>
+      <w:r>
+        <w:t xml:space="preserve"> classmate's draft to review, by email or through the course folder. Each participant reviews one draft and receives one review. Where possible the instructor pairs drafts on a different question from your own, so that you read a second question in depth.</w:t>
       </w:r>
     </w:p>
     <w:p>
@@ -3721,16 +3374,7 @@
         <w:pStyle w:val="ListBullet"/>
       </w:pPr>
       <w:r>
-        <w:t xml:space="preserve">In Session 8, each group gives a </w:t>
-      </w:r>
-      <w:r>
-        <w:rPr>
-          <w:b/>
-        </w:rPr>
-        <w:t>1-minute manuscript pitch</w:t>
-      </w:r>
-      <w:r>
-        <w:t xml:space="preserve"> (question, main result with 95% CI, one-sentence conclusion) in the presentation block (see </w:t>
+        <w:t>Feedback on the manuscript comes from the classmate who reviews your draft (</w:t>
       </w:r>
       <w:r>
         <w:rPr>
@@ -3738,10 +3382,10 @@
           <w:color w:val="0B376C"/>
           <w:sz w:val="19"/>
         </w:rPr>
-        <w:t>Presentation_Guide.pdf</w:t>
+        <w:t>Peer_Review_Instructions.pdf</w:t>
       </w:r>
       <w:r>
-        <w:t>).</w:t>
+        <w:t>) and from the instructors.</w:t>
       </w:r>
     </w:p>
     <w:p>
@@ -3760,7 +3404,7 @@
         <w:t>Manuscript_Rubric.pdf</w:t>
       </w:r>
       <w:r>
-        <w:t xml:space="preserve"> and return written comments within about 3 weeks.</w:t>
+        <w:t xml:space="preserve"> and return written comments within about 3 weeks. If you do not send a revision, the draft is marked instead.</w:t>
       </w:r>
     </w:p>
     <w:p>
@@ -3864,7 +3508,7 @@
         <w:color w:val="04242F"/>
         <w:sz w:val="16"/>
       </w:rPr>
-      <w:t>Foundations of Clinical Research · Level 1  ·  Group manuscript brief</w:t>
+      <w:t>Foundations of Clinical Research · Level 1  ·  Individual manuscript brief</w:t>
     </w:r>
     <w:r>
       <w:tab/>

</xml_diff>

<commit_message>
Rebuild site: Lecture 1 and 2 round 2 revisions, native diagrams, Vietnamese wording
</commit_message>
<xml_diff>
--- a/en/files/assignments/Manuscript_Brief.docx
+++ b/en/files/assignments/Manuscript_Brief.docx
@@ -3058,6 +3058,11 @@
     </w:p>
     <w:p>
       <w:r>
+        <w:t>Write the manuscript, the review report and the response letter in English. If English is impossible for you, you may write in Vietnamese.</w:t>
+      </w:r>
+    </w:p>
+    <w:p>
+      <w:r>
         <w:t>Send everything to the course lead by email (or upload it to the online course folder):</w:t>
       </w:r>
     </w:p>

</xml_diff>

<commit_message>
Rebuild site: round 5 (proposal brief pre-course, manuscript brief at Session 6, Results-section product)
</commit_message>
<xml_diff>
--- a/en/files/assignments/Manuscript_Brief.docx
+++ b/en/files/assignments/Manuscript_Brief.docx
@@ -7,7 +7,7 @@
         <w:pStyle w:val="Title"/>
       </w:pPr>
       <w:r>
-        <w:t>Draft Manuscript: Assignment Brief (Individual Product 2)</w:t>
+        <w:t>Manuscript (Results section): Assignment Brief (Individual Product 2)</w:t>
       </w:r>
     </w:p>
     <w:p>
@@ -43,10 +43,10 @@
         <w:rPr>
           <w:b/>
         </w:rPr>
-        <w:t>Assessment type:</w:t>
+        <w:t>Who:</w:t>
       </w:r>
       <w:r>
-        <w:t xml:space="preserve"> Individual assignment. Results read together in Sessions 5 and 6, writing modelled live in Sessions 7 and 8 and done by you as homework, peer reviewed in the 2 weeks after Session 8.</w:t>
+        <w:t xml:space="preserve"> every participant, on their own. There are no groups.</w:t>
       </w:r>
     </w:p>
     <w:p>
@@ -54,19 +54,30 @@
         <w:rPr>
           <w:b/>
         </w:rPr>
-        <w:t>Who:</w:t>
+        <w:t>Required:</w:t>
       </w:r>
       <w:r>
-        <w:t xml:space="preserve"> every participant writes their own manuscript. You choose </w:t>
+        <w:t xml:space="preserve"> a complete, submission-ready </w:t>
       </w:r>
       <w:r>
         <w:rPr>
           <w:b/>
         </w:rPr>
-        <w:t>one</w:t>
+        <w:t>Results section</w:t>
       </w:r>
       <w:r>
-        <w:t xml:space="preserve"> of the five FLUID-ICU questions (Q1 to Q5). There are no groups.</w:t>
+        <w:t xml:space="preserve"> for one FLUID-ICU question (Q1 to Q5), with a working title, Table 1 and one main results table or figure.</w:t>
+      </w:r>
+    </w:p>
+    <w:p>
+      <w:r>
+        <w:rPr>
+          <w:b/>
+        </w:rPr>
+        <w:t>Optional:</w:t>
+      </w:r>
+      <w:r>
+        <w:t xml:space="preserve"> Methods, Introduction, Discussion and Abstract. Trainers give feedback on these too.</w:t>
       </w:r>
     </w:p>
     <w:p>
@@ -77,7 +88,7 @@
         <w:t>What we give you:</w:t>
       </w:r>
       <w:r>
-        <w:t xml:space="preserve"> the results. For each question there is a results pack with all the tables, figures and numbers you need. You do not analyse any data: you write the paper.</w:t>
+        <w:t xml:space="preserve"> the results. You do not analyse any data.</w:t>
       </w:r>
     </w:p>
     <w:p>
@@ -85,19 +96,10 @@
         <w:rPr>
           <w:b/>
         </w:rPr>
-        <w:t>Output:</w:t>
+        <w:t>Shared:</w:t>
       </w:r>
       <w:r>
-        <w:t xml:space="preserve"> a STROBE-guided original article of about </w:t>
-      </w:r>
-      <w:r>
-        <w:rPr>
-          <w:b/>
-        </w:rPr>
-        <w:t>2,000 words</w:t>
-      </w:r>
-      <w:r>
-        <w:t>, a review of one classmate's draft, and a response-to-reviewers letter</w:t>
+        <w:t xml:space="preserve"> at the end of Session 6, when you choose your question.</w:t>
       </w:r>
     </w:p>
     <w:p>
@@ -119,7 +121,7 @@
         <w:t>Manuscript_Rubric.pdf</w:t>
       </w:r>
       <w:r>
-        <w:t xml:space="preserve"> (formative); peer review follows </w:t>
+        <w:t xml:space="preserve"> (formative). Peer review: </w:t>
       </w:r>
       <w:r>
         <w:rPr>
@@ -128,6 +130,9 @@
           <w:sz w:val="19"/>
         </w:rPr>
         <w:t>Peer_Review_Instructions.pdf</w:t>
+      </w:r>
+      <w:r>
+        <w:t>.</w:t>
       </w:r>
     </w:p>
     <w:p>
@@ -140,50 +145,7 @@
     </w:p>
     <w:p>
       <w:r>
-        <w:t xml:space="preserve">In the proposal you plan a study that has not been done. In this assignment you do the other half of the research journey: you take the results of a study that </w:t>
-      </w:r>
-      <w:r>
-        <w:rPr>
-          <w:b/>
-        </w:rPr>
-        <w:t>has</w:t>
-      </w:r>
-      <w:r>
-        <w:t xml:space="preserve"> been done and turn them into a paper that a journal could review. You will practise everything from Sessions 5 to 8: reading Table 1 and regression outputs, writing Methods and Results, calibrated language in the Discussion, the abstract and title, a reporting checklist, peer review and responding to reviewers.</w:t>
-      </w:r>
-    </w:p>
-    <w:p>
-      <w:r>
-        <w:t xml:space="preserve">Nobody needs to run any software. The instructor runs the analyses live in R in Sessions 5 and 6, and for each question there is a </w:t>
-      </w:r>
-      <w:r>
-        <w:rPr>
-          <w:b/>
-        </w:rPr>
-        <w:t>results pack</w:t>
-      </w:r>
-      <w:r>
-        <w:t xml:space="preserve"> with all the numbers, tables and figures you need. Participants who completed the free Neudata course </w:t>
-      </w:r>
-      <w:r>
-        <w:rPr>
-          <w:i/>
-        </w:rPr>
-        <w:t>Clinical Data Analysis in R</w:t>
-      </w:r>
-      <w:r>
-        <w:t xml:space="preserve"> may reproduce the analyses with the scripts in </w:t>
-      </w:r>
-      <w:r>
-        <w:rPr>
-          <w:rFonts w:ascii="Consolas" w:hAnsi="Consolas" w:cs="Consolas" w:eastAsia="Consolas"/>
-          <w:color w:val="0B376C"/>
-          <w:sz w:val="19"/>
-        </w:rPr>
-        <w:t>Course/Data/</w:t>
-      </w:r>
-      <w:r>
-        <w:t>, but this is optional.</w:t>
+        <w:t>In the proposal you plan a study that has not been done. Here you report one that has. You write the Results section of a FLUID-ICU paper to the standard a journal expects: every number correct, every estimate with its 95% CI, tables that stand alone and no interpretation. If you have time, you can write the other sections too.</w:t>
       </w:r>
     </w:p>
     <w:p>
@@ -194,19 +156,10 @@
         <w:rPr>
           <w:b/>
         </w:rPr>
-        <w:t>Important: simulated data.</w:t>
+        <w:t>Simulated data.</w:t>
       </w:r>
       <w:r>
-        <w:t xml:space="preserve"> FLUID-ICU is a </w:t>
-      </w:r>
-      <w:r>
-        <w:rPr>
-          <w:b/>
-        </w:rPr>
-        <w:t>simulated training dataset</w:t>
-      </w:r>
-      <w:r>
-        <w:t>. Your manuscript is a training exercise. Say so in the Methods and on the title page ("This manuscript uses simulated data created for training; it reports no real patients"), and never submit it to a journal or present it as real research.</w:t>
+        <w:t xml:space="preserve"> FLUID-ICU is a simulated training dataset. Put this sentence under your title: "This manuscript uses simulated data created for training. It reports no real patients." Never submit it to a journal.</w:t>
       </w:r>
     </w:p>
     <w:p>
@@ -214,68 +167,12 @@
         <w:pStyle w:val="Heading1"/>
       </w:pPr>
       <w:r>
-        <w:t>2. The course dataset: FLUID-ICU</w:t>
+        <w:t>2. Choose one question (end of Session 6)</w:t>
       </w:r>
     </w:p>
     <w:p>
       <w:r>
-        <w:t xml:space="preserve">A simulated multicentre prospective cohort of about </w:t>
-      </w:r>
-      <w:r>
-        <w:rPr>
-          <w:b/>
-        </w:rPr>
-        <w:t>600 adults with sepsis</w:t>
-      </w:r>
-      <w:r>
-        <w:t xml:space="preserve"> admitted to 4 ICUs. It contains demographics, comorbidities (diabetes, chronic kidney disease, heart failure, hypertension), infection source, severity (SOFA, APACHE II), lactate, mean arterial pressure, vasopressors, mechanical ventilation, daily fluid in and out on days 1 to 3, weight, cumulative fluid balance at day 3 (ml/kg) and positive balance (yes/no), acute kidney injury (KDIGO), renal replacement therapy, ventilator-free days, ICU length of stay and 28-day mortality with time to death or censoring.</w:t>
-      </w:r>
-    </w:p>
-    <w:p>
-      <w:r>
-        <w:t xml:space="preserve">What you will find in </w:t>
-      </w:r>
-      <w:r>
-        <w:rPr>
-          <w:rFonts w:ascii="Consolas" w:hAnsi="Consolas" w:cs="Consolas" w:eastAsia="Consolas"/>
-          <w:color w:val="0B376C"/>
-          <w:sz w:val="19"/>
-        </w:rPr>
-        <w:t>Course/Data/</w:t>
-      </w:r>
-      <w:r>
-        <w:t xml:space="preserve"> (in the online course folder): the raw and clean data, the data dictionary, the </w:t>
-      </w:r>
-      <w:r>
-        <w:rPr>
-          <w:b/>
-        </w:rPr>
-        <w:t>cleaning log</w:t>
-      </w:r>
-      <w:r>
-        <w:t>, the statistical analysis plan (written before the analysis), the R scripts, and one results pack per question.</w:t>
-      </w:r>
-    </w:p>
-    <w:p>
-      <w:pPr>
-        <w:pStyle w:val="Heading1"/>
-      </w:pPr>
-      <w:r>
-        <w:t>3. The five questions: choose one</w:t>
-      </w:r>
-    </w:p>
-    <w:p>
-      <w:r>
-        <w:t xml:space="preserve">The five questions are introduced in Session 5. In class the instructor works through them with the whole class: Q1 in full, and Q2 to Q5 as shorter worked examples. </w:t>
-      </w:r>
-      <w:r>
-        <w:rPr>
-          <w:b/>
-        </w:rPr>
-        <w:t>By the end of Session 6, choose one question for your manuscript</w:t>
-      </w:r>
-      <w:r>
-        <w:t xml:space="preserve"> and tell the course lead (by email or the form shared in the chat). Any question may be chosen by any number of participants. Q1 is the one done in full in class, so it is the easiest start; Q2 to Q5 are a little more of a challenge.</w:t>
+        <w:t>All five questions are worked through in Sessions 5 and 6 (Q1 in full). By the end of Session 6, choose one and tell the course lead in the chat or by email. Any number of participants may choose the same question. Q1 is modelled live in Session 7, so it is the easiest start.</w:t>
       </w:r>
     </w:p>
     <w:tbl>
@@ -293,10 +190,8 @@
       </w:tblPr>
       <w:tblGrid>
         <w:gridCol w:w="481"/>
-        <w:gridCol w:w="3075"/>
-        <w:gridCol w:w="1566"/>
-        <w:gridCol w:w="1956"/>
-        <w:gridCol w:w="2331"/>
+        <w:gridCol w:w="4997"/>
+        <w:gridCol w:w="3932"/>
       </w:tblGrid>
       <w:tr>
         <w:trPr>
@@ -331,7 +226,7 @@
         </w:tc>
         <w:tc>
           <w:tcPr>
-            <w:tcW w:type="dxa" w:w="3075"/>
+            <w:tcW w:type="dxa" w:w="4997"/>
             <w:tcBorders>
               <w:top w:val="single" w:sz="4" w:color="04242F"/>
               <w:left w:val="single" w:sz="4" w:color="04242F"/>
@@ -357,59 +252,7 @@
         </w:tc>
         <w:tc>
           <w:tcPr>
-            <w:tcW w:type="dxa" w:w="1566"/>
-            <w:tcBorders>
-              <w:top w:val="single" w:sz="4" w:color="04242F"/>
-              <w:left w:val="single" w:sz="4" w:color="04242F"/>
-              <w:bottom w:val="single" w:sz="4" w:color="04242F"/>
-              <w:right w:val="single" w:sz="4" w:color="04242F"/>
-            </w:tcBorders>
-            <w:shd w:val="clear" w:color="auto" w:fill="04242F"/>
-          </w:tcPr>
-          <w:p>
-            <w:pPr>
-              <w:keepNext/>
-              <w:spacing w:after="0"/>
-            </w:pPr>
-            <w:r>
-              <w:rPr>
-                <w:b/>
-                <w:color w:val="FFFFFF"/>
-                <w:sz w:val="18"/>
-              </w:rPr>
-              <w:t>Exposure</w:t>
-            </w:r>
-          </w:p>
-        </w:tc>
-        <w:tc>
-          <w:tcPr>
-            <w:tcW w:type="dxa" w:w="1956"/>
-            <w:tcBorders>
-              <w:top w:val="single" w:sz="4" w:color="04242F"/>
-              <w:left w:val="single" w:sz="4" w:color="04242F"/>
-              <w:bottom w:val="single" w:sz="4" w:color="04242F"/>
-              <w:right w:val="single" w:sz="4" w:color="04242F"/>
-            </w:tcBorders>
-            <w:shd w:val="clear" w:color="auto" w:fill="04242F"/>
-          </w:tcPr>
-          <w:p>
-            <w:pPr>
-              <w:keepNext/>
-              <w:spacing w:after="0"/>
-            </w:pPr>
-            <w:r>
-              <w:rPr>
-                <w:b/>
-                <w:color w:val="FFFFFF"/>
-                <w:sz w:val="18"/>
-              </w:rPr>
-              <w:t>Outcome</w:t>
-            </w:r>
-          </w:p>
-        </w:tc>
-        <w:tc>
-          <w:tcPr>
-            <w:tcW w:type="dxa" w:w="2331"/>
+            <w:tcW w:type="dxa" w:w="3932"/>
             <w:tcBorders>
               <w:top w:val="single" w:sz="4" w:color="04242F"/>
               <w:left w:val="single" w:sz="4" w:color="04242F"/>
@@ -464,7 +307,7 @@
         </w:tc>
         <w:tc>
           <w:tcPr>
-            <w:tcW w:type="dxa" w:w="3075"/>
+            <w:tcW w:type="dxa" w:w="4997"/>
             <w:tcBorders>
               <w:top w:val="single" w:sz="4" w:color="D5DDE1"/>
               <w:left w:val="single" w:sz="4" w:color="D5DDE1"/>
@@ -481,13 +324,13 @@
               <w:rPr>
                 <w:sz w:val="17"/>
               </w:rPr>
-              <w:t>Is a positive fluid balance by day 3 associated with higher 28-day mortality? (the primary question)</w:t>
+              <w:t>Is a positive fluid balance by day 3 associated with higher 28-day mortality?</w:t>
             </w:r>
           </w:p>
         </w:tc>
         <w:tc>
           <w:tcPr>
-            <w:tcW w:type="dxa" w:w="1566"/>
+            <w:tcW w:type="dxa" w:w="3932"/>
             <w:tcBorders>
               <w:top w:val="single" w:sz="4" w:color="D5DDE1"/>
               <w:left w:val="single" w:sz="4" w:color="D5DDE1"/>
@@ -504,53 +347,7 @@
               <w:rPr>
                 <w:sz w:val="17"/>
               </w:rPr>
-              <w:t>Positive cumulative fluid balance by day 3 (yes/no)</w:t>
-            </w:r>
-          </w:p>
-        </w:tc>
-        <w:tc>
-          <w:tcPr>
-            <w:tcW w:type="dxa" w:w="1956"/>
-            <w:tcBorders>
-              <w:top w:val="single" w:sz="4" w:color="D5DDE1"/>
-              <w:left w:val="single" w:sz="4" w:color="D5DDE1"/>
-              <w:bottom w:val="single" w:sz="4" w:color="D5DDE1"/>
-              <w:right w:val="single" w:sz="4" w:color="D5DDE1"/>
-            </w:tcBorders>
-          </w:tcPr>
-          <w:p>
-            <w:pPr>
-              <w:keepNext/>
-              <w:spacing w:after="0"/>
-            </w:pPr>
-            <w:r>
-              <w:rPr>
-                <w:sz w:val="17"/>
-              </w:rPr>
-              <w:t>28-day mortality</w:t>
-            </w:r>
-          </w:p>
-        </w:tc>
-        <w:tc>
-          <w:tcPr>
-            <w:tcW w:type="dxa" w:w="2331"/>
-            <w:tcBorders>
-              <w:top w:val="single" w:sz="4" w:color="D5DDE1"/>
-              <w:left w:val="single" w:sz="4" w:color="D5DDE1"/>
-              <w:bottom w:val="single" w:sz="4" w:color="D5DDE1"/>
-              <w:right w:val="single" w:sz="4" w:color="D5DDE1"/>
-            </w:tcBorders>
-          </w:tcPr>
-          <w:p>
-            <w:pPr>
-              <w:keepNext/>
-              <w:spacing w:after="0"/>
-            </w:pPr>
-            <w:r>
-              <w:rPr>
-                <w:sz w:val="17"/>
-              </w:rPr>
-              <w:t>Crude and adjusted logistic regression (OR); Kaplan-Meier curves and Cox model (HR)</w:t>
+              <w:t>Crude and adjusted logistic regression (OR), Kaplan-Meier curves and Cox model (HR)</w:t>
             </w:r>
           </w:p>
         </w:tc>
@@ -586,7 +383,7 @@
         </w:tc>
         <w:tc>
           <w:tcPr>
-            <w:tcW w:type="dxa" w:w="3075"/>
+            <w:tcW w:type="dxa" w:w="4997"/>
             <w:tcBorders>
               <w:top w:val="single" w:sz="4" w:color="D5DDE1"/>
               <w:left w:val="single" w:sz="4" w:color="D5DDE1"/>
@@ -604,61 +401,13 @@
               <w:rPr>
                 <w:sz w:val="17"/>
               </w:rPr>
-              <w:t>Is cumulative fluid balance associated with acute kidney injury?</w:t>
+              <w:t>Is cumulative fluid balance associated with acute kidney injury (AKI)?</w:t>
             </w:r>
           </w:p>
         </w:tc>
         <w:tc>
           <w:tcPr>
-            <w:tcW w:type="dxa" w:w="1566"/>
-            <w:tcBorders>
-              <w:top w:val="single" w:sz="4" w:color="D5DDE1"/>
-              <w:left w:val="single" w:sz="4" w:color="D5DDE1"/>
-              <w:bottom w:val="single" w:sz="4" w:color="D5DDE1"/>
-              <w:right w:val="single" w:sz="4" w:color="D5DDE1"/>
-            </w:tcBorders>
-            <w:shd w:val="clear" w:color="auto" w:fill="F5F9FA"/>
-          </w:tcPr>
-          <w:p>
-            <w:pPr>
-              <w:keepNext/>
-              <w:spacing w:after="0"/>
-            </w:pPr>
-            <w:r>
-              <w:rPr>
-                <w:sz w:val="17"/>
-              </w:rPr>
-              <w:t>Cumulative fluid balance at day 3 (ml/kg)</w:t>
-            </w:r>
-          </w:p>
-        </w:tc>
-        <w:tc>
-          <w:tcPr>
-            <w:tcW w:type="dxa" w:w="1956"/>
-            <w:tcBorders>
-              <w:top w:val="single" w:sz="4" w:color="D5DDE1"/>
-              <w:left w:val="single" w:sz="4" w:color="D5DDE1"/>
-              <w:bottom w:val="single" w:sz="4" w:color="D5DDE1"/>
-              <w:right w:val="single" w:sz="4" w:color="D5DDE1"/>
-            </w:tcBorders>
-            <w:shd w:val="clear" w:color="auto" w:fill="F5F9FA"/>
-          </w:tcPr>
-          <w:p>
-            <w:pPr>
-              <w:keepNext/>
-              <w:spacing w:after="0"/>
-            </w:pPr>
-            <w:r>
-              <w:rPr>
-                <w:sz w:val="17"/>
-              </w:rPr>
-              <w:t>AKI (KDIGO)</w:t>
-            </w:r>
-          </w:p>
-        </w:tc>
-        <w:tc>
-          <w:tcPr>
-            <w:tcW w:type="dxa" w:w="2331"/>
+            <w:tcW w:type="dxa" w:w="3932"/>
             <w:tcBorders>
               <w:top w:val="single" w:sz="4" w:color="D5DDE1"/>
               <w:left w:val="single" w:sz="4" w:color="D5DDE1"/>
@@ -711,7 +460,7 @@
         </w:tc>
         <w:tc>
           <w:tcPr>
-            <w:tcW w:type="dxa" w:w="3075"/>
+            <w:tcW w:type="dxa" w:w="4997"/>
             <w:tcBorders>
               <w:top w:val="single" w:sz="4" w:color="D5DDE1"/>
               <w:left w:val="single" w:sz="4" w:color="D5DDE1"/>
@@ -734,53 +483,7 @@
         </w:tc>
         <w:tc>
           <w:tcPr>
-            <w:tcW w:type="dxa" w:w="1566"/>
-            <w:tcBorders>
-              <w:top w:val="single" w:sz="4" w:color="D5DDE1"/>
-              <w:left w:val="single" w:sz="4" w:color="D5DDE1"/>
-              <w:bottom w:val="single" w:sz="4" w:color="D5DDE1"/>
-              <w:right w:val="single" w:sz="4" w:color="D5DDE1"/>
-            </w:tcBorders>
-          </w:tcPr>
-          <w:p>
-            <w:pPr>
-              <w:keepNext/>
-              <w:spacing w:after="0"/>
-            </w:pPr>
-            <w:r>
-              <w:rPr>
-                <w:sz w:val="17"/>
-              </w:rPr>
-              <w:t>Cumulative fluid balance at day 3 (ml/kg)</w:t>
-            </w:r>
-          </w:p>
-        </w:tc>
-        <w:tc>
-          <w:tcPr>
-            <w:tcW w:type="dxa" w:w="1956"/>
-            <w:tcBorders>
-              <w:top w:val="single" w:sz="4" w:color="D5DDE1"/>
-              <w:left w:val="single" w:sz="4" w:color="D5DDE1"/>
-              <w:bottom w:val="single" w:sz="4" w:color="D5DDE1"/>
-              <w:right w:val="single" w:sz="4" w:color="D5DDE1"/>
-            </w:tcBorders>
-          </w:tcPr>
-          <w:p>
-            <w:pPr>
-              <w:keepNext/>
-              <w:spacing w:after="0"/>
-            </w:pPr>
-            <w:r>
-              <w:rPr>
-                <w:sz w:val="17"/>
-              </w:rPr>
-              <w:t>Ventilator-free days to day 28</w:t>
-            </w:r>
-          </w:p>
-        </w:tc>
-        <w:tc>
-          <w:tcPr>
-            <w:tcW w:type="dxa" w:w="2331"/>
+            <w:tcW w:type="dxa" w:w="3932"/>
             <w:tcBorders>
               <w:top w:val="single" w:sz="4" w:color="D5DDE1"/>
               <w:left w:val="single" w:sz="4" w:color="D5DDE1"/>
@@ -833,7 +536,7 @@
         </w:tc>
         <w:tc>
           <w:tcPr>
-            <w:tcW w:type="dxa" w:w="3075"/>
+            <w:tcW w:type="dxa" w:w="4997"/>
             <w:tcBorders>
               <w:top w:val="single" w:sz="4" w:color="D5DDE1"/>
               <w:left w:val="single" w:sz="4" w:color="D5DDE1"/>
@@ -857,7 +560,7 @@
         </w:tc>
         <w:tc>
           <w:tcPr>
-            <w:tcW w:type="dxa" w:w="1566"/>
+            <w:tcW w:type="dxa" w:w="3932"/>
             <w:tcBorders>
               <w:top w:val="single" w:sz="4" w:color="D5DDE1"/>
               <w:left w:val="single" w:sz="4" w:color="D5DDE1"/>
@@ -875,55 +578,7 @@
               <w:rPr>
                 <w:sz w:val="17"/>
               </w:rPr>
-              <w:t>Initial lactate (mmol/l)</w:t>
-            </w:r>
-          </w:p>
-        </w:tc>
-        <w:tc>
-          <w:tcPr>
-            <w:tcW w:type="dxa" w:w="1956"/>
-            <w:tcBorders>
-              <w:top w:val="single" w:sz="4" w:color="D5DDE1"/>
-              <w:left w:val="single" w:sz="4" w:color="D5DDE1"/>
-              <w:bottom w:val="single" w:sz="4" w:color="D5DDE1"/>
-              <w:right w:val="single" w:sz="4" w:color="D5DDE1"/>
-            </w:tcBorders>
-            <w:shd w:val="clear" w:color="auto" w:fill="F5F9FA"/>
-          </w:tcPr>
-          <w:p>
-            <w:pPr>
-              <w:keepNext/>
-              <w:spacing w:after="0"/>
-            </w:pPr>
-            <w:r>
-              <w:rPr>
-                <w:sz w:val="17"/>
-              </w:rPr>
-              <w:t>28-day mortality</w:t>
-            </w:r>
-          </w:p>
-        </w:tc>
-        <w:tc>
-          <w:tcPr>
-            <w:tcW w:type="dxa" w:w="2331"/>
-            <w:tcBorders>
-              <w:top w:val="single" w:sz="4" w:color="D5DDE1"/>
-              <w:left w:val="single" w:sz="4" w:color="D5DDE1"/>
-              <w:bottom w:val="single" w:sz="4" w:color="D5DDE1"/>
-              <w:right w:val="single" w:sz="4" w:color="D5DDE1"/>
-            </w:tcBorders>
-            <w:shd w:val="clear" w:color="auto" w:fill="F5F9FA"/>
-          </w:tcPr>
-          <w:p>
-            <w:pPr>
-              <w:keepNext/>
-              <w:spacing w:after="0"/>
-            </w:pPr>
-            <w:r>
-              <w:rPr>
-                <w:sz w:val="17"/>
-              </w:rPr>
-              <w:t>Logistic regression; complete-case analysis vs multiple imputation</w:t>
+              <w:t>Logistic regression, complete-case analysis vs multiple imputation</w:t>
             </w:r>
           </w:p>
         </w:tc>
@@ -958,7 +613,7 @@
         </w:tc>
         <w:tc>
           <w:tcPr>
-            <w:tcW w:type="dxa" w:w="3075"/>
+            <w:tcW w:type="dxa" w:w="4997"/>
             <w:tcBorders>
               <w:top w:val="single" w:sz="4" w:color="D5DDE1"/>
               <w:left w:val="single" w:sz="4" w:color="D5DDE1"/>
@@ -981,7 +636,7 @@
         </w:tc>
         <w:tc>
           <w:tcPr>
-            <w:tcW w:type="dxa" w:w="1566"/>
+            <w:tcW w:type="dxa" w:w="3932"/>
             <w:tcBorders>
               <w:top w:val="single" w:sz="4" w:color="D5DDE1"/>
               <w:left w:val="single" w:sz="4" w:color="D5DDE1"/>
@@ -998,53 +653,7 @@
               <w:rPr>
                 <w:sz w:val="17"/>
               </w:rPr>
-              <w:t>Cumulative fluid balance at day 3 (ml/kg)</w:t>
-            </w:r>
-          </w:p>
-        </w:tc>
-        <w:tc>
-          <w:tcPr>
-            <w:tcW w:type="dxa" w:w="1956"/>
-            <w:tcBorders>
-              <w:top w:val="single" w:sz="4" w:color="D5DDE1"/>
-              <w:left w:val="single" w:sz="4" w:color="D5DDE1"/>
-              <w:bottom w:val="single" w:sz="4" w:color="D5DDE1"/>
-              <w:right w:val="single" w:sz="4" w:color="D5DDE1"/>
-            </w:tcBorders>
-            <w:shd w:val="clear" w:color="auto" w:fill="EAF2F5"/>
-          </w:tcPr>
-          <w:p>
-            <w:pPr>
-              <w:spacing w:after="0"/>
-            </w:pPr>
-            <w:r>
-              <w:rPr>
-                <w:sz w:val="17"/>
-              </w:rPr>
-              <w:t>ICU length of stay in survivors</w:t>
-            </w:r>
-          </w:p>
-        </w:tc>
-        <w:tc>
-          <w:tcPr>
-            <w:tcW w:type="dxa" w:w="2331"/>
-            <w:tcBorders>
-              <w:top w:val="single" w:sz="4" w:color="D5DDE1"/>
-              <w:left w:val="single" w:sz="4" w:color="D5DDE1"/>
-              <w:bottom w:val="single" w:sz="4" w:color="D5DDE1"/>
-              <w:right w:val="single" w:sz="4" w:color="D5DDE1"/>
-            </w:tcBorders>
-            <w:shd w:val="clear" w:color="auto" w:fill="EAF2F5"/>
-          </w:tcPr>
-          <w:p>
-            <w:pPr>
-              <w:spacing w:after="0"/>
-            </w:pPr>
-            <w:r>
-              <w:rPr>
-                <w:sz w:val="17"/>
-              </w:rPr>
-              <w:t>Median (IQR); linear regression on the log scale or non-parametric tests</w:t>
+              <w:t>Median (IQR), linear regression on the log scale or non-parametric tests</w:t>
             </w:r>
           </w:p>
         </w:tc>
@@ -1056,72 +665,11 @@
       </w:pPr>
     </w:p>
     <w:p>
-      <w:r>
-        <w:t xml:space="preserve">Your results pack is </w:t>
-      </w:r>
-      <w:r>
-        <w:rPr>
-          <w:rFonts w:ascii="Consolas" w:hAnsi="Consolas" w:cs="Consolas" w:eastAsia="Consolas"/>
-          <w:color w:val="0B376C"/>
-          <w:sz w:val="19"/>
-        </w:rPr>
-        <w:t>Course/Data/results_packs/QN/results_pack_QN.md</w:t>
-      </w:r>
-      <w:r>
-        <w:t xml:space="preserve">, where N is your question number (e.g. </w:t>
-      </w:r>
-      <w:r>
-        <w:rPr>
-          <w:rFonts w:ascii="Consolas" w:hAnsi="Consolas" w:cs="Consolas" w:eastAsia="Consolas"/>
-          <w:color w:val="0B376C"/>
-          <w:sz w:val="19"/>
-        </w:rPr>
-        <w:t>results_packs/Q4/results_pack_Q4.md</w:t>
-      </w:r>
-      <w:r>
-        <w:t xml:space="preserve">). Each results pack contains Table 1, figures, regression tables and plain-language notes. </w:t>
-      </w:r>
-      <w:r>
-        <w:rPr>
-          <w:b/>
-        </w:rPr>
-        <w:t>Use only the numbers in your results pack.</w:t>
-      </w:r>
-      <w:r>
-        <w:t xml:space="preserve"> If something you need is missing, ask the instructor rather than estimating it.</w:t>
-      </w:r>
-    </w:p>
-    <w:p>
       <w:pPr>
         <w:pStyle w:val="Heading1"/>
       </w:pPr>
       <w:r>
-        <w:t>4. What you write, and when</w:t>
-      </w:r>
-    </w:p>
-    <w:p>
-      <w:r>
-        <w:t xml:space="preserve">Use the Word template </w:t>
-      </w:r>
-      <w:r>
-        <w:rPr>
-          <w:rFonts w:ascii="Consolas" w:hAnsi="Consolas" w:cs="Consolas" w:eastAsia="Consolas"/>
-          <w:color w:val="0B376C"/>
-          <w:sz w:val="19"/>
-        </w:rPr>
-        <w:t>Course/Templates/Manuscript_Template_IMRaD.docx</w:t>
-      </w:r>
-      <w:r>
-        <w:t xml:space="preserve"> and follow the </w:t>
-      </w:r>
-      <w:r>
-        <w:rPr>
-          <w:b/>
-        </w:rPr>
-        <w:t>STROBE</w:t>
-      </w:r>
-      <w:r>
-        <w:t xml:space="preserve"> checklist for cohort studies.</w:t>
+        <w:t>3. What you receive (by email)</w:t>
       </w:r>
     </w:p>
     <w:tbl>
@@ -1138,10 +686,8 @@
         <w:tblLook w:firstColumn="1" w:firstRow="1" w:lastColumn="0" w:lastRow="0" w:noHBand="0" w:noVBand="1" w:val="04A0"/>
       </w:tblPr>
       <w:tblGrid>
-        <w:gridCol w:w="1729"/>
-        <w:gridCol w:w="1539"/>
-        <w:gridCol w:w="4113"/>
-        <w:gridCol w:w="2029"/>
+        <w:gridCol w:w="4224"/>
+        <w:gridCol w:w="5188"/>
       </w:tblGrid>
       <w:tr>
         <w:trPr>
@@ -1150,7 +696,7 @@
         </w:trPr>
         <w:tc>
           <w:tcPr>
-            <w:tcW w:type="dxa" w:w="1729"/>
+            <w:tcW w:type="dxa" w:w="4224"/>
             <w:tcBorders>
               <w:top w:val="single" w:sz="4" w:color="04242F"/>
               <w:left w:val="single" w:sz="4" w:color="04242F"/>
@@ -1170,13 +716,13 @@
                 <w:color w:val="FFFFFF"/>
                 <w:sz w:val="18"/>
               </w:rPr>
-              <w:t>Step</w:t>
+              <w:t>File</w:t>
             </w:r>
           </w:p>
         </w:tc>
         <w:tc>
           <w:tcPr>
-            <w:tcW w:type="dxa" w:w="1539"/>
+            <w:tcW w:type="dxa" w:w="5187"/>
             <w:tcBorders>
               <w:top w:val="single" w:sz="4" w:color="04242F"/>
               <w:left w:val="single" w:sz="4" w:color="04242F"/>
@@ -1196,13 +742,297 @@
                 <w:color w:val="FFFFFF"/>
                 <w:sz w:val="18"/>
               </w:rPr>
-              <w:t>When</w:t>
+              <w:t>What it is for</w:t>
+            </w:r>
+          </w:p>
+        </w:tc>
+      </w:tr>
+      <w:tr>
+        <w:trPr>
+          <w:cantSplit w:val="true"/>
+        </w:trPr>
+        <w:tc>
+          <w:tcPr>
+            <w:tcW w:type="dxa" w:w="4224"/>
+            <w:tcBorders>
+              <w:top w:val="single" w:sz="4" w:color="D5DDE1"/>
+              <w:left w:val="single" w:sz="4" w:color="D5DDE1"/>
+              <w:bottom w:val="single" w:sz="4" w:color="D5DDE1"/>
+              <w:right w:val="single" w:sz="4" w:color="D5DDE1"/>
+            </w:tcBorders>
+          </w:tcPr>
+          <w:p>
+            <w:pPr>
+              <w:keepNext/>
+              <w:spacing w:after="0"/>
+            </w:pPr>
+            <w:r>
+              <w:rPr>
+                <w:rFonts w:ascii="Consolas" w:hAnsi="Consolas" w:cs="Consolas" w:eastAsia="Consolas"/>
+                <w:color w:val="0B376C"/>
+                <w:sz w:val="17"/>
+              </w:rPr>
+              <w:t>Results_Pack_QN.pdf</w:t>
+            </w:r>
+            <w:r>
+              <w:rPr>
+                <w:sz w:val="17"/>
+              </w:rPr>
+              <w:t xml:space="preserve"> (N = your question)</w:t>
             </w:r>
           </w:p>
         </w:tc>
         <w:tc>
           <w:tcPr>
-            <w:tcW w:type="dxa" w:w="4113"/>
+            <w:tcW w:type="dxa" w:w="5187"/>
+            <w:tcBorders>
+              <w:top w:val="single" w:sz="4" w:color="D5DDE1"/>
+              <w:left w:val="single" w:sz="4" w:color="D5DDE1"/>
+              <w:bottom w:val="single" w:sz="4" w:color="D5DDE1"/>
+              <w:right w:val="single" w:sz="4" w:color="D5DDE1"/>
+            </w:tcBorders>
+          </w:tcPr>
+          <w:p>
+            <w:pPr>
+              <w:keepNext/>
+              <w:spacing w:after="0"/>
+            </w:pPr>
+            <w:r>
+              <w:rPr>
+                <w:sz w:val="17"/>
+              </w:rPr>
+              <w:t>All the numbers: participant flow, Table 1, results tables, figures, plain-language notes</w:t>
+            </w:r>
+          </w:p>
+        </w:tc>
+      </w:tr>
+      <w:tr>
+        <w:trPr>
+          <w:cantSplit w:val="true"/>
+        </w:trPr>
+        <w:tc>
+          <w:tcPr>
+            <w:tcW w:type="dxa" w:w="4224"/>
+            <w:tcBorders>
+              <w:top w:val="single" w:sz="4" w:color="D5DDE1"/>
+              <w:left w:val="single" w:sz="4" w:color="D5DDE1"/>
+              <w:bottom w:val="single" w:sz="4" w:color="D5DDE1"/>
+              <w:right w:val="single" w:sz="4" w:color="D5DDE1"/>
+            </w:tcBorders>
+            <w:shd w:val="clear" w:color="auto" w:fill="F5F9FA"/>
+          </w:tcPr>
+          <w:p>
+            <w:pPr>
+              <w:keepNext/>
+              <w:spacing w:after="0"/>
+            </w:pPr>
+            <w:r>
+              <w:rPr>
+                <w:rFonts w:ascii="Consolas" w:hAnsi="Consolas" w:cs="Consolas" w:eastAsia="Consolas"/>
+                <w:color w:val="0B376C"/>
+                <w:sz w:val="17"/>
+              </w:rPr>
+              <w:t>Manuscript_Template_IMRaD.docx</w:t>
+            </w:r>
+          </w:p>
+        </w:tc>
+        <w:tc>
+          <w:tcPr>
+            <w:tcW w:type="dxa" w:w="5187"/>
+            <w:tcBorders>
+              <w:top w:val="single" w:sz="4" w:color="D5DDE1"/>
+              <w:left w:val="single" w:sz="4" w:color="D5DDE1"/>
+              <w:bottom w:val="single" w:sz="4" w:color="D5DDE1"/>
+              <w:right w:val="single" w:sz="4" w:color="D5DDE1"/>
+            </w:tcBorders>
+            <w:shd w:val="clear" w:color="auto" w:fill="F5F9FA"/>
+          </w:tcPr>
+          <w:p>
+            <w:pPr>
+              <w:keepNext/>
+              <w:spacing w:after="0"/>
+            </w:pPr>
+            <w:r>
+              <w:rPr>
+                <w:sz w:val="17"/>
+              </w:rPr>
+              <w:t>Write in this template. The Results section is marked as required</w:t>
+            </w:r>
+          </w:p>
+        </w:tc>
+      </w:tr>
+      <w:tr>
+        <w:trPr>
+          <w:cantSplit w:val="true"/>
+        </w:trPr>
+        <w:tc>
+          <w:tcPr>
+            <w:tcW w:type="dxa" w:w="4224"/>
+            <w:tcBorders>
+              <w:top w:val="single" w:sz="4" w:color="D5DDE1"/>
+              <w:left w:val="single" w:sz="4" w:color="D5DDE1"/>
+              <w:bottom w:val="single" w:sz="4" w:color="D5DDE1"/>
+              <w:right w:val="single" w:sz="4" w:color="D5DDE1"/>
+            </w:tcBorders>
+          </w:tcPr>
+          <w:p>
+            <w:pPr>
+              <w:keepNext/>
+              <w:spacing w:after="0"/>
+            </w:pPr>
+            <w:r>
+              <w:rPr>
+                <w:rFonts w:ascii="Consolas" w:hAnsi="Consolas" w:cs="Consolas" w:eastAsia="Consolas"/>
+                <w:color w:val="0B376C"/>
+                <w:sz w:val="17"/>
+              </w:rPr>
+              <w:t>SAP_FLUID-ICU.pdf</w:t>
+            </w:r>
+            <w:r>
+              <w:rPr>
+                <w:sz w:val="17"/>
+              </w:rPr>
+              <w:t xml:space="preserve"> and </w:t>
+            </w:r>
+            <w:r>
+              <w:rPr>
+                <w:rFonts w:ascii="Consolas" w:hAnsi="Consolas" w:cs="Consolas" w:eastAsia="Consolas"/>
+                <w:color w:val="0B376C"/>
+                <w:sz w:val="17"/>
+              </w:rPr>
+              <w:t>Data_Dictionary.pdf</w:t>
+            </w:r>
+          </w:p>
+        </w:tc>
+        <w:tc>
+          <w:tcPr>
+            <w:tcW w:type="dxa" w:w="5187"/>
+            <w:tcBorders>
+              <w:top w:val="single" w:sz="4" w:color="D5DDE1"/>
+              <w:left w:val="single" w:sz="4" w:color="D5DDE1"/>
+              <w:bottom w:val="single" w:sz="4" w:color="D5DDE1"/>
+              <w:right w:val="single" w:sz="4" w:color="D5DDE1"/>
+            </w:tcBorders>
+          </w:tcPr>
+          <w:p>
+            <w:pPr>
+              <w:keepNext/>
+              <w:spacing w:after="0"/>
+            </w:pPr>
+            <w:r>
+              <w:rPr>
+                <w:sz w:val="17"/>
+              </w:rPr>
+              <w:t>Definitions and analysis methods, for the optional Methods</w:t>
+            </w:r>
+          </w:p>
+        </w:tc>
+      </w:tr>
+      <w:tr>
+        <w:trPr>
+          <w:cantSplit w:val="true"/>
+        </w:trPr>
+        <w:tc>
+          <w:tcPr>
+            <w:tcW w:type="dxa" w:w="4224"/>
+            <w:tcBorders>
+              <w:top w:val="single" w:sz="4" w:color="D5DDE1"/>
+              <w:left w:val="single" w:sz="4" w:color="D5DDE1"/>
+              <w:bottom w:val="single" w:sz="4" w:color="D5DDE1"/>
+              <w:right w:val="single" w:sz="4" w:color="D5DDE1"/>
+            </w:tcBorders>
+            <w:shd w:val="clear" w:color="auto" w:fill="F5F9FA"/>
+          </w:tcPr>
+          <w:p>
+            <w:pPr>
+              <w:spacing w:after="0"/>
+            </w:pPr>
+            <w:r>
+              <w:rPr>
+                <w:rFonts w:ascii="Consolas" w:hAnsi="Consolas" w:cs="Consolas" w:eastAsia="Consolas"/>
+                <w:color w:val="0B376C"/>
+                <w:sz w:val="17"/>
+              </w:rPr>
+              <w:t>Response_to_Reviewers_Template.docx</w:t>
+            </w:r>
+          </w:p>
+        </w:tc>
+        <w:tc>
+          <w:tcPr>
+            <w:tcW w:type="dxa" w:w="5187"/>
+            <w:tcBorders>
+              <w:top w:val="single" w:sz="4" w:color="D5DDE1"/>
+              <w:left w:val="single" w:sz="4" w:color="D5DDE1"/>
+              <w:bottom w:val="single" w:sz="4" w:color="D5DDE1"/>
+              <w:right w:val="single" w:sz="4" w:color="D5DDE1"/>
+            </w:tcBorders>
+            <w:shd w:val="clear" w:color="auto" w:fill="F5F9FA"/>
+          </w:tcPr>
+          <w:p>
+            <w:pPr>
+              <w:spacing w:after="0"/>
+            </w:pPr>
+            <w:r>
+              <w:rPr>
+                <w:sz w:val="17"/>
+              </w:rPr>
+              <w:t>For your reply to your reviewer</w:t>
+            </w:r>
+          </w:p>
+        </w:tc>
+      </w:tr>
+    </w:tbl>
+    <w:p>
+      <w:pPr>
+        <w:spacing w:after="80"/>
+      </w:pPr>
+    </w:p>
+    <w:p>
+      <w:r>
+        <w:t>Use only the numbers in your results pack. If something is missing, ask the instructor.</w:t>
+      </w:r>
+    </w:p>
+    <w:p>
+      <w:pPr>
+        <w:pStyle w:val="Heading1"/>
+      </w:pPr>
+      <w:r>
+        <w:t>4. What you write</w:t>
+      </w:r>
+    </w:p>
+    <w:p>
+      <w:pPr>
+        <w:pStyle w:val="Heading2"/>
+      </w:pPr>
+      <w:r>
+        <w:t>Required</w:t>
+      </w:r>
+    </w:p>
+    <w:tbl>
+      <w:tblPr>
+        <w:tblW w:type="auto" w:w="0"/>
+        <w:jc w:val="center"/>
+        <w:tblLayout w:type="fixed"/>
+        <w:tblCellMar>
+          <w:top w:w="80" w:type="dxa"/>
+          <w:left w:w="110" w:type="dxa"/>
+          <w:bottom w:w="80" w:type="dxa"/>
+          <w:right w:w="110" w:type="dxa"/>
+        </w:tblCellMar>
+        <w:tblLook w:firstColumn="1" w:firstRow="1" w:lastColumn="0" w:lastRow="0" w:noHBand="0" w:noVBand="1" w:val="04A0"/>
+      </w:tblPr>
+      <w:tblGrid>
+        <w:gridCol w:w="1389"/>
+        <w:gridCol w:w="8023"/>
+      </w:tblGrid>
+      <w:tr>
+        <w:trPr>
+          <w:cantSplit w:val="true"/>
+          <w:tblHeader w:val="true"/>
+        </w:trPr>
+        <w:tc>
+          <w:tcPr>
+            <w:tcW w:type="dxa" w:w="1389"/>
             <w:tcBorders>
               <w:top w:val="single" w:sz="4" w:color="04242F"/>
               <w:left w:val="single" w:sz="4" w:color="04242F"/>
@@ -1222,13 +1052,13 @@
                 <w:color w:val="FFFFFF"/>
                 <w:sz w:val="18"/>
               </w:rPr>
-              <w:t>What you do</w:t>
+              <w:t>Part</w:t>
             </w:r>
           </w:p>
         </w:tc>
         <w:tc>
           <w:tcPr>
-            <w:tcW w:type="dxa" w:w="2029"/>
+            <w:tcW w:type="dxa" w:w="8022"/>
             <w:tcBorders>
               <w:top w:val="single" w:sz="4" w:color="04242F"/>
               <w:left w:val="single" w:sz="4" w:color="04242F"/>
@@ -1248,7 +1078,7 @@
                 <w:color w:val="FFFFFF"/>
                 <w:sz w:val="18"/>
               </w:rPr>
-              <w:t>Output</w:t>
+              <w:t>What we expect</w:t>
             </w:r>
           </w:p>
         </w:tc>
@@ -1259,7 +1089,7 @@
         </w:trPr>
         <w:tc>
           <w:tcPr>
-            <w:tcW w:type="dxa" w:w="1729"/>
+            <w:tcW w:type="dxa" w:w="1389"/>
             <w:tcBorders>
               <w:top w:val="single" w:sz="4" w:color="D5DDE1"/>
               <w:left w:val="single" w:sz="4" w:color="D5DDE1"/>
@@ -1276,43 +1106,13 @@
               <w:rPr>
                 <w:sz w:val="17"/>
               </w:rPr>
-              <w:t>1. Understand the data</w:t>
+              <w:t>Working title</w:t>
             </w:r>
           </w:p>
         </w:tc>
         <w:tc>
           <w:tcPr>
-            <w:tcW w:type="dxa" w:w="1539"/>
-            <w:tcBorders>
-              <w:top w:val="single" w:sz="4" w:color="D5DDE1"/>
-              <w:left w:val="single" w:sz="4" w:color="D5DDE1"/>
-              <w:bottom w:val="single" w:sz="4" w:color="D5DDE1"/>
-              <w:right w:val="single" w:sz="4" w:color="D5DDE1"/>
-            </w:tcBorders>
-          </w:tcPr>
-          <w:p>
-            <w:pPr>
-              <w:keepNext/>
-              <w:spacing w:after="0"/>
-            </w:pPr>
-            <w:r>
-              <w:rPr>
-                <w:b/>
-                <w:sz w:val="17"/>
-              </w:rPr>
-              <w:t>Session 5</w:t>
-            </w:r>
-            <w:r>
-              <w:rPr>
-                <w:sz w:val="17"/>
-              </w:rPr>
-              <w:t xml:space="preserve"> (5.2, 5.4)</w:t>
-            </w:r>
-          </w:p>
-        </w:tc>
-        <w:tc>
-          <w:tcPr>
-            <w:tcW w:type="dxa" w:w="4113"/>
+            <w:tcW w:type="dxa" w:w="8022"/>
             <w:tcBorders>
               <w:top w:val="single" w:sz="4" w:color="D5DDE1"/>
               <w:left w:val="single" w:sz="4" w:color="D5DDE1"/>
@@ -1329,30 +1129,7 @@
               <w:rPr>
                 <w:sz w:val="17"/>
               </w:rPr>
-              <w:t>With the class: read the data dictionary, the cleaning log, and Table 1 and the figures of the Q1 results pack</w:t>
-            </w:r>
-          </w:p>
-        </w:tc>
-        <w:tc>
-          <w:tcPr>
-            <w:tcW w:type="dxa" w:w="2029"/>
-            <w:tcBorders>
-              <w:top w:val="single" w:sz="4" w:color="D5DDE1"/>
-              <w:left w:val="single" w:sz="4" w:color="D5DDE1"/>
-              <w:bottom w:val="single" w:sz="4" w:color="D5DDE1"/>
-              <w:right w:val="single" w:sz="4" w:color="D5DDE1"/>
-            </w:tcBorders>
-          </w:tcPr>
-          <w:p>
-            <w:pPr>
-              <w:keepNext/>
-              <w:spacing w:after="0"/>
-            </w:pPr>
-            <w:r>
-              <w:rPr>
-                <w:sz w:val="17"/>
-              </w:rPr>
-              <w:t>Notes: who is in the cohort, how variables are defined, what was cleaned</w:t>
+              <w:t>One line naming the population, exposure, outcome and design, e.g. "Positive fluid balance by day 3 and 28-day mortality in sepsis: a multicentre cohort study"</w:t>
             </w:r>
           </w:p>
         </w:tc>
@@ -1363,7 +1140,7 @@
         </w:trPr>
         <w:tc>
           <w:tcPr>
-            <w:tcW w:type="dxa" w:w="1729"/>
+            <w:tcW w:type="dxa" w:w="1389"/>
             <w:tcBorders>
               <w:top w:val="single" w:sz="4" w:color="D5DDE1"/>
               <w:left w:val="single" w:sz="4" w:color="D5DDE1"/>
@@ -1381,44 +1158,13 @@
               <w:rPr>
                 <w:sz w:val="17"/>
               </w:rPr>
-              <w:t>2. Interpret the results and choose your question</w:t>
+              <w:t>Results text</w:t>
             </w:r>
           </w:p>
         </w:tc>
         <w:tc>
           <w:tcPr>
-            <w:tcW w:type="dxa" w:w="1539"/>
-            <w:tcBorders>
-              <w:top w:val="single" w:sz="4" w:color="D5DDE1"/>
-              <w:left w:val="single" w:sz="4" w:color="D5DDE1"/>
-              <w:bottom w:val="single" w:sz="4" w:color="D5DDE1"/>
-              <w:right w:val="single" w:sz="4" w:color="D5DDE1"/>
-            </w:tcBorders>
-            <w:shd w:val="clear" w:color="auto" w:fill="F5F9FA"/>
-          </w:tcPr>
-          <w:p>
-            <w:pPr>
-              <w:keepNext/>
-              <w:spacing w:after="0"/>
-            </w:pPr>
-            <w:r>
-              <w:rPr>
-                <w:b/>
-                <w:sz w:val="17"/>
-              </w:rPr>
-              <w:t>Session 6</w:t>
-            </w:r>
-            <w:r>
-              <w:rPr>
-                <w:sz w:val="17"/>
-              </w:rPr>
-              <w:t xml:space="preserve"> (6.2, 6.4), then homework</w:t>
-            </w:r>
-          </w:p>
-        </w:tc>
-        <w:tc>
-          <w:tcPr>
-            <w:tcW w:type="dxa" w:w="4113"/>
+            <w:tcW w:type="dxa" w:w="8022"/>
             <w:tcBorders>
               <w:top w:val="single" w:sz="4" w:color="D5DDE1"/>
               <w:left w:val="single" w:sz="4" w:color="D5DDE1"/>
@@ -1436,13 +1182,69 @@
               <w:rPr>
                 <w:sz w:val="17"/>
               </w:rPr>
-              <w:t>With the class: read the comparisons, the regression and Kaplan-Meier/Cox outputs, crude vs adjusted estimates and the missing-data sensitivity analysis. After the session: choose your question and read its results pack</w:t>
+              <w:t>STROBE items 13 to 17, in this order: (1) participants and flow, (2) baseline characteristics (Table 1) and missing data, (3) outcome numbers per group, (4) the main result, crude and adjusted, with 95% CI, (5) other analyses in your pack (sensitivity, imputation or subgroup). About 400 to 600 words</w:t>
+            </w:r>
+          </w:p>
+        </w:tc>
+      </w:tr>
+      <w:tr>
+        <w:trPr>
+          <w:cantSplit w:val="true"/>
+        </w:trPr>
+        <w:tc>
+          <w:tcPr>
+            <w:tcW w:type="dxa" w:w="1389"/>
+            <w:tcBorders>
+              <w:top w:val="single" w:sz="4" w:color="D5DDE1"/>
+              <w:left w:val="single" w:sz="4" w:color="D5DDE1"/>
+              <w:bottom w:val="single" w:sz="4" w:color="D5DDE1"/>
+              <w:right w:val="single" w:sz="4" w:color="D5DDE1"/>
+            </w:tcBorders>
+          </w:tcPr>
+          <w:p>
+            <w:pPr>
+              <w:keepNext/>
+              <w:spacing w:after="0"/>
+            </w:pPr>
+            <w:r>
+              <w:rPr>
+                <w:sz w:val="17"/>
+              </w:rPr>
+              <w:t>Table 1</w:t>
             </w:r>
           </w:p>
         </w:tc>
         <w:tc>
           <w:tcPr>
-            <w:tcW w:type="dxa" w:w="2029"/>
+            <w:tcW w:type="dxa" w:w="8022"/>
+            <w:tcBorders>
+              <w:top w:val="single" w:sz="4" w:color="D5DDE1"/>
+              <w:left w:val="single" w:sz="4" w:color="D5DDE1"/>
+              <w:bottom w:val="single" w:sz="4" w:color="D5DDE1"/>
+              <w:right w:val="single" w:sz="4" w:color="D5DDE1"/>
+            </w:tcBorders>
+          </w:tcPr>
+          <w:p>
+            <w:pPr>
+              <w:keepNext/>
+              <w:spacing w:after="0"/>
+            </w:pPr>
+            <w:r>
+              <w:rPr>
+                <w:sz w:val="17"/>
+              </w:rPr>
+              <w:t>Baseline characteristics by exposure group, from your results pack</w:t>
+            </w:r>
+          </w:p>
+        </w:tc>
+      </w:tr>
+      <w:tr>
+        <w:trPr>
+          <w:cantSplit w:val="true"/>
+        </w:trPr>
+        <w:tc>
+          <w:tcPr>
+            <w:tcW w:type="dxa" w:w="1389"/>
             <w:tcBorders>
               <w:top w:val="single" w:sz="4" w:color="D5DDE1"/>
               <w:left w:val="single" w:sz="4" w:color="D5DDE1"/>
@@ -1460,122 +1262,13 @@
               <w:rPr>
                 <w:sz w:val="17"/>
               </w:rPr>
-              <w:t>A "key numbers" list for your question: the main effect with 95% CI, plus 3 to 5 supporting results</w:t>
-            </w:r>
-          </w:p>
-        </w:tc>
-      </w:tr>
-      <w:tr>
-        <w:trPr>
-          <w:cantSplit w:val="true"/>
-        </w:trPr>
-        <w:tc>
-          <w:tcPr>
-            <w:tcW w:type="dxa" w:w="1729"/>
-            <w:tcBorders>
-              <w:top w:val="single" w:sz="4" w:color="D5DDE1"/>
-              <w:left w:val="single" w:sz="4" w:color="D5DDE1"/>
-              <w:bottom w:val="single" w:sz="4" w:color="D5DDE1"/>
-              <w:right w:val="single" w:sz="4" w:color="D5DDE1"/>
-            </w:tcBorders>
-          </w:tcPr>
-          <w:p>
-            <w:pPr>
-              <w:keepNext/>
-              <w:spacing w:after="0"/>
-            </w:pPr>
-            <w:r>
-              <w:rPr>
-                <w:sz w:val="17"/>
-              </w:rPr>
-              <w:t>3. Methods + Results</w:t>
+              <w:t>Main results table or figure</w:t>
             </w:r>
           </w:p>
         </w:tc>
         <w:tc>
           <w:tcPr>
-            <w:tcW w:type="dxa" w:w="1539"/>
-            <w:tcBorders>
-              <w:top w:val="single" w:sz="4" w:color="D5DDE1"/>
-              <w:left w:val="single" w:sz="4" w:color="D5DDE1"/>
-              <w:bottom w:val="single" w:sz="4" w:color="D5DDE1"/>
-              <w:right w:val="single" w:sz="4" w:color="D5DDE1"/>
-            </w:tcBorders>
-          </w:tcPr>
-          <w:p>
-            <w:pPr>
-              <w:keepNext/>
-              <w:spacing w:after="0"/>
-            </w:pPr>
-            <w:r>
-              <w:rPr>
-                <w:b/>
-                <w:sz w:val="17"/>
-              </w:rPr>
-              <w:t>Session 7</w:t>
-            </w:r>
-            <w:r>
-              <w:rPr>
-                <w:sz w:val="17"/>
-              </w:rPr>
-              <w:t xml:space="preserve"> (manuscript workshop 1: the instructor drafts Q1 live with the class), then homework</w:t>
-            </w:r>
-          </w:p>
-        </w:tc>
-        <w:tc>
-          <w:tcPr>
-            <w:tcW w:type="dxa" w:w="4113"/>
-            <w:tcBorders>
-              <w:top w:val="single" w:sz="4" w:color="D5DDE1"/>
-              <w:left w:val="single" w:sz="4" w:color="D5DDE1"/>
-              <w:bottom w:val="single" w:sz="4" w:color="D5DDE1"/>
-              <w:right w:val="single" w:sz="4" w:color="D5DDE1"/>
-            </w:tcBorders>
-          </w:tcPr>
-          <w:p>
-            <w:pPr>
-              <w:keepNext/>
-              <w:spacing w:after="0"/>
-            </w:pPr>
-            <w:r>
-              <w:rPr>
-                <w:sz w:val="17"/>
-              </w:rPr>
-              <w:t>Draft the Methods (design, setting, participants, variables, data sources, bias, statistical methods incl. missing data) and the Results (participants first, then descriptive, main and other analyses) for your question</w:t>
-            </w:r>
-          </w:p>
-        </w:tc>
-        <w:tc>
-          <w:tcPr>
-            <w:tcW w:type="dxa" w:w="2029"/>
-            <w:tcBorders>
-              <w:top w:val="single" w:sz="4" w:color="D5DDE1"/>
-              <w:left w:val="single" w:sz="4" w:color="D5DDE1"/>
-              <w:bottom w:val="single" w:sz="4" w:color="D5DDE1"/>
-              <w:right w:val="single" w:sz="4" w:color="D5DDE1"/>
-            </w:tcBorders>
-          </w:tcPr>
-          <w:p>
-            <w:pPr>
-              <w:keepNext/>
-              <w:spacing w:after="0"/>
-            </w:pPr>
-            <w:r>
-              <w:rPr>
-                <w:sz w:val="17"/>
-              </w:rPr>
-              <w:t>First draft of about 600 words (final length: Methods about 550, Results about 450; see the table below) + Table 1 + one further table or figure</w:t>
-            </w:r>
-          </w:p>
-        </w:tc>
-      </w:tr>
-      <w:tr>
-        <w:trPr>
-          <w:cantSplit w:val="true"/>
-        </w:trPr>
-        <w:tc>
-          <w:tcPr>
-            <w:tcW w:type="dxa" w:w="1729"/>
+            <w:tcW w:type="dxa" w:w="8022"/>
             <w:tcBorders>
               <w:top w:val="single" w:sz="4" w:color="D5DDE1"/>
               <w:left w:val="single" w:sz="4" w:color="D5DDE1"/>
@@ -1593,87 +1286,7 @@
               <w:rPr>
                 <w:sz w:val="17"/>
               </w:rPr>
-              <w:t>4. Introduction, Discussion, Abstract, Title</w:t>
-            </w:r>
-          </w:p>
-        </w:tc>
-        <w:tc>
-          <w:tcPr>
-            <w:tcW w:type="dxa" w:w="1539"/>
-            <w:tcBorders>
-              <w:top w:val="single" w:sz="4" w:color="D5DDE1"/>
-              <w:left w:val="single" w:sz="4" w:color="D5DDE1"/>
-              <w:bottom w:val="single" w:sz="4" w:color="D5DDE1"/>
-              <w:right w:val="single" w:sz="4" w:color="D5DDE1"/>
-            </w:tcBorders>
-            <w:shd w:val="clear" w:color="auto" w:fill="F5F9FA"/>
-          </w:tcPr>
-          <w:p>
-            <w:pPr>
-              <w:keepNext/>
-              <w:spacing w:after="0"/>
-            </w:pPr>
-            <w:r>
-              <w:rPr>
-                <w:b/>
-                <w:sz w:val="17"/>
-              </w:rPr>
-              <w:t>Session 8</w:t>
-            </w:r>
-            <w:r>
-              <w:rPr>
-                <w:sz w:val="17"/>
-              </w:rPr>
-              <w:t xml:space="preserve"> (manuscript workshop 2: modelled live on Q1), then homework</w:t>
-            </w:r>
-          </w:p>
-        </w:tc>
-        <w:tc>
-          <w:tcPr>
-            <w:tcW w:type="dxa" w:w="4113"/>
-            <w:tcBorders>
-              <w:top w:val="single" w:sz="4" w:color="D5DDE1"/>
-              <w:left w:val="single" w:sz="4" w:color="D5DDE1"/>
-              <w:bottom w:val="single" w:sz="4" w:color="D5DDE1"/>
-              <w:right w:val="single" w:sz="4" w:color="D5DDE1"/>
-            </w:tcBorders>
-            <w:shd w:val="clear" w:color="auto" w:fill="F5F9FA"/>
-          </w:tcPr>
-          <w:p>
-            <w:pPr>
-              <w:keepNext/>
-              <w:spacing w:after="0"/>
-            </w:pPr>
-            <w:r>
-              <w:rPr>
-                <w:sz w:val="17"/>
-              </w:rPr>
-              <w:t>Write the Introduction (funnel), the Discussion (six moves, calibrated language), the structured abstract and the title</w:t>
-            </w:r>
-          </w:p>
-        </w:tc>
-        <w:tc>
-          <w:tcPr>
-            <w:tcW w:type="dxa" w:w="2029"/>
-            <w:tcBorders>
-              <w:top w:val="single" w:sz="4" w:color="D5DDE1"/>
-              <w:left w:val="single" w:sz="4" w:color="D5DDE1"/>
-              <w:bottom w:val="single" w:sz="4" w:color="D5DDE1"/>
-              <w:right w:val="single" w:sz="4" w:color="D5DDE1"/>
-            </w:tcBorders>
-            <w:shd w:val="clear" w:color="auto" w:fill="F5F9FA"/>
-          </w:tcPr>
-          <w:p>
-            <w:pPr>
-              <w:keepNext/>
-              <w:spacing w:after="0"/>
-            </w:pPr>
-            <w:r>
-              <w:rPr>
-                <w:b/>
-                <w:sz w:val="17"/>
-              </w:rPr>
-              <w:t>Complete draft</w:t>
+              <w:t>e.g. crude and adjusted estimates, or the Kaplan-Meier curve (Q1)</w:t>
             </w:r>
           </w:p>
         </w:tc>
@@ -1684,221 +1297,7 @@
         </w:trPr>
         <w:tc>
           <w:tcPr>
-            <w:tcW w:type="dxa" w:w="1729"/>
-            <w:tcBorders>
-              <w:top w:val="single" w:sz="4" w:color="D5DDE1"/>
-              <w:left w:val="single" w:sz="4" w:color="D5DDE1"/>
-              <w:bottom w:val="single" w:sz="4" w:color="D5DDE1"/>
-              <w:right w:val="single" w:sz="4" w:color="D5DDE1"/>
-            </w:tcBorders>
-          </w:tcPr>
-          <w:p>
-            <w:pPr>
-              <w:keepNext/>
-              <w:spacing w:after="0"/>
-            </w:pPr>
-            <w:r>
-              <w:rPr>
-                <w:sz w:val="17"/>
-              </w:rPr>
-              <w:t>5. Final tidy and submission</w:t>
-            </w:r>
-          </w:p>
-        </w:tc>
-        <w:tc>
-          <w:tcPr>
-            <w:tcW w:type="dxa" w:w="1539"/>
-            <w:tcBorders>
-              <w:top w:val="single" w:sz="4" w:color="D5DDE1"/>
-              <w:left w:val="single" w:sz="4" w:color="D5DDE1"/>
-              <w:bottom w:val="single" w:sz="4" w:color="D5DDE1"/>
-              <w:right w:val="single" w:sz="4" w:color="D5DDE1"/>
-            </w:tcBorders>
-          </w:tcPr>
-          <w:p>
-            <w:pPr>
-              <w:keepNext/>
-              <w:spacing w:after="0"/>
-            </w:pPr>
-            <w:r>
-              <w:rPr>
-                <w:b/>
-                <w:sz w:val="17"/>
-              </w:rPr>
-              <w:t>By 23:59 on the day of Session 8</w:t>
-            </w:r>
-          </w:p>
-        </w:tc>
-        <w:tc>
-          <w:tcPr>
-            <w:tcW w:type="dxa" w:w="4113"/>
-            <w:tcBorders>
-              <w:top w:val="single" w:sz="4" w:color="D5DDE1"/>
-              <w:left w:val="single" w:sz="4" w:color="D5DDE1"/>
-              <w:bottom w:val="single" w:sz="4" w:color="D5DDE1"/>
-              <w:right w:val="single" w:sz="4" w:color="D5DDE1"/>
-            </w:tcBorders>
-          </w:tcPr>
-          <w:p>
-            <w:pPr>
-              <w:keepNext/>
-              <w:spacing w:after="0"/>
-            </w:pPr>
-            <w:r>
-              <w:rPr>
-                <w:sz w:val="17"/>
-              </w:rPr>
-              <w:t>Fill the STROBE checklist with page numbers, check the numbers, add the AI-use statement, submit</w:t>
-            </w:r>
-          </w:p>
-        </w:tc>
-        <w:tc>
-          <w:tcPr>
-            <w:tcW w:type="dxa" w:w="2029"/>
-            <w:tcBorders>
-              <w:top w:val="single" w:sz="4" w:color="D5DDE1"/>
-              <w:left w:val="single" w:sz="4" w:color="D5DDE1"/>
-              <w:bottom w:val="single" w:sz="4" w:color="D5DDE1"/>
-              <w:right w:val="single" w:sz="4" w:color="D5DDE1"/>
-            </w:tcBorders>
-          </w:tcPr>
-          <w:p>
-            <w:pPr>
-              <w:keepNext/>
-              <w:spacing w:after="0"/>
-            </w:pPr>
-            <w:r>
-              <w:rPr>
-                <w:sz w:val="17"/>
-              </w:rPr>
-              <w:t>Draft manuscript</w:t>
-            </w:r>
-          </w:p>
-        </w:tc>
-      </w:tr>
-      <w:tr>
-        <w:trPr>
-          <w:cantSplit w:val="true"/>
-        </w:trPr>
-        <w:tc>
-          <w:tcPr>
-            <w:tcW w:type="dxa" w:w="1729"/>
-            <w:tcBorders>
-              <w:top w:val="single" w:sz="4" w:color="D5DDE1"/>
-              <w:left w:val="single" w:sz="4" w:color="D5DDE1"/>
-              <w:bottom w:val="single" w:sz="4" w:color="D5DDE1"/>
-              <w:right w:val="single" w:sz="4" w:color="D5DDE1"/>
-            </w:tcBorders>
-            <w:shd w:val="clear" w:color="auto" w:fill="F5F9FA"/>
-          </w:tcPr>
-          <w:p>
-            <w:pPr>
-              <w:keepNext/>
-              <w:spacing w:after="0"/>
-            </w:pPr>
-            <w:r>
-              <w:rPr>
-                <w:sz w:val="17"/>
-              </w:rPr>
-              <w:t>6. Peer review</w:t>
-            </w:r>
-          </w:p>
-        </w:tc>
-        <w:tc>
-          <w:tcPr>
-            <w:tcW w:type="dxa" w:w="1539"/>
-            <w:tcBorders>
-              <w:top w:val="single" w:sz="4" w:color="D5DDE1"/>
-              <w:left w:val="single" w:sz="4" w:color="D5DDE1"/>
-              <w:bottom w:val="single" w:sz="4" w:color="D5DDE1"/>
-              <w:right w:val="single" w:sz="4" w:color="D5DDE1"/>
-            </w:tcBorders>
-            <w:shd w:val="clear" w:color="auto" w:fill="F5F9FA"/>
-          </w:tcPr>
-          <w:p>
-            <w:pPr>
-              <w:keepNext/>
-              <w:spacing w:after="0"/>
-            </w:pPr>
-            <w:r>
-              <w:rPr>
-                <w:b/>
-                <w:sz w:val="17"/>
-              </w:rPr>
-              <w:t>Within 1 week after Session 8</w:t>
-            </w:r>
-          </w:p>
-        </w:tc>
-        <w:tc>
-          <w:tcPr>
-            <w:tcW w:type="dxa" w:w="4113"/>
-            <w:tcBorders>
-              <w:top w:val="single" w:sz="4" w:color="D5DDE1"/>
-              <w:left w:val="single" w:sz="4" w:color="D5DDE1"/>
-              <w:bottom w:val="single" w:sz="4" w:color="D5DDE1"/>
-              <w:right w:val="single" w:sz="4" w:color="D5DDE1"/>
-            </w:tcBorders>
-            <w:shd w:val="clear" w:color="auto" w:fill="F5F9FA"/>
-          </w:tcPr>
-          <w:p>
-            <w:pPr>
-              <w:keepNext/>
-              <w:spacing w:after="0"/>
-            </w:pPr>
-            <w:r>
-              <w:rPr>
-                <w:sz w:val="17"/>
-              </w:rPr>
-              <w:t>Review the one classmate's draft the instructor sends you (</w:t>
-            </w:r>
-            <w:r>
-              <w:rPr>
-                <w:rFonts w:ascii="Consolas" w:hAnsi="Consolas" w:cs="Consolas" w:eastAsia="Consolas"/>
-                <w:color w:val="0B376C"/>
-                <w:sz w:val="17"/>
-              </w:rPr>
-              <w:t>Peer_Review_Instructions.pdf</w:t>
-            </w:r>
-            <w:r>
-              <w:rPr>
-                <w:sz w:val="17"/>
-              </w:rPr>
-              <w:t>)</w:t>
-            </w:r>
-          </w:p>
-        </w:tc>
-        <w:tc>
-          <w:tcPr>
-            <w:tcW w:type="dxa" w:w="2029"/>
-            <w:tcBorders>
-              <w:top w:val="single" w:sz="4" w:color="D5DDE1"/>
-              <w:left w:val="single" w:sz="4" w:color="D5DDE1"/>
-              <w:bottom w:val="single" w:sz="4" w:color="D5DDE1"/>
-              <w:right w:val="single" w:sz="4" w:color="D5DDE1"/>
-            </w:tcBorders>
-            <w:shd w:val="clear" w:color="auto" w:fill="F5F9FA"/>
-          </w:tcPr>
-          <w:p>
-            <w:pPr>
-              <w:keepNext/>
-              <w:spacing w:after="0"/>
-            </w:pPr>
-            <w:r>
-              <w:rPr>
-                <w:sz w:val="17"/>
-              </w:rPr>
-              <w:t>Review report</w:t>
-            </w:r>
-          </w:p>
-        </w:tc>
-      </w:tr>
-      <w:tr>
-        <w:trPr>
-          <w:cantSplit w:val="true"/>
-        </w:trPr>
-        <w:tc>
-          <w:tcPr>
-            <w:tcW w:type="dxa" w:w="1729"/>
+            <w:tcW w:type="dxa" w:w="1389"/>
             <w:tcBorders>
               <w:top w:val="single" w:sz="4" w:color="D5DDE1"/>
               <w:left w:val="single" w:sz="4" w:color="D5DDE1"/>
@@ -1914,36 +1313,13 @@
               <w:rPr>
                 <w:sz w:val="17"/>
               </w:rPr>
-              <w:t>7. Response and revision</w:t>
+              <w:t>Two statements</w:t>
             </w:r>
           </w:p>
         </w:tc>
         <w:tc>
           <w:tcPr>
-            <w:tcW w:type="dxa" w:w="1539"/>
-            <w:tcBorders>
-              <w:top w:val="single" w:sz="4" w:color="D5DDE1"/>
-              <w:left w:val="single" w:sz="4" w:color="D5DDE1"/>
-              <w:bottom w:val="single" w:sz="4" w:color="D5DDE1"/>
-              <w:right w:val="single" w:sz="4" w:color="D5DDE1"/>
-            </w:tcBorders>
-          </w:tcPr>
-          <w:p>
-            <w:pPr>
-              <w:spacing w:after="0"/>
-            </w:pPr>
-            <w:r>
-              <w:rPr>
-                <w:b/>
-                <w:sz w:val="17"/>
-              </w:rPr>
-              <w:t>Within 2 weeks after Session 8</w:t>
-            </w:r>
-          </w:p>
-        </w:tc>
-        <w:tc>
-          <w:tcPr>
-            <w:tcW w:type="dxa" w:w="4113"/>
+            <w:tcW w:type="dxa" w:w="8022"/>
             <w:tcBorders>
               <w:top w:val="single" w:sz="4" w:color="D5DDE1"/>
               <w:left w:val="single" w:sz="4" w:color="D5DDE1"/>
@@ -1959,29 +1335,7 @@
               <w:rPr>
                 <w:sz w:val="17"/>
               </w:rPr>
-              <w:t>Respond point by point to the review you received and revise your draft</w:t>
-            </w:r>
-          </w:p>
-        </w:tc>
-        <w:tc>
-          <w:tcPr>
-            <w:tcW w:type="dxa" w:w="2029"/>
-            <w:tcBorders>
-              <w:top w:val="single" w:sz="4" w:color="D5DDE1"/>
-              <w:left w:val="single" w:sz="4" w:color="D5DDE1"/>
-              <w:bottom w:val="single" w:sz="4" w:color="D5DDE1"/>
-              <w:right w:val="single" w:sz="4" w:color="D5DDE1"/>
-            </w:tcBorders>
-          </w:tcPr>
-          <w:p>
-            <w:pPr>
-              <w:spacing w:after="0"/>
-            </w:pPr>
-            <w:r>
-              <w:rPr>
-                <w:sz w:val="17"/>
-              </w:rPr>
-              <w:t>Response letter + revised manuscript</w:t>
+              <w:t>The simulated-data sentence (section 1) and the AI-use statement (section 6)</w:t>
             </w:r>
           </w:p>
         </w:tc>
@@ -1993,11 +1347,62 @@
       </w:pPr>
     </w:p>
     <w:p>
+      <w:r>
+        <w:rPr>
+          <w:b/>
+        </w:rPr>
+        <w:t>Submission-ready</w:t>
+      </w:r>
+      <w:r>
+        <w:t xml:space="preserve"> means:</w:t>
+      </w:r>
+    </w:p>
+    <w:p>
+      <w:pPr>
+        <w:pStyle w:val="ListBullet"/>
+      </w:pPr>
+      <w:r>
+        <w:t>every number agrees with your results pack</w:t>
+      </w:r>
+    </w:p>
+    <w:p>
+      <w:pPr>
+        <w:pStyle w:val="ListBullet"/>
+      </w:pPr>
+      <w:r>
+        <w:t>percentages have denominators and estimates have 95% CIs</w:t>
+      </w:r>
+    </w:p>
+    <w:p>
+      <w:pPr>
+        <w:pStyle w:val="ListBullet"/>
+      </w:pPr>
+      <w:r>
+        <w:t>each table and figure stands alone (title, units, n, abbreviations explained)</w:t>
+      </w:r>
+    </w:p>
+    <w:p>
+      <w:pPr>
+        <w:pStyle w:val="ListBullet"/>
+      </w:pPr>
+      <w:r>
+        <w:t>no interpretation ("because", "suggests", "significant trend")</w:t>
+      </w:r>
+    </w:p>
+    <w:p>
+      <w:pPr>
+        <w:pStyle w:val="ListBullet"/>
+      </w:pPr>
+      <w:r>
+        <w:t>written in the template, in the past tense</w:t>
+      </w:r>
+    </w:p>
+    <w:p>
       <w:pPr>
         <w:pStyle w:val="Heading2"/>
       </w:pPr>
       <w:r>
-        <w:t>Length and format</w:t>
+        <w:t>Optional (encouraged)</w:t>
       </w:r>
     </w:p>
     <w:tbl>
@@ -2015,8 +1420,7 @@
       </w:tblPr>
       <w:tblGrid>
         <w:gridCol w:w="1615"/>
-        <w:gridCol w:w="1275"/>
-        <w:gridCol w:w="6520"/>
+        <w:gridCol w:w="7796"/>
       </w:tblGrid>
       <w:tr>
         <w:trPr>
@@ -2051,33 +1455,7 @@
         </w:tc>
         <w:tc>
           <w:tcPr>
-            <w:tcW w:type="dxa" w:w="1276"/>
-            <w:tcBorders>
-              <w:top w:val="single" w:sz="4" w:color="04242F"/>
-              <w:left w:val="single" w:sz="4" w:color="04242F"/>
-              <w:bottom w:val="single" w:sz="4" w:color="04242F"/>
-              <w:right w:val="single" w:sz="4" w:color="04242F"/>
-            </w:tcBorders>
-            <w:shd w:val="clear" w:color="auto" w:fill="04242F"/>
-          </w:tcPr>
-          <w:p>
-            <w:pPr>
-              <w:keepNext/>
-              <w:spacing w:after="0"/>
-            </w:pPr>
-            <w:r>
-              <w:rPr>
-                <w:b/>
-                <w:color w:val="FFFFFF"/>
-                <w:sz w:val="18"/>
-              </w:rPr>
-              <w:t>Target</w:t>
-            </w:r>
-          </w:p>
-        </w:tc>
-        <w:tc>
-          <w:tcPr>
-            <w:tcW w:type="dxa" w:w="6520"/>
+            <w:tcW w:type="dxa" w:w="7795"/>
             <w:tcBorders>
               <w:top w:val="single" w:sz="4" w:color="04242F"/>
               <w:left w:val="single" w:sz="4" w:color="04242F"/>
@@ -2125,13 +1503,13 @@
               <w:rPr>
                 <w:sz w:val="17"/>
               </w:rPr>
-              <w:t>Title page</w:t>
+              <w:t>Methods</w:t>
             </w:r>
           </w:p>
         </w:tc>
         <w:tc>
           <w:tcPr>
-            <w:tcW w:type="dxa" w:w="1276"/>
+            <w:tcW w:type="dxa" w:w="7795"/>
             <w:tcBorders>
               <w:top w:val="single" w:sz="4" w:color="D5DDE1"/>
               <w:left w:val="single" w:sz="4" w:color="D5DDE1"/>
@@ -2148,30 +1526,7 @@
               <w:rPr>
                 <w:sz w:val="17"/>
               </w:rPr>
-              <w:t>No target</w:t>
-            </w:r>
-          </w:p>
-        </w:tc>
-        <w:tc>
-          <w:tcPr>
-            <w:tcW w:type="dxa" w:w="6520"/>
-            <w:tcBorders>
-              <w:top w:val="single" w:sz="4" w:color="D5DDE1"/>
-              <w:left w:val="single" w:sz="4" w:color="D5DDE1"/>
-              <w:bottom w:val="single" w:sz="4" w:color="D5DDE1"/>
-              <w:right w:val="single" w:sz="4" w:color="D5DDE1"/>
-            </w:tcBorders>
-          </w:tcPr>
-          <w:p>
-            <w:pPr>
-              <w:keepNext/>
-              <w:spacing w:after="0"/>
-            </w:pPr>
-            <w:r>
-              <w:rPr>
-                <w:sz w:val="17"/>
-              </w:rPr>
-              <w:t>Title, your name as author, a CRediT statement, word count, the simulated-data statement, an acknowledgement of the course</w:t>
+              <w:t>STROBE items 4 to 12. All the information is in the results pack, the SAP and the data dictionary. Shown in Session 7</w:t>
             </w:r>
           </w:p>
         </w:tc>
@@ -2200,13 +1555,13 @@
               <w:rPr>
                 <w:sz w:val="17"/>
               </w:rPr>
-              <w:t>Structured abstract</w:t>
+              <w:t>Introduction</w:t>
             </w:r>
           </w:p>
         </w:tc>
         <w:tc>
           <w:tcPr>
-            <w:tcW w:type="dxa" w:w="1276"/>
+            <w:tcW w:type="dxa" w:w="7795"/>
             <w:tcBorders>
               <w:top w:val="single" w:sz="4" w:color="D5DDE1"/>
               <w:left w:val="single" w:sz="4" w:color="D5DDE1"/>
@@ -2224,31 +1579,7 @@
               <w:rPr>
                 <w:sz w:val="17"/>
               </w:rPr>
-              <w:t>250 words or fewer</w:t>
-            </w:r>
-          </w:p>
-        </w:tc>
-        <w:tc>
-          <w:tcPr>
-            <w:tcW w:type="dxa" w:w="6520"/>
-            <w:tcBorders>
-              <w:top w:val="single" w:sz="4" w:color="D5DDE1"/>
-              <w:left w:val="single" w:sz="4" w:color="D5DDE1"/>
-              <w:bottom w:val="single" w:sz="4" w:color="D5DDE1"/>
-              <w:right w:val="single" w:sz="4" w:color="D5DDE1"/>
-            </w:tcBorders>
-            <w:shd w:val="clear" w:color="auto" w:fill="F5F9FA"/>
-          </w:tcPr>
-          <w:p>
-            <w:pPr>
-              <w:keepNext/>
-              <w:spacing w:after="0"/>
-            </w:pPr>
-            <w:r>
-              <w:rPr>
-                <w:sz w:val="17"/>
-              </w:rPr>
-              <w:t>Background, Methods, Results (main effect with 95% CI), Conclusions</w:t>
+              <w:t>Three paragraphs: what is known, what is not known, the aim. Session 8</w:t>
             </w:r>
           </w:p>
         </w:tc>
@@ -2276,13 +1607,13 @@
               <w:rPr>
                 <w:sz w:val="17"/>
               </w:rPr>
-              <w:t>Introduction</w:t>
+              <w:t>Discussion</w:t>
             </w:r>
           </w:p>
         </w:tc>
         <w:tc>
           <w:tcPr>
-            <w:tcW w:type="dxa" w:w="1276"/>
+            <w:tcW w:type="dxa" w:w="7795"/>
             <w:tcBorders>
               <w:top w:val="single" w:sz="4" w:color="D5DDE1"/>
               <w:left w:val="single" w:sz="4" w:color="D5DDE1"/>
@@ -2299,499 +1630,7 @@
               <w:rPr>
                 <w:sz w:val="17"/>
               </w:rPr>
-              <w:t>about 350 words</w:t>
-            </w:r>
-          </w:p>
-        </w:tc>
-        <w:tc>
-          <w:tcPr>
-            <w:tcW w:type="dxa" w:w="6520"/>
-            <w:tcBorders>
-              <w:top w:val="single" w:sz="4" w:color="D5DDE1"/>
-              <w:left w:val="single" w:sz="4" w:color="D5DDE1"/>
-              <w:bottom w:val="single" w:sz="4" w:color="D5DDE1"/>
-              <w:right w:val="single" w:sz="4" w:color="D5DDE1"/>
-            </w:tcBorders>
-          </w:tcPr>
-          <w:p>
-            <w:pPr>
-              <w:keepNext/>
-              <w:spacing w:after="0"/>
-            </w:pPr>
-            <w:r>
-              <w:rPr>
-                <w:sz w:val="17"/>
-              </w:rPr>
-              <w:t>Three paragraphs: what is known, then what is not known, then the aim</w:t>
-            </w:r>
-          </w:p>
-        </w:tc>
-      </w:tr>
-      <w:tr>
-        <w:trPr>
-          <w:cantSplit w:val="true"/>
-        </w:trPr>
-        <w:tc>
-          <w:tcPr>
-            <w:tcW w:type="dxa" w:w="1616"/>
-            <w:tcBorders>
-              <w:top w:val="single" w:sz="4" w:color="D5DDE1"/>
-              <w:left w:val="single" w:sz="4" w:color="D5DDE1"/>
-              <w:bottom w:val="single" w:sz="4" w:color="D5DDE1"/>
-              <w:right w:val="single" w:sz="4" w:color="D5DDE1"/>
-            </w:tcBorders>
-            <w:shd w:val="clear" w:color="auto" w:fill="F5F9FA"/>
-          </w:tcPr>
-          <w:p>
-            <w:pPr>
-              <w:keepNext/>
-              <w:spacing w:after="0"/>
-            </w:pPr>
-            <w:r>
-              <w:rPr>
-                <w:sz w:val="17"/>
-              </w:rPr>
-              <w:t>Methods</w:t>
-            </w:r>
-          </w:p>
-        </w:tc>
-        <w:tc>
-          <w:tcPr>
-            <w:tcW w:type="dxa" w:w="1276"/>
-            <w:tcBorders>
-              <w:top w:val="single" w:sz="4" w:color="D5DDE1"/>
-              <w:left w:val="single" w:sz="4" w:color="D5DDE1"/>
-              <w:bottom w:val="single" w:sz="4" w:color="D5DDE1"/>
-              <w:right w:val="single" w:sz="4" w:color="D5DDE1"/>
-            </w:tcBorders>
-            <w:shd w:val="clear" w:color="auto" w:fill="F5F9FA"/>
-          </w:tcPr>
-          <w:p>
-            <w:pPr>
-              <w:keepNext/>
-              <w:spacing w:after="0"/>
-            </w:pPr>
-            <w:r>
-              <w:rPr>
-                <w:sz w:val="17"/>
-              </w:rPr>
-              <w:t>about 550 words</w:t>
-            </w:r>
-          </w:p>
-        </w:tc>
-        <w:tc>
-          <w:tcPr>
-            <w:tcW w:type="dxa" w:w="6520"/>
-            <w:tcBorders>
-              <w:top w:val="single" w:sz="4" w:color="D5DDE1"/>
-              <w:left w:val="single" w:sz="4" w:color="D5DDE1"/>
-              <w:bottom w:val="single" w:sz="4" w:color="D5DDE1"/>
-              <w:right w:val="single" w:sz="4" w:color="D5DDE1"/>
-            </w:tcBorders>
-            <w:shd w:val="clear" w:color="auto" w:fill="F5F9FA"/>
-          </w:tcPr>
-          <w:p>
-            <w:pPr>
-              <w:keepNext/>
-              <w:spacing w:after="0"/>
-            </w:pPr>
-            <w:r>
-              <w:rPr>
-                <w:sz w:val="17"/>
-              </w:rPr>
-              <w:t>STROBE items 4 to 12; include the statistical-analysis paragraph and how missing data were handled</w:t>
-            </w:r>
-          </w:p>
-        </w:tc>
-      </w:tr>
-      <w:tr>
-        <w:trPr>
-          <w:cantSplit w:val="true"/>
-        </w:trPr>
-        <w:tc>
-          <w:tcPr>
-            <w:tcW w:type="dxa" w:w="1616"/>
-            <w:tcBorders>
-              <w:top w:val="single" w:sz="4" w:color="D5DDE1"/>
-              <w:left w:val="single" w:sz="4" w:color="D5DDE1"/>
-              <w:bottom w:val="single" w:sz="4" w:color="D5DDE1"/>
-              <w:right w:val="single" w:sz="4" w:color="D5DDE1"/>
-            </w:tcBorders>
-          </w:tcPr>
-          <w:p>
-            <w:pPr>
-              <w:keepNext/>
-              <w:spacing w:after="0"/>
-            </w:pPr>
-            <w:r>
-              <w:rPr>
-                <w:sz w:val="17"/>
-              </w:rPr>
-              <w:t>Results</w:t>
-            </w:r>
-          </w:p>
-        </w:tc>
-        <w:tc>
-          <w:tcPr>
-            <w:tcW w:type="dxa" w:w="1276"/>
-            <w:tcBorders>
-              <w:top w:val="single" w:sz="4" w:color="D5DDE1"/>
-              <w:left w:val="single" w:sz="4" w:color="D5DDE1"/>
-              <w:bottom w:val="single" w:sz="4" w:color="D5DDE1"/>
-              <w:right w:val="single" w:sz="4" w:color="D5DDE1"/>
-            </w:tcBorders>
-          </w:tcPr>
-          <w:p>
-            <w:pPr>
-              <w:keepNext/>
-              <w:spacing w:after="0"/>
-            </w:pPr>
-            <w:r>
-              <w:rPr>
-                <w:sz w:val="17"/>
-              </w:rPr>
-              <w:t>about 450 words</w:t>
-            </w:r>
-          </w:p>
-        </w:tc>
-        <w:tc>
-          <w:tcPr>
-            <w:tcW w:type="dxa" w:w="6520"/>
-            <w:tcBorders>
-              <w:top w:val="single" w:sz="4" w:color="D5DDE1"/>
-              <w:left w:val="single" w:sz="4" w:color="D5DDE1"/>
-              <w:bottom w:val="single" w:sz="4" w:color="D5DDE1"/>
-              <w:right w:val="single" w:sz="4" w:color="D5DDE1"/>
-            </w:tcBorders>
-          </w:tcPr>
-          <w:p>
-            <w:pPr>
-              <w:keepNext/>
-              <w:spacing w:after="0"/>
-            </w:pPr>
-            <w:r>
-              <w:rPr>
-                <w:sz w:val="17"/>
-              </w:rPr>
-              <w:t>Participants first; numbers with denominators and 95% CIs; no interpretation</w:t>
-            </w:r>
-          </w:p>
-        </w:tc>
-      </w:tr>
-      <w:tr>
-        <w:trPr>
-          <w:cantSplit w:val="true"/>
-        </w:trPr>
-        <w:tc>
-          <w:tcPr>
-            <w:tcW w:type="dxa" w:w="1616"/>
-            <w:tcBorders>
-              <w:top w:val="single" w:sz="4" w:color="D5DDE1"/>
-              <w:left w:val="single" w:sz="4" w:color="D5DDE1"/>
-              <w:bottom w:val="single" w:sz="4" w:color="D5DDE1"/>
-              <w:right w:val="single" w:sz="4" w:color="D5DDE1"/>
-            </w:tcBorders>
-            <w:shd w:val="clear" w:color="auto" w:fill="F5F9FA"/>
-          </w:tcPr>
-          <w:p>
-            <w:pPr>
-              <w:keepNext/>
-              <w:spacing w:after="0"/>
-            </w:pPr>
-            <w:r>
-              <w:rPr>
-                <w:sz w:val="17"/>
-              </w:rPr>
-              <w:t>Discussion</w:t>
-            </w:r>
-          </w:p>
-        </w:tc>
-        <w:tc>
-          <w:tcPr>
-            <w:tcW w:type="dxa" w:w="1276"/>
-            <w:tcBorders>
-              <w:top w:val="single" w:sz="4" w:color="D5DDE1"/>
-              <w:left w:val="single" w:sz="4" w:color="D5DDE1"/>
-              <w:bottom w:val="single" w:sz="4" w:color="D5DDE1"/>
-              <w:right w:val="single" w:sz="4" w:color="D5DDE1"/>
-            </w:tcBorders>
-            <w:shd w:val="clear" w:color="auto" w:fill="F5F9FA"/>
-          </w:tcPr>
-          <w:p>
-            <w:pPr>
-              <w:keepNext/>
-              <w:spacing w:after="0"/>
-            </w:pPr>
-            <w:r>
-              <w:rPr>
-                <w:sz w:val="17"/>
-              </w:rPr>
-              <w:t>about 650 words</w:t>
-            </w:r>
-          </w:p>
-        </w:tc>
-        <w:tc>
-          <w:tcPr>
-            <w:tcW w:type="dxa" w:w="6520"/>
-            <w:tcBorders>
-              <w:top w:val="single" w:sz="4" w:color="D5DDE1"/>
-              <w:left w:val="single" w:sz="4" w:color="D5DDE1"/>
-              <w:bottom w:val="single" w:sz="4" w:color="D5DDE1"/>
-              <w:right w:val="single" w:sz="4" w:color="D5DDE1"/>
-            </w:tcBorders>
-            <w:shd w:val="clear" w:color="auto" w:fill="F5F9FA"/>
-          </w:tcPr>
-          <w:p>
-            <w:pPr>
-              <w:keepNext/>
-              <w:spacing w:after="0"/>
-            </w:pPr>
-            <w:r>
-              <w:rPr>
-                <w:sz w:val="17"/>
-              </w:rPr>
-              <w:t xml:space="preserve">In this order: main finding, comparison with literature (incl. Paper 2, Hyun 2023, in </w:t>
-            </w:r>
-            <w:r>
-              <w:rPr>
-                <w:rFonts w:ascii="Consolas" w:hAnsi="Consolas" w:cs="Consolas" w:eastAsia="Consolas"/>
-                <w:color w:val="0B376C"/>
-                <w:sz w:val="17"/>
-              </w:rPr>
-              <w:t>Course/Papers/</w:t>
-            </w:r>
-            <w:r>
-              <w:rPr>
-                <w:sz w:val="17"/>
-              </w:rPr>
-              <w:t>), possible explanations, strengths and limitations, implications, conclusion</w:t>
-            </w:r>
-          </w:p>
-        </w:tc>
-      </w:tr>
-      <w:tr>
-        <w:trPr>
-          <w:cantSplit w:val="true"/>
-        </w:trPr>
-        <w:tc>
-          <w:tcPr>
-            <w:tcW w:type="dxa" w:w="1616"/>
-            <w:tcBorders>
-              <w:top w:val="single" w:sz="4" w:color="D5DDE1"/>
-              <w:left w:val="single" w:sz="4" w:color="D5DDE1"/>
-              <w:bottom w:val="single" w:sz="4" w:color="D5DDE1"/>
-              <w:right w:val="single" w:sz="4" w:color="D5DDE1"/>
-            </w:tcBorders>
-          </w:tcPr>
-          <w:p>
-            <w:pPr>
-              <w:keepNext/>
-              <w:spacing w:after="0"/>
-            </w:pPr>
-            <w:r>
-              <w:rPr>
-                <w:b/>
-                <w:sz w:val="17"/>
-              </w:rPr>
-              <w:t>Main text total</w:t>
-            </w:r>
-          </w:p>
-        </w:tc>
-        <w:tc>
-          <w:tcPr>
-            <w:tcW w:type="dxa" w:w="1276"/>
-            <w:tcBorders>
-              <w:top w:val="single" w:sz="4" w:color="D5DDE1"/>
-              <w:left w:val="single" w:sz="4" w:color="D5DDE1"/>
-              <w:bottom w:val="single" w:sz="4" w:color="D5DDE1"/>
-              <w:right w:val="single" w:sz="4" w:color="D5DDE1"/>
-            </w:tcBorders>
-          </w:tcPr>
-          <w:p>
-            <w:pPr>
-              <w:keepNext/>
-              <w:spacing w:after="0"/>
-            </w:pPr>
-            <w:r>
-              <w:rPr>
-                <w:b/>
-                <w:sz w:val="17"/>
-              </w:rPr>
-              <w:t>about 2,000 words</w:t>
-            </w:r>
-          </w:p>
-        </w:tc>
-        <w:tc>
-          <w:tcPr>
-            <w:tcW w:type="dxa" w:w="6520"/>
-            <w:tcBorders>
-              <w:top w:val="single" w:sz="4" w:color="D5DDE1"/>
-              <w:left w:val="single" w:sz="4" w:color="D5DDE1"/>
-              <w:bottom w:val="single" w:sz="4" w:color="D5DDE1"/>
-              <w:right w:val="single" w:sz="4" w:color="D5DDE1"/>
-            </w:tcBorders>
-          </w:tcPr>
-          <w:p>
-            <w:pPr>
-              <w:keepNext/>
-              <w:spacing w:after="0"/>
-            </w:pPr>
-            <w:r>
-              <w:rPr>
-                <w:sz w:val="17"/>
-              </w:rPr>
-              <w:t>Introduction to Discussion (plus or minus 10%); abstract, tables and references not counted</w:t>
-            </w:r>
-          </w:p>
-        </w:tc>
-      </w:tr>
-      <w:tr>
-        <w:trPr>
-          <w:cantSplit w:val="true"/>
-        </w:trPr>
-        <w:tc>
-          <w:tcPr>
-            <w:tcW w:type="dxa" w:w="1616"/>
-            <w:tcBorders>
-              <w:top w:val="single" w:sz="4" w:color="D5DDE1"/>
-              <w:left w:val="single" w:sz="4" w:color="D5DDE1"/>
-              <w:bottom w:val="single" w:sz="4" w:color="D5DDE1"/>
-              <w:right w:val="single" w:sz="4" w:color="D5DDE1"/>
-            </w:tcBorders>
-            <w:shd w:val="clear" w:color="auto" w:fill="F5F9FA"/>
-          </w:tcPr>
-          <w:p>
-            <w:pPr>
-              <w:keepNext/>
-              <w:spacing w:after="0"/>
-            </w:pPr>
-            <w:r>
-              <w:rPr>
-                <w:sz w:val="17"/>
-              </w:rPr>
-              <w:t>Tables and figures</w:t>
-            </w:r>
-          </w:p>
-        </w:tc>
-        <w:tc>
-          <w:tcPr>
-            <w:tcW w:type="dxa" w:w="1276"/>
-            <w:tcBorders>
-              <w:top w:val="single" w:sz="4" w:color="D5DDE1"/>
-              <w:left w:val="single" w:sz="4" w:color="D5DDE1"/>
-              <w:bottom w:val="single" w:sz="4" w:color="D5DDE1"/>
-              <w:right w:val="single" w:sz="4" w:color="D5DDE1"/>
-            </w:tcBorders>
-            <w:shd w:val="clear" w:color="auto" w:fill="F5F9FA"/>
-          </w:tcPr>
-          <w:p>
-            <w:pPr>
-              <w:keepNext/>
-              <w:spacing w:after="0"/>
-            </w:pPr>
-            <w:r>
-              <w:rPr>
-                <w:sz w:val="17"/>
-              </w:rPr>
-              <w:t>Table 1 + up to 2 more</w:t>
-            </w:r>
-          </w:p>
-        </w:tc>
-        <w:tc>
-          <w:tcPr>
-            <w:tcW w:type="dxa" w:w="6520"/>
-            <w:tcBorders>
-              <w:top w:val="single" w:sz="4" w:color="D5DDE1"/>
-              <w:left w:val="single" w:sz="4" w:color="D5DDE1"/>
-              <w:bottom w:val="single" w:sz="4" w:color="D5DDE1"/>
-              <w:right w:val="single" w:sz="4" w:color="D5DDE1"/>
-            </w:tcBorders>
-            <w:shd w:val="clear" w:color="auto" w:fill="F5F9FA"/>
-          </w:tcPr>
-          <w:p>
-            <w:pPr>
-              <w:keepNext/>
-              <w:spacing w:after="0"/>
-            </w:pPr>
-            <w:r>
-              <w:rPr>
-                <w:sz w:val="17"/>
-              </w:rPr>
-              <w:t>Each must stand alone (title, units, n, abbreviations explained)</w:t>
-            </w:r>
-          </w:p>
-        </w:tc>
-      </w:tr>
-      <w:tr>
-        <w:trPr>
-          <w:cantSplit w:val="true"/>
-        </w:trPr>
-        <w:tc>
-          <w:tcPr>
-            <w:tcW w:type="dxa" w:w="1616"/>
-            <w:tcBorders>
-              <w:top w:val="single" w:sz="4" w:color="D5DDE1"/>
-              <w:left w:val="single" w:sz="4" w:color="D5DDE1"/>
-              <w:bottom w:val="single" w:sz="4" w:color="D5DDE1"/>
-              <w:right w:val="single" w:sz="4" w:color="D5DDE1"/>
-            </w:tcBorders>
-          </w:tcPr>
-          <w:p>
-            <w:pPr>
-              <w:keepNext/>
-              <w:spacing w:after="0"/>
-            </w:pPr>
-            <w:r>
-              <w:rPr>
-                <w:sz w:val="17"/>
-              </w:rPr>
-              <w:t>References</w:t>
-            </w:r>
-          </w:p>
-        </w:tc>
-        <w:tc>
-          <w:tcPr>
-            <w:tcW w:type="dxa" w:w="1276"/>
-            <w:tcBorders>
-              <w:top w:val="single" w:sz="4" w:color="D5DDE1"/>
-              <w:left w:val="single" w:sz="4" w:color="D5DDE1"/>
-              <w:bottom w:val="single" w:sz="4" w:color="D5DDE1"/>
-              <w:right w:val="single" w:sz="4" w:color="D5DDE1"/>
-            </w:tcBorders>
-          </w:tcPr>
-          <w:p>
-            <w:pPr>
-              <w:keepNext/>
-              <w:spacing w:after="0"/>
-            </w:pPr>
-            <w:r>
-              <w:rPr>
-                <w:sz w:val="17"/>
-              </w:rPr>
-              <w:t>10 to 20</w:t>
-            </w:r>
-          </w:p>
-        </w:tc>
-        <w:tc>
-          <w:tcPr>
-            <w:tcW w:type="dxa" w:w="6520"/>
-            <w:tcBorders>
-              <w:top w:val="single" w:sz="4" w:color="D5DDE1"/>
-              <w:left w:val="single" w:sz="4" w:color="D5DDE1"/>
-              <w:bottom w:val="single" w:sz="4" w:color="D5DDE1"/>
-              <w:right w:val="single" w:sz="4" w:color="D5DDE1"/>
-            </w:tcBorders>
-          </w:tcPr>
-          <w:p>
-            <w:pPr>
-              <w:keepNext/>
-              <w:spacing w:after="0"/>
-            </w:pPr>
-            <w:r>
-              <w:rPr>
-                <w:sz w:val="17"/>
-              </w:rPr>
-              <w:t>Vancouver style, managed in Zotero or another reference manager</w:t>
+              <w:t>Six moves: answer, compare, explain, limitations, implications, conclusion. Session 8</w:t>
             </w:r>
           </w:p>
         </w:tc>
@@ -2819,13 +1658,13 @@
               <w:rPr>
                 <w:sz w:val="17"/>
               </w:rPr>
-              <w:t>STROBE checklist</w:t>
+              <w:t>Abstract</w:t>
             </w:r>
           </w:p>
         </w:tc>
         <w:tc>
           <w:tcPr>
-            <w:tcW w:type="dxa" w:w="1276"/>
+            <w:tcW w:type="dxa" w:w="7795"/>
             <w:tcBorders>
               <w:top w:val="single" w:sz="4" w:color="D5DDE1"/>
               <w:left w:val="single" w:sz="4" w:color="D5DDE1"/>
@@ -2842,30 +1681,7 @@
               <w:rPr>
                 <w:sz w:val="17"/>
               </w:rPr>
-              <w:t>Completed</w:t>
-            </w:r>
-          </w:p>
-        </w:tc>
-        <w:tc>
-          <w:tcPr>
-            <w:tcW w:type="dxa" w:w="6520"/>
-            <w:tcBorders>
-              <w:top w:val="single" w:sz="4" w:color="D5DDE1"/>
-              <w:left w:val="single" w:sz="4" w:color="D5DDE1"/>
-              <w:bottom w:val="single" w:sz="4" w:color="D5DDE1"/>
-              <w:right w:val="single" w:sz="4" w:color="D5DDE1"/>
-            </w:tcBorders>
-            <w:shd w:val="clear" w:color="auto" w:fill="F5F9FA"/>
-          </w:tcPr>
-          <w:p>
-            <w:pPr>
-              <w:spacing w:after="0"/>
-            </w:pPr>
-            <w:r>
-              <w:rPr>
-                <w:sz w:val="17"/>
-              </w:rPr>
-              <w:t>With the page number for each item, or "not applicable"</w:t>
+              <w:t>Structured, 250 words or fewer. Session 8</w:t>
             </w:r>
           </w:p>
         </w:tc>
@@ -2877,59 +1693,483 @@
       </w:pPr>
     </w:p>
     <w:p>
+      <w:r>
+        <w:t>Send optional parts in the same file as your Results. They are not marked, but you get written feedback.</w:t>
+      </w:r>
+    </w:p>
+    <w:p>
       <w:pPr>
         <w:pStyle w:val="Heading1"/>
       </w:pPr>
       <w:r>
-        <w:t>5. Authorship and acknowledgement</w:t>
+        <w:t>5. Timeline</w:t>
       </w:r>
     </w:p>
-    <w:p>
-      <w:r>
-        <w:t>You are the single author of your manuscript. Use it to practise the authorship ideas from Session 7 (ICMJE criteria and CRediT roles):</w:t>
-      </w:r>
-    </w:p>
+    <w:tbl>
+      <w:tblPr>
+        <w:tblW w:type="auto" w:w="0"/>
+        <w:jc w:val="center"/>
+        <w:tblLayout w:type="fixed"/>
+        <w:tblCellMar>
+          <w:top w:w="80" w:type="dxa"/>
+          <w:left w:w="110" w:type="dxa"/>
+          <w:bottom w:w="80" w:type="dxa"/>
+          <w:right w:w="110" w:type="dxa"/>
+        </w:tblCellMar>
+        <w:tblLook w:firstColumn="1" w:firstRow="1" w:lastColumn="0" w:lastRow="0" w:noHBand="0" w:noVBand="1" w:val="04A0"/>
+      </w:tblPr>
+      <w:tblGrid>
+        <w:gridCol w:w="3012"/>
+        <w:gridCol w:w="6399"/>
+      </w:tblGrid>
+      <w:tr>
+        <w:trPr>
+          <w:cantSplit w:val="true"/>
+          <w:tblHeader w:val="true"/>
+        </w:trPr>
+        <w:tc>
+          <w:tcPr>
+            <w:tcW w:type="dxa" w:w="3013"/>
+            <w:tcBorders>
+              <w:top w:val="single" w:sz="4" w:color="04242F"/>
+              <w:left w:val="single" w:sz="4" w:color="04242F"/>
+              <w:bottom w:val="single" w:sz="4" w:color="04242F"/>
+              <w:right w:val="single" w:sz="4" w:color="04242F"/>
+            </w:tcBorders>
+            <w:shd w:val="clear" w:color="auto" w:fill="04242F"/>
+          </w:tcPr>
+          <w:p>
+            <w:pPr>
+              <w:keepNext/>
+              <w:spacing w:after="0"/>
+            </w:pPr>
+            <w:r>
+              <w:rPr>
+                <w:b/>
+                <w:color w:val="FFFFFF"/>
+                <w:sz w:val="18"/>
+              </w:rPr>
+              <w:t>When</w:t>
+            </w:r>
+          </w:p>
+        </w:tc>
+        <w:tc>
+          <w:tcPr>
+            <w:tcW w:type="dxa" w:w="6399"/>
+            <w:tcBorders>
+              <w:top w:val="single" w:sz="4" w:color="04242F"/>
+              <w:left w:val="single" w:sz="4" w:color="04242F"/>
+              <w:bottom w:val="single" w:sz="4" w:color="04242F"/>
+              <w:right w:val="single" w:sz="4" w:color="04242F"/>
+            </w:tcBorders>
+            <w:shd w:val="clear" w:color="auto" w:fill="04242F"/>
+          </w:tcPr>
+          <w:p>
+            <w:pPr>
+              <w:keepNext/>
+              <w:spacing w:after="0"/>
+            </w:pPr>
+            <w:r>
+              <w:rPr>
+                <w:b/>
+                <w:color w:val="FFFFFF"/>
+                <w:sz w:val="18"/>
+              </w:rPr>
+              <w:t>What happens</w:t>
+            </w:r>
+          </w:p>
+        </w:tc>
+      </w:tr>
+      <w:tr>
+        <w:trPr>
+          <w:cantSplit w:val="true"/>
+        </w:trPr>
+        <w:tc>
+          <w:tcPr>
+            <w:tcW w:type="dxa" w:w="3013"/>
+            <w:tcBorders>
+              <w:top w:val="single" w:sz="4" w:color="D5DDE1"/>
+              <w:left w:val="single" w:sz="4" w:color="D5DDE1"/>
+              <w:bottom w:val="single" w:sz="4" w:color="D5DDE1"/>
+              <w:right w:val="single" w:sz="4" w:color="D5DDE1"/>
+            </w:tcBorders>
+          </w:tcPr>
+          <w:p>
+            <w:pPr>
+              <w:keepNext/>
+              <w:spacing w:after="0"/>
+            </w:pPr>
+            <w:r>
+              <w:rPr>
+                <w:sz w:val="17"/>
+              </w:rPr>
+              <w:t>Sessions 5 and 6</w:t>
+            </w:r>
+          </w:p>
+        </w:tc>
+        <w:tc>
+          <w:tcPr>
+            <w:tcW w:type="dxa" w:w="6399"/>
+            <w:tcBorders>
+              <w:top w:val="single" w:sz="4" w:color="D5DDE1"/>
+              <w:left w:val="single" w:sz="4" w:color="D5DDE1"/>
+              <w:bottom w:val="single" w:sz="4" w:color="D5DDE1"/>
+              <w:right w:val="single" w:sz="4" w:color="D5DDE1"/>
+            </w:tcBorders>
+          </w:tcPr>
+          <w:p>
+            <w:pPr>
+              <w:keepNext/>
+              <w:spacing w:after="0"/>
+            </w:pPr>
+            <w:r>
+              <w:rPr>
+                <w:sz w:val="17"/>
+              </w:rPr>
+              <w:t>The class reads the data, Table 1 and the results together</w:t>
+            </w:r>
+          </w:p>
+        </w:tc>
+      </w:tr>
+      <w:tr>
+        <w:trPr>
+          <w:cantSplit w:val="true"/>
+        </w:trPr>
+        <w:tc>
+          <w:tcPr>
+            <w:tcW w:type="dxa" w:w="3013"/>
+            <w:tcBorders>
+              <w:top w:val="single" w:sz="4" w:color="D5DDE1"/>
+              <w:left w:val="single" w:sz="4" w:color="D5DDE1"/>
+              <w:bottom w:val="single" w:sz="4" w:color="D5DDE1"/>
+              <w:right w:val="single" w:sz="4" w:color="D5DDE1"/>
+            </w:tcBorders>
+            <w:shd w:val="clear" w:color="auto" w:fill="F5F9FA"/>
+          </w:tcPr>
+          <w:p>
+            <w:pPr>
+              <w:keepNext/>
+              <w:spacing w:after="0"/>
+            </w:pPr>
+            <w:r>
+              <w:rPr>
+                <w:sz w:val="17"/>
+              </w:rPr>
+              <w:t>End of Session 6 (5 December)</w:t>
+            </w:r>
+          </w:p>
+        </w:tc>
+        <w:tc>
+          <w:tcPr>
+            <w:tcW w:type="dxa" w:w="6399"/>
+            <w:tcBorders>
+              <w:top w:val="single" w:sz="4" w:color="D5DDE1"/>
+              <w:left w:val="single" w:sz="4" w:color="D5DDE1"/>
+              <w:bottom w:val="single" w:sz="4" w:color="D5DDE1"/>
+              <w:right w:val="single" w:sz="4" w:color="D5DDE1"/>
+            </w:tcBorders>
+            <w:shd w:val="clear" w:color="auto" w:fill="F5F9FA"/>
+          </w:tcPr>
+          <w:p>
+            <w:pPr>
+              <w:keepNext/>
+              <w:spacing w:after="0"/>
+            </w:pPr>
+            <w:r>
+              <w:rPr>
+                <w:sz w:val="17"/>
+              </w:rPr>
+              <w:t>You choose your question and receive this brief</w:t>
+            </w:r>
+          </w:p>
+        </w:tc>
+      </w:tr>
+      <w:tr>
+        <w:trPr>
+          <w:cantSplit w:val="true"/>
+        </w:trPr>
+        <w:tc>
+          <w:tcPr>
+            <w:tcW w:type="dxa" w:w="3013"/>
+            <w:tcBorders>
+              <w:top w:val="single" w:sz="4" w:color="D5DDE1"/>
+              <w:left w:val="single" w:sz="4" w:color="D5DDE1"/>
+              <w:bottom w:val="single" w:sz="4" w:color="D5DDE1"/>
+              <w:right w:val="single" w:sz="4" w:color="D5DDE1"/>
+            </w:tcBorders>
+          </w:tcPr>
+          <w:p>
+            <w:pPr>
+              <w:keepNext/>
+              <w:spacing w:after="0"/>
+            </w:pPr>
+            <w:r>
+              <w:rPr>
+                <w:sz w:val="17"/>
+              </w:rPr>
+              <w:t>Session 7 (12 December)</w:t>
+            </w:r>
+          </w:p>
+        </w:tc>
+        <w:tc>
+          <w:tcPr>
+            <w:tcW w:type="dxa" w:w="6399"/>
+            <w:tcBorders>
+              <w:top w:val="single" w:sz="4" w:color="D5DDE1"/>
+              <w:left w:val="single" w:sz="4" w:color="D5DDE1"/>
+              <w:bottom w:val="single" w:sz="4" w:color="D5DDE1"/>
+              <w:right w:val="single" w:sz="4" w:color="D5DDE1"/>
+            </w:tcBorders>
+          </w:tcPr>
+          <w:p>
+            <w:pPr>
+              <w:keepNext/>
+              <w:spacing w:after="0"/>
+            </w:pPr>
+            <w:r>
+              <w:rPr>
+                <w:sz w:val="17"/>
+              </w:rPr>
+              <w:t xml:space="preserve">Manuscript workshop 1: the instructor writes the Q1 Results live with the class, then you start yours. </w:t>
+            </w:r>
+            <w:r>
+              <w:rPr>
+                <w:b/>
+                <w:sz w:val="17"/>
+              </w:rPr>
+              <w:t>Your reviewer is announced</w:t>
+            </w:r>
+          </w:p>
+        </w:tc>
+      </w:tr>
+      <w:tr>
+        <w:trPr>
+          <w:cantSplit w:val="true"/>
+        </w:trPr>
+        <w:tc>
+          <w:tcPr>
+            <w:tcW w:type="dxa" w:w="3013"/>
+            <w:tcBorders>
+              <w:top w:val="single" w:sz="4" w:color="D5DDE1"/>
+              <w:left w:val="single" w:sz="4" w:color="D5DDE1"/>
+              <w:bottom w:val="single" w:sz="4" w:color="D5DDE1"/>
+              <w:right w:val="single" w:sz="4" w:color="D5DDE1"/>
+            </w:tcBorders>
+            <w:shd w:val="clear" w:color="auto" w:fill="F5F9FA"/>
+          </w:tcPr>
+          <w:p>
+            <w:pPr>
+              <w:keepNext/>
+              <w:spacing w:after="0"/>
+            </w:pPr>
+            <w:r>
+              <w:rPr>
+                <w:sz w:val="17"/>
+              </w:rPr>
+              <w:t>Session 8 (19 December)</w:t>
+            </w:r>
+          </w:p>
+        </w:tc>
+        <w:tc>
+          <w:tcPr>
+            <w:tcW w:type="dxa" w:w="6399"/>
+            <w:tcBorders>
+              <w:top w:val="single" w:sz="4" w:color="D5DDE1"/>
+              <w:left w:val="single" w:sz="4" w:color="D5DDE1"/>
+              <w:bottom w:val="single" w:sz="4" w:color="D5DDE1"/>
+              <w:right w:val="single" w:sz="4" w:color="D5DDE1"/>
+            </w:tcBorders>
+            <w:shd w:val="clear" w:color="auto" w:fill="F5F9FA"/>
+          </w:tcPr>
+          <w:p>
+            <w:pPr>
+              <w:keepNext/>
+              <w:spacing w:after="0"/>
+            </w:pPr>
+            <w:r>
+              <w:rPr>
+                <w:sz w:val="17"/>
+              </w:rPr>
+              <w:t>Manuscript workshop 2: improve your Results section, and an introduction to the optional parts</w:t>
+            </w:r>
+          </w:p>
+        </w:tc>
+      </w:tr>
+      <w:tr>
+        <w:trPr>
+          <w:cantSplit w:val="true"/>
+        </w:trPr>
+        <w:tc>
+          <w:tcPr>
+            <w:tcW w:type="dxa" w:w="3013"/>
+            <w:tcBorders>
+              <w:top w:val="single" w:sz="4" w:color="D5DDE1"/>
+              <w:left w:val="single" w:sz="4" w:color="D5DDE1"/>
+              <w:bottom w:val="single" w:sz="4" w:color="D5DDE1"/>
+              <w:right w:val="single" w:sz="4" w:color="D5DDE1"/>
+            </w:tcBorders>
+          </w:tcPr>
+          <w:p>
+            <w:pPr>
+              <w:keepNext/>
+              <w:spacing w:after="0"/>
+            </w:pPr>
+            <w:r>
+              <w:rPr>
+                <w:b/>
+                <w:sz w:val="17"/>
+              </w:rPr>
+              <w:t>23:59, Saturday 19 December 2026</w:t>
+            </w:r>
+          </w:p>
+        </w:tc>
+        <w:tc>
+          <w:tcPr>
+            <w:tcW w:type="dxa" w:w="6399"/>
+            <w:tcBorders>
+              <w:top w:val="single" w:sz="4" w:color="D5DDE1"/>
+              <w:left w:val="single" w:sz="4" w:color="D5DDE1"/>
+              <w:bottom w:val="single" w:sz="4" w:color="D5DDE1"/>
+              <w:right w:val="single" w:sz="4" w:color="D5DDE1"/>
+            </w:tcBorders>
+          </w:tcPr>
+          <w:p>
+            <w:pPr>
+              <w:keepNext/>
+              <w:spacing w:after="0"/>
+            </w:pPr>
+            <w:r>
+              <w:rPr>
+                <w:sz w:val="17"/>
+              </w:rPr>
+              <w:t>Results draft due. Email it to your reviewer and to the course lead</w:t>
+            </w:r>
+          </w:p>
+        </w:tc>
+      </w:tr>
+      <w:tr>
+        <w:trPr>
+          <w:cantSplit w:val="true"/>
+        </w:trPr>
+        <w:tc>
+          <w:tcPr>
+            <w:tcW w:type="dxa" w:w="3013"/>
+            <w:tcBorders>
+              <w:top w:val="single" w:sz="4" w:color="D5DDE1"/>
+              <w:left w:val="single" w:sz="4" w:color="D5DDE1"/>
+              <w:bottom w:val="single" w:sz="4" w:color="D5DDE1"/>
+              <w:right w:val="single" w:sz="4" w:color="D5DDE1"/>
+            </w:tcBorders>
+            <w:shd w:val="clear" w:color="auto" w:fill="F5F9FA"/>
+          </w:tcPr>
+          <w:p>
+            <w:pPr>
+              <w:keepNext/>
+              <w:spacing w:after="0"/>
+            </w:pPr>
+            <w:r>
+              <w:rPr>
+                <w:b/>
+                <w:sz w:val="17"/>
+              </w:rPr>
+              <w:t>Saturday 2 January 2027</w:t>
+            </w:r>
+            <w:r>
+              <w:rPr>
+                <w:sz w:val="17"/>
+              </w:rPr>
+              <w:t xml:space="preserve"> (2 weeks after Session 8)</w:t>
+            </w:r>
+          </w:p>
+        </w:tc>
+        <w:tc>
+          <w:tcPr>
+            <w:tcW w:type="dxa" w:w="6399"/>
+            <w:tcBorders>
+              <w:top w:val="single" w:sz="4" w:color="D5DDE1"/>
+              <w:left w:val="single" w:sz="4" w:color="D5DDE1"/>
+              <w:bottom w:val="single" w:sz="4" w:color="D5DDE1"/>
+              <w:right w:val="single" w:sz="4" w:color="D5DDE1"/>
+            </w:tcBorders>
+            <w:shd w:val="clear" w:color="auto" w:fill="F5F9FA"/>
+          </w:tcPr>
+          <w:p>
+            <w:pPr>
+              <w:keepNext/>
+              <w:spacing w:after="0"/>
+            </w:pPr>
+            <w:r>
+              <w:rPr>
+                <w:sz w:val="17"/>
+              </w:rPr>
+              <w:t>Review report due. Email it to the author and to the course lead</w:t>
+            </w:r>
+          </w:p>
+        </w:tc>
+      </w:tr>
+      <w:tr>
+        <w:trPr>
+          <w:cantSplit w:val="true"/>
+        </w:trPr>
+        <w:tc>
+          <w:tcPr>
+            <w:tcW w:type="dxa" w:w="3013"/>
+            <w:tcBorders>
+              <w:top w:val="single" w:sz="4" w:color="D5DDE1"/>
+              <w:left w:val="single" w:sz="4" w:color="D5DDE1"/>
+              <w:bottom w:val="single" w:sz="4" w:color="D5DDE1"/>
+              <w:right w:val="single" w:sz="4" w:color="D5DDE1"/>
+            </w:tcBorders>
+            <w:shd w:val="clear" w:color="auto" w:fill="EAF2F5"/>
+          </w:tcPr>
+          <w:p>
+            <w:pPr>
+              <w:spacing w:after="0"/>
+            </w:pPr>
+            <w:r>
+              <w:rPr>
+                <w:b/>
+                <w:sz w:val="17"/>
+              </w:rPr>
+              <w:t>Saturday 30 January 2027</w:t>
+            </w:r>
+            <w:r>
+              <w:rPr>
+                <w:sz w:val="17"/>
+              </w:rPr>
+              <w:t xml:space="preserve"> (4 weeks after the review)</w:t>
+            </w:r>
+          </w:p>
+        </w:tc>
+        <w:tc>
+          <w:tcPr>
+            <w:tcW w:type="dxa" w:w="6399"/>
+            <w:tcBorders>
+              <w:top w:val="single" w:sz="4" w:color="D5DDE1"/>
+              <w:left w:val="single" w:sz="4" w:color="D5DDE1"/>
+              <w:bottom w:val="single" w:sz="4" w:color="D5DDE1"/>
+              <w:right w:val="single" w:sz="4" w:color="D5DDE1"/>
+            </w:tcBorders>
+            <w:shd w:val="clear" w:color="auto" w:fill="EAF2F5"/>
+          </w:tcPr>
+          <w:p>
+            <w:pPr>
+              <w:spacing w:after="0"/>
+            </w:pPr>
+            <w:r>
+              <w:rPr>
+                <w:sz w:val="17"/>
+              </w:rPr>
+              <w:t>Revised Results section and response to the reviewer due</w:t>
+            </w:r>
+          </w:p>
+        </w:tc>
+      </w:tr>
+    </w:tbl>
     <w:p>
       <w:pPr>
-        <w:pStyle w:val="ListBullet"/>
+        <w:spacing w:after="80"/>
       </w:pPr>
-      <w:r>
-        <w:rPr>
-          <w:b/>
-        </w:rPr>
-        <w:t>CRediT statement:</w:t>
-      </w:r>
-      <w:r>
-        <w:t xml:space="preserve"> list your own roles and those of the people who produced the data and analysis, e.g. "Conceptualisation, writing (original draft), writing (review and editing): [your name]. Data curation, formal analysis: course instructors."</w:t>
-      </w:r>
-    </w:p>
-    <w:p>
-      <w:pPr>
-        <w:pStyle w:val="ListBullet"/>
-      </w:pPr>
-      <w:r>
-        <w:rPr>
-          <w:b/>
-        </w:rPr>
-        <w:t>Acknowledgements:</w:t>
-      </w:r>
-      <w:r>
-        <w:t xml:space="preserve"> the course instructors created the dataset and ran the analysis. They are acknowledged, not listed as authors, e.g. "The simulated FLUID-ICU dataset and its analysis were provided by the Neudata course </w:t>
-      </w:r>
-      <w:r>
-        <w:rPr>
-          <w:i/>
-        </w:rPr>
-        <w:t>Foundations of Clinical Research, Level 1</w:t>
-      </w:r>
-      <w:r>
-        <w:t>. We thank [name of the classmate who reviewed the draft] for their peer review."</w:t>
-      </w:r>
-    </w:p>
-    <w:p>
-      <w:r>
-        <w:t>You may discuss the results with classmates, but the text must be your own.</w:t>
-      </w:r>
     </w:p>
     <w:p>
       <w:pPr>
@@ -2950,7 +2190,7 @@
         <w:t>Numbers:</w:t>
       </w:r>
       <w:r>
-        <w:t xml:space="preserve"> report only numbers from your results pack (or from your own reproduction with the course scripts, if you used them, and say so). Never round in ways that change the meaning. Give 95% CIs with every main estimate.</w:t>
+        <w:t xml:space="preserve"> only from your results pack. Round without changing the meaning.</w:t>
       </w:r>
     </w:p>
     <w:p>
@@ -2964,7 +2204,7 @@
         <w:t>Language:</w:t>
       </w:r>
       <w:r>
-        <w:t xml:space="preserve"> FLUID-ICU is observational. Write "associated with", not "caused" or "led to". No "trend towards significance".</w:t>
+        <w:t xml:space="preserve"> FLUID-ICU is observational. Write "associated with", never "caused" or "led to".</w:t>
       </w:r>
     </w:p>
     <w:p>
@@ -2978,7 +2218,7 @@
         <w:t>Missing data:</w:t>
       </w:r>
       <w:r>
-        <w:t xml:space="preserve"> say how much was missing and how it was handled, as shown in your results pack.</w:t>
+        <w:t xml:space="preserve"> say how much was missing, as in your pack.</w:t>
       </w:r>
     </w:p>
     <w:p>
@@ -2992,7 +2232,7 @@
         <w:t>Originality:</w:t>
       </w:r>
       <w:r>
-        <w:t xml:space="preserve"> write in your own words and cite every source. Quote sparingly and with quotation marks. Two participants who chose the same question will have the same numbers, but their text must be their own.</w:t>
+        <w:t xml:space="preserve"> your own words. Two participants with the same question have the same numbers but not the same text.</w:t>
       </w:r>
     </w:p>
     <w:p>
@@ -3006,46 +2246,7 @@
         <w:t>AI-use statement (required):</w:t>
       </w:r>
       <w:r>
-        <w:t xml:space="preserve"> at the end of the manuscript, add one of these:</w:t>
-      </w:r>
-    </w:p>
-    <w:p>
-      <w:pPr>
-        <w:pStyle w:val="ListBullet"/>
-      </w:pPr>
-      <w:r>
-        <w:t>"AI use: none."</w:t>
-      </w:r>
-    </w:p>
-    <w:p>
-      <w:pPr>
-        <w:pStyle w:val="ListBullet"/>
-      </w:pPr>
-      <w:r>
-        <w:t>"AI use: [tool name] was used to [improve the English / translate drafts / suggest wording]. The author checked every sentence and reference and takes full responsibility for the content."</w:t>
-      </w:r>
-    </w:p>
-    <w:p>
-      <w:r>
-        <w:t xml:space="preserve">AI tools must </w:t>
-      </w:r>
-      <w:r>
-        <w:rPr>
-          <w:b/>
-        </w:rPr>
-        <w:t>not</w:t>
-      </w:r>
-      <w:r>
-        <w:t xml:space="preserve"> be used to produce results, invent or find references you have not read, or write the interpretation for you. AI tools cannot be authors. When you review a classmate's manuscript, </w:t>
-      </w:r>
-      <w:r>
-        <w:rPr>
-          <w:b/>
-        </w:rPr>
-        <w:t>do not paste it into an AI tool</w:t>
-      </w:r>
-      <w:r>
-        <w:t>. It is confidential.</w:t>
+        <w:t xml:space="preserve"> at the end, write either "AI use: none." or "AI use: [tool] was used to [improve the English / translate]. The author checked every sentence and takes full responsibility." AI must not produce results or write the text for you. Never paste a classmate's draft into an AI tool.</w:t>
       </w:r>
     </w:p>
     <w:p>
@@ -3058,12 +2259,16 @@
     </w:p>
     <w:p>
       <w:r>
-        <w:t>Write the manuscript, the review report and the response letter in English. If English is impossible for you, you may write in Vietnamese.</w:t>
+        <w:t xml:space="preserve">Write in English. If English is impossible for you, Vietnamese is accepted. Send every file by email to the course lead, Vương Mỹ Lượng, at </w:t>
       </w:r>
-    </w:p>
-    <w:p>
       <w:r>
-        <w:t>Send everything to the course lead by email (or upload it to the online course folder):</w:t>
+        <w:rPr>
+          <w:b/>
+        </w:rPr>
+        <w:t>myluong1710@gmail.com</w:t>
+      </w:r>
+      <w:r>
+        <w:t>.</w:t>
       </w:r>
     </w:p>
     <w:tbl>
@@ -3080,8 +2285,9 @@
         <w:tblLook w:firstColumn="1" w:firstRow="1" w:lastColumn="0" w:lastRow="0" w:noHBand="0" w:noVBand="1" w:val="04A0"/>
       </w:tblPr>
       <w:tblGrid>
-        <w:gridCol w:w="7322"/>
-        <w:gridCol w:w="2090"/>
+        <w:gridCol w:w="5703"/>
+        <w:gridCol w:w="2189"/>
+        <w:gridCol w:w="1519"/>
       </w:tblGrid>
       <w:tr>
         <w:trPr>
@@ -3090,7 +2296,7 @@
         </w:trPr>
         <w:tc>
           <w:tcPr>
-            <w:tcW w:type="dxa" w:w="7321"/>
+            <w:tcW w:type="dxa" w:w="5702"/>
             <w:tcBorders>
               <w:top w:val="single" w:sz="4" w:color="04242F"/>
               <w:left w:val="single" w:sz="4" w:color="04242F"/>
@@ -3116,7 +2322,33 @@
         </w:tc>
         <w:tc>
           <w:tcPr>
-            <w:tcW w:type="dxa" w:w="2090"/>
+            <w:tcW w:type="dxa" w:w="2189"/>
+            <w:tcBorders>
+              <w:top w:val="single" w:sz="4" w:color="04242F"/>
+              <w:left w:val="single" w:sz="4" w:color="04242F"/>
+              <w:bottom w:val="single" w:sz="4" w:color="04242F"/>
+              <w:right w:val="single" w:sz="4" w:color="04242F"/>
+            </w:tcBorders>
+            <w:shd w:val="clear" w:color="auto" w:fill="04242F"/>
+          </w:tcPr>
+          <w:p>
+            <w:pPr>
+              <w:keepNext/>
+              <w:spacing w:after="0"/>
+            </w:pPr>
+            <w:r>
+              <w:rPr>
+                <w:b/>
+                <w:color w:val="FFFFFF"/>
+                <w:sz w:val="18"/>
+              </w:rPr>
+              <w:t>Send to</w:t>
+            </w:r>
+          </w:p>
+        </w:tc>
+        <w:tc>
+          <w:tcPr>
+            <w:tcW w:type="dxa" w:w="1520"/>
             <w:tcBorders>
               <w:top w:val="single" w:sz="4" w:color="04242F"/>
               <w:left w:val="single" w:sz="4" w:color="04242F"/>
@@ -3147,7 +2379,7 @@
         </w:trPr>
         <w:tc>
           <w:tcPr>
-            <w:tcW w:type="dxa" w:w="7321"/>
+            <w:tcW w:type="dxa" w:w="5702"/>
             <w:tcBorders>
               <w:top w:val="single" w:sz="4" w:color="D5DDE1"/>
               <w:left w:val="single" w:sz="4" w:color="D5DDE1"/>
@@ -3166,19 +2398,27 @@
                 <w:color w:val="0B376C"/>
                 <w:sz w:val="17"/>
               </w:rPr>
-              <w:t>Surname_Manuscript_QN_draft.docx</w:t>
+              <w:t>Surname_Firstname_Results_QN.docx</w:t>
             </w:r>
             <w:r>
               <w:rPr>
                 <w:sz w:val="17"/>
               </w:rPr>
-              <w:t xml:space="preserve"> (draft + completed STROBE checklist as an appendix)</w:t>
+              <w:t xml:space="preserve">, e.g. </w:t>
+            </w:r>
+            <w:r>
+              <w:rPr>
+                <w:rFonts w:ascii="Consolas" w:hAnsi="Consolas" w:cs="Consolas" w:eastAsia="Consolas"/>
+                <w:color w:val="0B376C"/>
+                <w:sz w:val="17"/>
+              </w:rPr>
+              <w:t>Nguyen_An_Results_Q2.docx</w:t>
             </w:r>
           </w:p>
         </w:tc>
         <w:tc>
           <w:tcPr>
-            <w:tcW w:type="dxa" w:w="2090"/>
+            <w:tcW w:type="dxa" w:w="2189"/>
             <w:tcBorders>
               <w:top w:val="single" w:sz="4" w:color="D5DDE1"/>
               <w:left w:val="single" w:sz="4" w:color="D5DDE1"/>
@@ -3195,7 +2435,30 @@
               <w:rPr>
                 <w:sz w:val="17"/>
               </w:rPr>
-              <w:t>23:59 on the day of Session 8</w:t>
+              <w:t>Your reviewer and the course lead</w:t>
+            </w:r>
+          </w:p>
+        </w:tc>
+        <w:tc>
+          <w:tcPr>
+            <w:tcW w:type="dxa" w:w="1520"/>
+            <w:tcBorders>
+              <w:top w:val="single" w:sz="4" w:color="D5DDE1"/>
+              <w:left w:val="single" w:sz="4" w:color="D5DDE1"/>
+              <w:bottom w:val="single" w:sz="4" w:color="D5DDE1"/>
+              <w:right w:val="single" w:sz="4" w:color="D5DDE1"/>
+            </w:tcBorders>
+          </w:tcPr>
+          <w:p>
+            <w:pPr>
+              <w:keepNext/>
+              <w:spacing w:after="0"/>
+            </w:pPr>
+            <w:r>
+              <w:rPr>
+                <w:sz w:val="17"/>
+              </w:rPr>
+              <w:t>23:59, 19 December 2026</w:t>
             </w:r>
           </w:p>
         </w:tc>
@@ -3206,7 +2469,7 @@
         </w:trPr>
         <w:tc>
           <w:tcPr>
-            <w:tcW w:type="dxa" w:w="7321"/>
+            <w:tcW w:type="dxa" w:w="5702"/>
             <w:tcBorders>
               <w:top w:val="single" w:sz="4" w:color="D5DDE1"/>
               <w:left w:val="single" w:sz="4" w:color="D5DDE1"/>
@@ -3226,19 +2489,19 @@
                 <w:color w:val="0B376C"/>
                 <w:sz w:val="17"/>
               </w:rPr>
-              <w:t>Surname_Review_of_[author's surname].docx</w:t>
+              <w:t>Surname_Firstname_Review.docx</w:t>
             </w:r>
             <w:r>
               <w:rPr>
                 <w:sz w:val="17"/>
               </w:rPr>
-              <w:t xml:space="preserve"> (review report)</w:t>
+              <w:t xml:space="preserve"> (your review of a classmate's draft)</w:t>
             </w:r>
           </w:p>
         </w:tc>
         <w:tc>
           <w:tcPr>
-            <w:tcW w:type="dxa" w:w="2090"/>
+            <w:tcW w:type="dxa" w:w="2189"/>
             <w:tcBorders>
               <w:top w:val="single" w:sz="4" w:color="D5DDE1"/>
               <w:left w:val="single" w:sz="4" w:color="D5DDE1"/>
@@ -3256,7 +2519,31 @@
               <w:rPr>
                 <w:sz w:val="17"/>
               </w:rPr>
-              <w:t>1 week after Session 8</w:t>
+              <w:t>The author and the course lead</w:t>
+            </w:r>
+          </w:p>
+        </w:tc>
+        <w:tc>
+          <w:tcPr>
+            <w:tcW w:type="dxa" w:w="1520"/>
+            <w:tcBorders>
+              <w:top w:val="single" w:sz="4" w:color="D5DDE1"/>
+              <w:left w:val="single" w:sz="4" w:color="D5DDE1"/>
+              <w:bottom w:val="single" w:sz="4" w:color="D5DDE1"/>
+              <w:right w:val="single" w:sz="4" w:color="D5DDE1"/>
+            </w:tcBorders>
+            <w:shd w:val="clear" w:color="auto" w:fill="F5F9FA"/>
+          </w:tcPr>
+          <w:p>
+            <w:pPr>
+              <w:keepNext/>
+              <w:spacing w:after="0"/>
+            </w:pPr>
+            <w:r>
+              <w:rPr>
+                <w:sz w:val="17"/>
+              </w:rPr>
+              <w:t>2 January 2027</w:t>
             </w:r>
           </w:p>
         </w:tc>
@@ -3267,7 +2554,7 @@
         </w:trPr>
         <w:tc>
           <w:tcPr>
-            <w:tcW w:type="dxa" w:w="7321"/>
+            <w:tcW w:type="dxa" w:w="5702"/>
             <w:tcBorders>
               <w:top w:val="single" w:sz="4" w:color="D5DDE1"/>
               <w:left w:val="single" w:sz="4" w:color="D5DDE1"/>
@@ -3285,13 +2572,13 @@
                 <w:color w:val="0B376C"/>
                 <w:sz w:val="17"/>
               </w:rPr>
-              <w:t>Surname_Manuscript_QN_revised.docx</w:t>
+              <w:t>Surname_Firstname_Results_QN_revised.docx</w:t>
             </w:r>
             <w:r>
               <w:rPr>
                 <w:sz w:val="17"/>
               </w:rPr>
-              <w:t xml:space="preserve"> (with tracked changes) and </w:t>
+              <w:t xml:space="preserve"> (tracked changes) and </w:t>
             </w:r>
             <w:r>
               <w:rPr>
@@ -3299,33 +2586,13 @@
                 <w:color w:val="0B376C"/>
                 <w:sz w:val="17"/>
               </w:rPr>
-              <w:t>Surname_Response_to_Reviewers.docx</w:t>
-            </w:r>
-            <w:r>
-              <w:rPr>
-                <w:sz w:val="17"/>
-              </w:rPr>
-              <w:t xml:space="preserve"> (using </w:t>
-            </w:r>
-            <w:r>
-              <w:rPr>
-                <w:rFonts w:ascii="Consolas" w:hAnsi="Consolas" w:cs="Consolas" w:eastAsia="Consolas"/>
-                <w:color w:val="0B376C"/>
-                <w:sz w:val="17"/>
-              </w:rPr>
-              <w:t>Course/Templates/Response_to_Reviewers_Template.docx</w:t>
-            </w:r>
-            <w:r>
-              <w:rPr>
-                <w:sz w:val="17"/>
-              </w:rPr>
-              <w:t>)</w:t>
+              <w:t>Surname_Firstname_Response.docx</w:t>
             </w:r>
           </w:p>
         </w:tc>
         <w:tc>
           <w:tcPr>
-            <w:tcW w:type="dxa" w:w="2090"/>
+            <w:tcW w:type="dxa" w:w="2189"/>
             <w:tcBorders>
               <w:top w:val="single" w:sz="4" w:color="D5DDE1"/>
               <w:left w:val="single" w:sz="4" w:color="D5DDE1"/>
@@ -3341,7 +2608,29 @@
               <w:rPr>
                 <w:sz w:val="17"/>
               </w:rPr>
-              <w:t>2 weeks after Session 8</w:t>
+              <w:t>The course lead</w:t>
+            </w:r>
+          </w:p>
+        </w:tc>
+        <w:tc>
+          <w:tcPr>
+            <w:tcW w:type="dxa" w:w="1520"/>
+            <w:tcBorders>
+              <w:top w:val="single" w:sz="4" w:color="D5DDE1"/>
+              <w:left w:val="single" w:sz="4" w:color="D5DDE1"/>
+              <w:bottom w:val="single" w:sz="4" w:color="D5DDE1"/>
+              <w:right w:val="single" w:sz="4" w:color="D5DDE1"/>
+            </w:tcBorders>
+          </w:tcPr>
+          <w:p>
+            <w:pPr>
+              <w:spacing w:after="0"/>
+            </w:pPr>
+            <w:r>
+              <w:rPr>
+                <w:sz w:val="17"/>
+              </w:rPr>
+              <w:t>30 January 2027</w:t>
             </w:r>
           </w:p>
         </w:tc>
@@ -3353,25 +2642,11 @@
       </w:pPr>
     </w:p>
     <w:p>
-      <w:r>
-        <w:t xml:space="preserve">Within 2 days of Session 8 the course lead sends each participant </w:t>
-      </w:r>
-      <w:r>
-        <w:rPr>
-          <w:b/>
-        </w:rPr>
-        <w:t>one</w:t>
-      </w:r>
-      <w:r>
-        <w:t xml:space="preserve"> classmate's draft to review, by email or through the course folder. Each participant reviews one draft and receives one review. Where possible the instructor pairs drafts on a different question from your own, so that you read a second question in depth.</w:t>
-      </w:r>
-    </w:p>
-    <w:p>
       <w:pPr>
         <w:pStyle w:val="Heading1"/>
       </w:pPr>
       <w:r>
-        <w:t>8. Feedback</w:t>
+        <w:t>8.</w:t>
       </w:r>
     </w:p>
     <w:p>
@@ -3379,37 +2654,7 @@
         <w:pStyle w:val="ListBullet"/>
       </w:pPr>
       <w:r>
-        <w:t>Feedback on the manuscript comes from the classmate who reviews your draft (</w:t>
-      </w:r>
-      <w:r>
-        <w:rPr>
-          <w:rFonts w:ascii="Consolas" w:hAnsi="Consolas" w:cs="Consolas" w:eastAsia="Consolas"/>
-          <w:color w:val="0B376C"/>
-          <w:sz w:val="19"/>
-        </w:rPr>
-        <w:t>Peer_Review_Instructions.pdf</w:t>
-      </w:r>
-      <w:r>
-        <w:t>) and from the instructors.</w:t>
-      </w:r>
-    </w:p>
-    <w:p>
-      <w:pPr>
-        <w:pStyle w:val="ListBullet"/>
-      </w:pPr>
-      <w:r>
-        <w:t xml:space="preserve">Instructors mark the revised manuscript and the response letter with </w:t>
-      </w:r>
-      <w:r>
-        <w:rPr>
-          <w:rFonts w:ascii="Consolas" w:hAnsi="Consolas" w:cs="Consolas" w:eastAsia="Consolas"/>
-          <w:color w:val="0B376C"/>
-          <w:sz w:val="19"/>
-        </w:rPr>
-        <w:t>Manuscript_Rubric.pdf</w:t>
-      </w:r>
-      <w:r>
-        <w:t xml:space="preserve"> and return written comments within about 3 weeks. If you do not send a revision, the draft is marked instead.</w:t>
+        <w:t>You receive a review from your classmate, and written comments from the instructors on the revised Results section (or on the draft, if no revision arrives) and on any optional parts.</w:t>
       </w:r>
     </w:p>
     <w:p>

</xml_diff>

<commit_message>
Rebuild site: round 6 (giảng viên, new deadlines, IMRaD taught as core)
</commit_message>
<xml_diff>
--- a/en/files/assignments/Manuscript_Brief.docx
+++ b/en/files/assignments/Manuscript_Brief.docx
@@ -121,7 +121,7 @@
         <w:t>Manuscript_Rubric.pdf</w:t>
       </w:r>
       <w:r>
-        <w:t xml:space="preserve"> (formative). Peer review: </w:t>
+        <w:t xml:space="preserve">. Peer review: </w:t>
       </w:r>
       <w:r>
         <w:rPr>
@@ -145,21 +145,7 @@
     </w:p>
     <w:p>
       <w:r>
-        <w:t>In the proposal you plan a study that has not been done. Here you report one that has. You write the Results section of a FLUID-ICU paper to the standard a journal expects: every number correct, every estimate with its 95% CI, tables that stand alone and no interpretation. If you have time, you can write the other sections too.</w:t>
-      </w:r>
-    </w:p>
-    <w:p>
-      <w:pPr>
-        <w:pStyle w:val="KeyFindings"/>
-      </w:pPr>
-      <w:r>
-        <w:rPr>
-          <w:b/>
-        </w:rPr>
-        <w:t>Simulated data.</w:t>
-      </w:r>
-      <w:r>
-        <w:t xml:space="preserve"> FLUID-ICU is a simulated training dataset. Put this sentence under your title: "This manuscript uses simulated data created for training. It reports no real patients." Never submit it to a journal.</w:t>
+        <w:t>You write the Results section of a FLUID-ICU paper to the standard a journal expects: every number correct, every estimate with its 95% CI, tables that stand alone and no interpretation.</w:t>
       </w:r>
     </w:p>
     <w:p>
@@ -989,7 +975,7 @@
     </w:p>
     <w:p>
       <w:r>
-        <w:t>Use only the numbers in your results pack. If something is missing, ask the instructor.</w:t>
+        <w:t>If something is missing from your results pack, ask the instructor.</w:t>
       </w:r>
     </w:p>
     <w:p>
@@ -1022,8 +1008,8 @@
         <w:tblLook w:firstColumn="1" w:firstRow="1" w:lastColumn="0" w:lastRow="0" w:noHBand="0" w:noVBand="1" w:val="04A0"/>
       </w:tblPr>
       <w:tblGrid>
-        <w:gridCol w:w="1389"/>
-        <w:gridCol w:w="8023"/>
+        <w:gridCol w:w="1293"/>
+        <w:gridCol w:w="8118"/>
       </w:tblGrid>
       <w:tr>
         <w:trPr>
@@ -1032,7 +1018,7 @@
         </w:trPr>
         <w:tc>
           <w:tcPr>
-            <w:tcW w:type="dxa" w:w="1389"/>
+            <w:tcW w:type="dxa" w:w="1293"/>
             <w:tcBorders>
               <w:top w:val="single" w:sz="4" w:color="04242F"/>
               <w:left w:val="single" w:sz="4" w:color="04242F"/>
@@ -1058,7 +1044,7 @@
         </w:tc>
         <w:tc>
           <w:tcPr>
-            <w:tcW w:type="dxa" w:w="8022"/>
+            <w:tcW w:type="dxa" w:w="8118"/>
             <w:tcBorders>
               <w:top w:val="single" w:sz="4" w:color="04242F"/>
               <w:left w:val="single" w:sz="4" w:color="04242F"/>
@@ -1089,7 +1075,7 @@
         </w:trPr>
         <w:tc>
           <w:tcPr>
-            <w:tcW w:type="dxa" w:w="1389"/>
+            <w:tcW w:type="dxa" w:w="1293"/>
             <w:tcBorders>
               <w:top w:val="single" w:sz="4" w:color="D5DDE1"/>
               <w:left w:val="single" w:sz="4" w:color="D5DDE1"/>
@@ -1112,7 +1098,7 @@
         </w:tc>
         <w:tc>
           <w:tcPr>
-            <w:tcW w:type="dxa" w:w="8022"/>
+            <w:tcW w:type="dxa" w:w="8118"/>
             <w:tcBorders>
               <w:top w:val="single" w:sz="4" w:color="D5DDE1"/>
               <w:left w:val="single" w:sz="4" w:color="D5DDE1"/>
@@ -1140,7 +1126,7 @@
         </w:trPr>
         <w:tc>
           <w:tcPr>
-            <w:tcW w:type="dxa" w:w="1389"/>
+            <w:tcW w:type="dxa" w:w="1293"/>
             <w:tcBorders>
               <w:top w:val="single" w:sz="4" w:color="D5DDE1"/>
               <w:left w:val="single" w:sz="4" w:color="D5DDE1"/>
@@ -1164,7 +1150,7 @@
         </w:tc>
         <w:tc>
           <w:tcPr>
-            <w:tcW w:type="dxa" w:w="8022"/>
+            <w:tcW w:type="dxa" w:w="8118"/>
             <w:tcBorders>
               <w:top w:val="single" w:sz="4" w:color="D5DDE1"/>
               <w:left w:val="single" w:sz="4" w:color="D5DDE1"/>
@@ -1193,7 +1179,7 @@
         </w:trPr>
         <w:tc>
           <w:tcPr>
-            <w:tcW w:type="dxa" w:w="1389"/>
+            <w:tcW w:type="dxa" w:w="1293"/>
             <w:tcBorders>
               <w:top w:val="single" w:sz="4" w:color="D5DDE1"/>
               <w:left w:val="single" w:sz="4" w:color="D5DDE1"/>
@@ -1216,7 +1202,7 @@
         </w:tc>
         <w:tc>
           <w:tcPr>
-            <w:tcW w:type="dxa" w:w="8022"/>
+            <w:tcW w:type="dxa" w:w="8118"/>
             <w:tcBorders>
               <w:top w:val="single" w:sz="4" w:color="D5DDE1"/>
               <w:left w:val="single" w:sz="4" w:color="D5DDE1"/>
@@ -1233,7 +1219,7 @@
               <w:rPr>
                 <w:sz w:val="17"/>
               </w:rPr>
-              <w:t>Baseline characteristics by exposure group, from your results pack</w:t>
+              <w:t>Baseline characteristics, from your results pack</w:t>
             </w:r>
           </w:p>
         </w:tc>
@@ -1244,7 +1230,7 @@
         </w:trPr>
         <w:tc>
           <w:tcPr>
-            <w:tcW w:type="dxa" w:w="1389"/>
+            <w:tcW w:type="dxa" w:w="1293"/>
             <w:tcBorders>
               <w:top w:val="single" w:sz="4" w:color="D5DDE1"/>
               <w:left w:val="single" w:sz="4" w:color="D5DDE1"/>
@@ -1268,7 +1254,7 @@
         </w:tc>
         <w:tc>
           <w:tcPr>
-            <w:tcW w:type="dxa" w:w="8022"/>
+            <w:tcW w:type="dxa" w:w="8118"/>
             <w:tcBorders>
               <w:top w:val="single" w:sz="4" w:color="D5DDE1"/>
               <w:left w:val="single" w:sz="4" w:color="D5DDE1"/>
@@ -1297,7 +1283,7 @@
         </w:trPr>
         <w:tc>
           <w:tcPr>
-            <w:tcW w:type="dxa" w:w="1389"/>
+            <w:tcW w:type="dxa" w:w="1293"/>
             <w:tcBorders>
               <w:top w:val="single" w:sz="4" w:color="D5DDE1"/>
               <w:left w:val="single" w:sz="4" w:color="D5DDE1"/>
@@ -1313,13 +1299,13 @@
               <w:rPr>
                 <w:sz w:val="17"/>
               </w:rPr>
-              <w:t>Two statements</w:t>
+              <w:t>AI-use statement</w:t>
             </w:r>
           </w:p>
         </w:tc>
         <w:tc>
           <w:tcPr>
-            <w:tcW w:type="dxa" w:w="8022"/>
+            <w:tcW w:type="dxa" w:w="8118"/>
             <w:tcBorders>
               <w:top w:val="single" w:sz="4" w:color="D5DDE1"/>
               <w:left w:val="single" w:sz="4" w:color="D5DDE1"/>
@@ -1335,7 +1321,7 @@
               <w:rPr>
                 <w:sz w:val="17"/>
               </w:rPr>
-              <w:t>The simulated-data sentence (section 1) and the AI-use statement (section 6)</w:t>
+              <w:t>See section 6</w:t>
             </w:r>
           </w:p>
         </w:tc>
@@ -1345,6 +1331,11 @@
       <w:pPr>
         <w:spacing w:after="80"/>
       </w:pPr>
+    </w:p>
+    <w:p>
+      <w:r>
+        <w:t>Table 1 and the main results table or figure come ready in your results pack (one pack per question, Q1 to Q5). You copy and format them, and write the text.</w:t>
+      </w:r>
     </w:p>
     <w:p>
       <w:r>
@@ -1526,7 +1517,7 @@
               <w:rPr>
                 <w:sz w:val="17"/>
               </w:rPr>
-              <w:t>STROBE items 4 to 12. All the information is in the results pack, the SAP and the data dictionary. Shown in Session 7</w:t>
+              <w:t>STROBE items 4 to 12. All the information is in the results pack, the SAP and the data dictionary. Taught in Session 7</w:t>
             </w:r>
           </w:p>
         </w:tc>
@@ -1579,7 +1570,7 @@
               <w:rPr>
                 <w:sz w:val="17"/>
               </w:rPr>
-              <w:t>Three paragraphs: what is known, what is not known, the aim. Session 8</w:t>
+              <w:t>Three paragraphs: what is known, what is not known, the aim. Taught in Session 8</w:t>
             </w:r>
           </w:p>
         </w:tc>
@@ -1630,7 +1621,7 @@
               <w:rPr>
                 <w:sz w:val="17"/>
               </w:rPr>
-              <w:t>Six moves: answer, compare, explain, limitations, implications, conclusion. Session 8</w:t>
+              <w:t>Six moves: answer, compare, explain, limitations, implications, conclusion. Taught in Session 8</w:t>
             </w:r>
           </w:p>
         </w:tc>
@@ -1681,7 +1672,7 @@
               <w:rPr>
                 <w:sz w:val="17"/>
               </w:rPr>
-              <w:t>Structured, 250 words or fewer. Session 8</w:t>
+              <w:t>Structured, 250 words or fewer. Taught in Session 8</w:t>
             </w:r>
           </w:p>
         </w:tc>
@@ -1694,7 +1685,7 @@
     </w:p>
     <w:p>
       <w:r>
-        <w:t>Send optional parts in the same file as your Results. They are not marked, but you get written feedback.</w:t>
+        <w:t>Send optional parts in the same file as your Results. They are not marked.</w:t>
       </w:r>
     </w:p>
     <w:p>
@@ -1719,8 +1710,8 @@
         <w:tblLook w:firstColumn="1" w:firstRow="1" w:lastColumn="0" w:lastRow="0" w:noHBand="0" w:noVBand="1" w:val="04A0"/>
       </w:tblPr>
       <w:tblGrid>
-        <w:gridCol w:w="3012"/>
-        <w:gridCol w:w="6399"/>
+        <w:gridCol w:w="2537"/>
+        <w:gridCol w:w="6874"/>
       </w:tblGrid>
       <w:tr>
         <w:trPr>
@@ -1729,7 +1720,7 @@
         </w:trPr>
         <w:tc>
           <w:tcPr>
-            <w:tcW w:type="dxa" w:w="3013"/>
+            <w:tcW w:type="dxa" w:w="2537"/>
             <w:tcBorders>
               <w:top w:val="single" w:sz="4" w:color="04242F"/>
               <w:left w:val="single" w:sz="4" w:color="04242F"/>
@@ -1755,7 +1746,7 @@
         </w:tc>
         <w:tc>
           <w:tcPr>
-            <w:tcW w:type="dxa" w:w="6399"/>
+            <w:tcW w:type="dxa" w:w="6874"/>
             <w:tcBorders>
               <w:top w:val="single" w:sz="4" w:color="04242F"/>
               <w:left w:val="single" w:sz="4" w:color="04242F"/>
@@ -1786,7 +1777,7 @@
         </w:trPr>
         <w:tc>
           <w:tcPr>
-            <w:tcW w:type="dxa" w:w="3013"/>
+            <w:tcW w:type="dxa" w:w="2537"/>
             <w:tcBorders>
               <w:top w:val="single" w:sz="4" w:color="D5DDE1"/>
               <w:left w:val="single" w:sz="4" w:color="D5DDE1"/>
@@ -1809,7 +1800,7 @@
         </w:tc>
         <w:tc>
           <w:tcPr>
-            <w:tcW w:type="dxa" w:w="6399"/>
+            <w:tcW w:type="dxa" w:w="6874"/>
             <w:tcBorders>
               <w:top w:val="single" w:sz="4" w:color="D5DDE1"/>
               <w:left w:val="single" w:sz="4" w:color="D5DDE1"/>
@@ -1837,7 +1828,7 @@
         </w:trPr>
         <w:tc>
           <w:tcPr>
-            <w:tcW w:type="dxa" w:w="3013"/>
+            <w:tcW w:type="dxa" w:w="2537"/>
             <w:tcBorders>
               <w:top w:val="single" w:sz="4" w:color="D5DDE1"/>
               <w:left w:val="single" w:sz="4" w:color="D5DDE1"/>
@@ -1861,7 +1852,7 @@
         </w:tc>
         <w:tc>
           <w:tcPr>
-            <w:tcW w:type="dxa" w:w="6399"/>
+            <w:tcW w:type="dxa" w:w="6874"/>
             <w:tcBorders>
               <w:top w:val="single" w:sz="4" w:color="D5DDE1"/>
               <w:left w:val="single" w:sz="4" w:color="D5DDE1"/>
@@ -1890,7 +1881,7 @@
         </w:trPr>
         <w:tc>
           <w:tcPr>
-            <w:tcW w:type="dxa" w:w="3013"/>
+            <w:tcW w:type="dxa" w:w="2537"/>
             <w:tcBorders>
               <w:top w:val="single" w:sz="4" w:color="D5DDE1"/>
               <w:left w:val="single" w:sz="4" w:color="D5DDE1"/>
@@ -1913,7 +1904,7 @@
         </w:tc>
         <w:tc>
           <w:tcPr>
-            <w:tcW w:type="dxa" w:w="6399"/>
+            <w:tcW w:type="dxa" w:w="6874"/>
             <w:tcBorders>
               <w:top w:val="single" w:sz="4" w:color="D5DDE1"/>
               <w:left w:val="single" w:sz="4" w:color="D5DDE1"/>
@@ -1930,7 +1921,7 @@
               <w:rPr>
                 <w:sz w:val="17"/>
               </w:rPr>
-              <w:t xml:space="preserve">Manuscript workshop 1: the instructor writes the Q1 Results live with the class, then you start yours. </w:t>
+              <w:t xml:space="preserve">IMRaD, Methods and Results taught. Manuscript workshop 1: the instructor writes the Q1 Results live with the class, then you start yours. </w:t>
             </w:r>
             <w:r>
               <w:rPr>
@@ -1948,7 +1939,7 @@
         </w:trPr>
         <w:tc>
           <w:tcPr>
-            <w:tcW w:type="dxa" w:w="3013"/>
+            <w:tcW w:type="dxa" w:w="2537"/>
             <w:tcBorders>
               <w:top w:val="single" w:sz="4" w:color="D5DDE1"/>
               <w:left w:val="single" w:sz="4" w:color="D5DDE1"/>
@@ -1972,7 +1963,7 @@
         </w:tc>
         <w:tc>
           <w:tcPr>
-            <w:tcW w:type="dxa" w:w="6399"/>
+            <w:tcW w:type="dxa" w:w="6874"/>
             <w:tcBorders>
               <w:top w:val="single" w:sz="4" w:color="D5DDE1"/>
               <w:left w:val="single" w:sz="4" w:color="D5DDE1"/>
@@ -1990,7 +1981,7 @@
               <w:rPr>
                 <w:sz w:val="17"/>
               </w:rPr>
-              <w:t>Manuscript workshop 2: improve your Results section, and an introduction to the optional parts</w:t>
+              <w:t>Introduction, Discussion, abstract and title taught. Manuscript workshop 2: improve your Results section</w:t>
             </w:r>
           </w:p>
         </w:tc>
@@ -2001,7 +1992,7 @@
         </w:trPr>
         <w:tc>
           <w:tcPr>
-            <w:tcW w:type="dxa" w:w="3013"/>
+            <w:tcW w:type="dxa" w:w="2537"/>
             <w:tcBorders>
               <w:top w:val="single" w:sz="4" w:color="D5DDE1"/>
               <w:left w:val="single" w:sz="4" w:color="D5DDE1"/>
@@ -2019,13 +2010,19 @@
                 <w:b/>
                 <w:sz w:val="17"/>
               </w:rPr>
-              <w:t>23:59, Saturday 19 December 2026</w:t>
+              <w:t>23:59, Sunday 20 December 2026</w:t>
+            </w:r>
+            <w:r>
+              <w:rPr>
+                <w:sz w:val="17"/>
+              </w:rPr>
+              <w:t xml:space="preserve"> (Vietnam time)</w:t>
             </w:r>
           </w:p>
         </w:tc>
         <w:tc>
           <w:tcPr>
-            <w:tcW w:type="dxa" w:w="6399"/>
+            <w:tcW w:type="dxa" w:w="6874"/>
             <w:tcBorders>
               <w:top w:val="single" w:sz="4" w:color="D5DDE1"/>
               <w:left w:val="single" w:sz="4" w:color="D5DDE1"/>
@@ -2053,7 +2050,7 @@
         </w:trPr>
         <w:tc>
           <w:tcPr>
-            <w:tcW w:type="dxa" w:w="3013"/>
+            <w:tcW w:type="dxa" w:w="2537"/>
             <w:tcBorders>
               <w:top w:val="single" w:sz="4" w:color="D5DDE1"/>
               <w:left w:val="single" w:sz="4" w:color="D5DDE1"/>
@@ -2072,19 +2069,13 @@
                 <w:b/>
                 <w:sz w:val="17"/>
               </w:rPr>
-              <w:t>Saturday 2 January 2027</w:t>
-            </w:r>
-            <w:r>
-              <w:rPr>
-                <w:sz w:val="17"/>
-              </w:rPr>
-              <w:t xml:space="preserve"> (2 weeks after Session 8)</w:t>
+              <w:t>Wednesday 30 December 2026</w:t>
             </w:r>
           </w:p>
         </w:tc>
         <w:tc>
           <w:tcPr>
-            <w:tcW w:type="dxa" w:w="6399"/>
+            <w:tcW w:type="dxa" w:w="6874"/>
             <w:tcBorders>
               <w:top w:val="single" w:sz="4" w:color="D5DDE1"/>
               <w:left w:val="single" w:sz="4" w:color="D5DDE1"/>
@@ -2113,7 +2104,7 @@
         </w:trPr>
         <w:tc>
           <w:tcPr>
-            <w:tcW w:type="dxa" w:w="3013"/>
+            <w:tcW w:type="dxa" w:w="2537"/>
             <w:tcBorders>
               <w:top w:val="single" w:sz="4" w:color="D5DDE1"/>
               <w:left w:val="single" w:sz="4" w:color="D5DDE1"/>
@@ -2131,19 +2122,13 @@
                 <w:b/>
                 <w:sz w:val="17"/>
               </w:rPr>
-              <w:t>Saturday 30 January 2027</w:t>
-            </w:r>
-            <w:r>
-              <w:rPr>
-                <w:sz w:val="17"/>
-              </w:rPr>
-              <w:t xml:space="preserve"> (4 weeks after the review)</w:t>
+              <w:t>Saturday 9 January 2027</w:t>
             </w:r>
           </w:p>
         </w:tc>
         <w:tc>
           <w:tcPr>
-            <w:tcW w:type="dxa" w:w="6399"/>
+            <w:tcW w:type="dxa" w:w="6874"/>
             <w:tcBorders>
               <w:top w:val="single" w:sz="4" w:color="D5DDE1"/>
               <w:left w:val="single" w:sz="4" w:color="D5DDE1"/>
@@ -2285,9 +2270,9 @@
         <w:tblLook w:firstColumn="1" w:firstRow="1" w:lastColumn="0" w:lastRow="0" w:noHBand="0" w:noVBand="1" w:val="04A0"/>
       </w:tblPr>
       <w:tblGrid>
-        <w:gridCol w:w="5703"/>
-        <w:gridCol w:w="2189"/>
-        <w:gridCol w:w="1519"/>
+        <w:gridCol w:w="5311"/>
+        <w:gridCol w:w="2038"/>
+        <w:gridCol w:w="2062"/>
       </w:tblGrid>
       <w:tr>
         <w:trPr>
@@ -2296,7 +2281,7 @@
         </w:trPr>
         <w:tc>
           <w:tcPr>
-            <w:tcW w:type="dxa" w:w="5702"/>
+            <w:tcW w:type="dxa" w:w="5310"/>
             <w:tcBorders>
               <w:top w:val="single" w:sz="4" w:color="04242F"/>
               <w:left w:val="single" w:sz="4" w:color="04242F"/>
@@ -2322,7 +2307,7 @@
         </w:tc>
         <w:tc>
           <w:tcPr>
-            <w:tcW w:type="dxa" w:w="2189"/>
+            <w:tcW w:type="dxa" w:w="2039"/>
             <w:tcBorders>
               <w:top w:val="single" w:sz="4" w:color="04242F"/>
               <w:left w:val="single" w:sz="4" w:color="04242F"/>
@@ -2348,7 +2333,7 @@
         </w:tc>
         <w:tc>
           <w:tcPr>
-            <w:tcW w:type="dxa" w:w="1520"/>
+            <w:tcW w:type="dxa" w:w="2062"/>
             <w:tcBorders>
               <w:top w:val="single" w:sz="4" w:color="04242F"/>
               <w:left w:val="single" w:sz="4" w:color="04242F"/>
@@ -2379,7 +2364,7 @@
         </w:trPr>
         <w:tc>
           <w:tcPr>
-            <w:tcW w:type="dxa" w:w="5702"/>
+            <w:tcW w:type="dxa" w:w="5310"/>
             <w:tcBorders>
               <w:top w:val="single" w:sz="4" w:color="D5DDE1"/>
               <w:left w:val="single" w:sz="4" w:color="D5DDE1"/>
@@ -2418,7 +2403,7 @@
         </w:tc>
         <w:tc>
           <w:tcPr>
-            <w:tcW w:type="dxa" w:w="2189"/>
+            <w:tcW w:type="dxa" w:w="2039"/>
             <w:tcBorders>
               <w:top w:val="single" w:sz="4" w:color="D5DDE1"/>
               <w:left w:val="single" w:sz="4" w:color="D5DDE1"/>
@@ -2441,7 +2426,7 @@
         </w:tc>
         <w:tc>
           <w:tcPr>
-            <w:tcW w:type="dxa" w:w="1520"/>
+            <w:tcW w:type="dxa" w:w="2062"/>
             <w:tcBorders>
               <w:top w:val="single" w:sz="4" w:color="D5DDE1"/>
               <w:left w:val="single" w:sz="4" w:color="D5DDE1"/>
@@ -2458,7 +2443,7 @@
               <w:rPr>
                 <w:sz w:val="17"/>
               </w:rPr>
-              <w:t>23:59, 19 December 2026</w:t>
+              <w:t>23:59, Sunday 20 December 2026</w:t>
             </w:r>
           </w:p>
         </w:tc>
@@ -2469,7 +2454,7 @@
         </w:trPr>
         <w:tc>
           <w:tcPr>
-            <w:tcW w:type="dxa" w:w="5702"/>
+            <w:tcW w:type="dxa" w:w="5310"/>
             <w:tcBorders>
               <w:top w:val="single" w:sz="4" w:color="D5DDE1"/>
               <w:left w:val="single" w:sz="4" w:color="D5DDE1"/>
@@ -2501,7 +2486,7 @@
         </w:tc>
         <w:tc>
           <w:tcPr>
-            <w:tcW w:type="dxa" w:w="2189"/>
+            <w:tcW w:type="dxa" w:w="2039"/>
             <w:tcBorders>
               <w:top w:val="single" w:sz="4" w:color="D5DDE1"/>
               <w:left w:val="single" w:sz="4" w:color="D5DDE1"/>
@@ -2525,7 +2510,7 @@
         </w:tc>
         <w:tc>
           <w:tcPr>
-            <w:tcW w:type="dxa" w:w="1520"/>
+            <w:tcW w:type="dxa" w:w="2062"/>
             <w:tcBorders>
               <w:top w:val="single" w:sz="4" w:color="D5DDE1"/>
               <w:left w:val="single" w:sz="4" w:color="D5DDE1"/>
@@ -2543,7 +2528,7 @@
               <w:rPr>
                 <w:sz w:val="17"/>
               </w:rPr>
-              <w:t>2 January 2027</w:t>
+              <w:t>Wednesday 30 December 2026</w:t>
             </w:r>
           </w:p>
         </w:tc>
@@ -2554,7 +2539,7 @@
         </w:trPr>
         <w:tc>
           <w:tcPr>
-            <w:tcW w:type="dxa" w:w="5702"/>
+            <w:tcW w:type="dxa" w:w="5310"/>
             <w:tcBorders>
               <w:top w:val="single" w:sz="4" w:color="D5DDE1"/>
               <w:left w:val="single" w:sz="4" w:color="D5DDE1"/>
@@ -2592,7 +2577,7 @@
         </w:tc>
         <w:tc>
           <w:tcPr>
-            <w:tcW w:type="dxa" w:w="2189"/>
+            <w:tcW w:type="dxa" w:w="2039"/>
             <w:tcBorders>
               <w:top w:val="single" w:sz="4" w:color="D5DDE1"/>
               <w:left w:val="single" w:sz="4" w:color="D5DDE1"/>
@@ -2614,7 +2599,7 @@
         </w:tc>
         <w:tc>
           <w:tcPr>
-            <w:tcW w:type="dxa" w:w="1520"/>
+            <w:tcW w:type="dxa" w:w="2062"/>
             <w:tcBorders>
               <w:top w:val="single" w:sz="4" w:color="D5DDE1"/>
               <w:left w:val="single" w:sz="4" w:color="D5DDE1"/>
@@ -2630,7 +2615,7 @@
               <w:rPr>
                 <w:sz w:val="17"/>
               </w:rPr>
-              <w:t>30 January 2027</w:t>
+              <w:t>Saturday 9 January 2027</w:t>
             </w:r>
           </w:p>
         </w:tc>
@@ -2656,18 +2641,6 @@
       <w:r>
         <w:t>You receive a review from your classmate, and written comments from the instructors on the revised Results section (or on the draft, if no revision arrives) and on any optional parts.</w:t>
       </w:r>
-    </w:p>
-    <w:p>
-      <w:pPr>
-        <w:pStyle w:val="ListBullet"/>
-      </w:pPr>
-      <w:r>
-        <w:rPr>
-          <w:b/>
-        </w:rPr>
-        <w:t>The marks are formative.</w:t>
-      </w:r>
-      <w:r/>
     </w:p>
     <w:sectPr>
       <w:headerReference w:type="default" r:id="rId9"/>

</xml_diff>

<commit_message>
Rebuild: instructor wording in English, rubric and proposal brief follow-up
</commit_message>
<xml_diff>
--- a/en/files/assignments/Manuscript_Brief.docx
+++ b/en/files/assignments/Manuscript_Brief.docx
@@ -158,7 +158,7 @@
     </w:p>
     <w:p>
       <w:r>
-        <w:t>All five questions are worked through in Sessions 5 and 6 (Q1 in full). By the end of Session 6, choose one and tell the course lead in the chat or by email. Any number of participants may choose the same question. Q1 is modelled live in Session 7, so it is the easiest start.</w:t>
+        <w:t>All five questions are worked through in Sessions 5 and 6 (Q1 in full). By the end of Session 6, choose one and tell the instructor in the chat or by email. Any number of participants may choose the same question. Q1 is modelled live in Session 7, so it is the easiest start.</w:t>
       </w:r>
     </w:p>
     <w:tbl>
@@ -1710,8 +1710,8 @@
         <w:tblLook w:firstColumn="1" w:firstRow="1" w:lastColumn="0" w:lastRow="0" w:noHBand="0" w:noVBand="1" w:val="04A0"/>
       </w:tblPr>
       <w:tblGrid>
-        <w:gridCol w:w="2537"/>
-        <w:gridCol w:w="6874"/>
+        <w:gridCol w:w="2543"/>
+        <w:gridCol w:w="6869"/>
       </w:tblGrid>
       <w:tr>
         <w:trPr>
@@ -1720,7 +1720,7 @@
         </w:trPr>
         <w:tc>
           <w:tcPr>
-            <w:tcW w:type="dxa" w:w="2537"/>
+            <w:tcW w:type="dxa" w:w="2543"/>
             <w:tcBorders>
               <w:top w:val="single" w:sz="4" w:color="04242F"/>
               <w:left w:val="single" w:sz="4" w:color="04242F"/>
@@ -1746,7 +1746,7 @@
         </w:tc>
         <w:tc>
           <w:tcPr>
-            <w:tcW w:type="dxa" w:w="6874"/>
+            <w:tcW w:type="dxa" w:w="6868"/>
             <w:tcBorders>
               <w:top w:val="single" w:sz="4" w:color="04242F"/>
               <w:left w:val="single" w:sz="4" w:color="04242F"/>
@@ -1777,7 +1777,7 @@
         </w:trPr>
         <w:tc>
           <w:tcPr>
-            <w:tcW w:type="dxa" w:w="2537"/>
+            <w:tcW w:type="dxa" w:w="2543"/>
             <w:tcBorders>
               <w:top w:val="single" w:sz="4" w:color="D5DDE1"/>
               <w:left w:val="single" w:sz="4" w:color="D5DDE1"/>
@@ -1800,7 +1800,7 @@
         </w:tc>
         <w:tc>
           <w:tcPr>
-            <w:tcW w:type="dxa" w:w="6874"/>
+            <w:tcW w:type="dxa" w:w="6868"/>
             <w:tcBorders>
               <w:top w:val="single" w:sz="4" w:color="D5DDE1"/>
               <w:left w:val="single" w:sz="4" w:color="D5DDE1"/>
@@ -1828,7 +1828,7 @@
         </w:trPr>
         <w:tc>
           <w:tcPr>
-            <w:tcW w:type="dxa" w:w="2537"/>
+            <w:tcW w:type="dxa" w:w="2543"/>
             <w:tcBorders>
               <w:top w:val="single" w:sz="4" w:color="D5DDE1"/>
               <w:left w:val="single" w:sz="4" w:color="D5DDE1"/>
@@ -1852,7 +1852,7 @@
         </w:tc>
         <w:tc>
           <w:tcPr>
-            <w:tcW w:type="dxa" w:w="6874"/>
+            <w:tcW w:type="dxa" w:w="6868"/>
             <w:tcBorders>
               <w:top w:val="single" w:sz="4" w:color="D5DDE1"/>
               <w:left w:val="single" w:sz="4" w:color="D5DDE1"/>
@@ -1881,7 +1881,7 @@
         </w:trPr>
         <w:tc>
           <w:tcPr>
-            <w:tcW w:type="dxa" w:w="2537"/>
+            <w:tcW w:type="dxa" w:w="2543"/>
             <w:tcBorders>
               <w:top w:val="single" w:sz="4" w:color="D5DDE1"/>
               <w:left w:val="single" w:sz="4" w:color="D5DDE1"/>
@@ -1904,7 +1904,7 @@
         </w:tc>
         <w:tc>
           <w:tcPr>
-            <w:tcW w:type="dxa" w:w="6874"/>
+            <w:tcW w:type="dxa" w:w="6868"/>
             <w:tcBorders>
               <w:top w:val="single" w:sz="4" w:color="D5DDE1"/>
               <w:left w:val="single" w:sz="4" w:color="D5DDE1"/>
@@ -1939,7 +1939,7 @@
         </w:trPr>
         <w:tc>
           <w:tcPr>
-            <w:tcW w:type="dxa" w:w="2537"/>
+            <w:tcW w:type="dxa" w:w="2543"/>
             <w:tcBorders>
               <w:top w:val="single" w:sz="4" w:color="D5DDE1"/>
               <w:left w:val="single" w:sz="4" w:color="D5DDE1"/>
@@ -1963,7 +1963,7 @@
         </w:tc>
         <w:tc>
           <w:tcPr>
-            <w:tcW w:type="dxa" w:w="6874"/>
+            <w:tcW w:type="dxa" w:w="6868"/>
             <w:tcBorders>
               <w:top w:val="single" w:sz="4" w:color="D5DDE1"/>
               <w:left w:val="single" w:sz="4" w:color="D5DDE1"/>
@@ -1992,7 +1992,7 @@
         </w:trPr>
         <w:tc>
           <w:tcPr>
-            <w:tcW w:type="dxa" w:w="2537"/>
+            <w:tcW w:type="dxa" w:w="2543"/>
             <w:tcBorders>
               <w:top w:val="single" w:sz="4" w:color="D5DDE1"/>
               <w:left w:val="single" w:sz="4" w:color="D5DDE1"/>
@@ -2022,7 +2022,7 @@
         </w:tc>
         <w:tc>
           <w:tcPr>
-            <w:tcW w:type="dxa" w:w="6874"/>
+            <w:tcW w:type="dxa" w:w="6868"/>
             <w:tcBorders>
               <w:top w:val="single" w:sz="4" w:color="D5DDE1"/>
               <w:left w:val="single" w:sz="4" w:color="D5DDE1"/>
@@ -2039,7 +2039,7 @@
               <w:rPr>
                 <w:sz w:val="17"/>
               </w:rPr>
-              <w:t>Results draft due. Email it to your reviewer and to the course lead</w:t>
+              <w:t>Results draft due. Email it to your reviewer and to the instructor</w:t>
             </w:r>
           </w:p>
         </w:tc>
@@ -2050,7 +2050,7 @@
         </w:trPr>
         <w:tc>
           <w:tcPr>
-            <w:tcW w:type="dxa" w:w="2537"/>
+            <w:tcW w:type="dxa" w:w="2543"/>
             <w:tcBorders>
               <w:top w:val="single" w:sz="4" w:color="D5DDE1"/>
               <w:left w:val="single" w:sz="4" w:color="D5DDE1"/>
@@ -2075,7 +2075,7 @@
         </w:tc>
         <w:tc>
           <w:tcPr>
-            <w:tcW w:type="dxa" w:w="6874"/>
+            <w:tcW w:type="dxa" w:w="6868"/>
             <w:tcBorders>
               <w:top w:val="single" w:sz="4" w:color="D5DDE1"/>
               <w:left w:val="single" w:sz="4" w:color="D5DDE1"/>
@@ -2093,7 +2093,7 @@
               <w:rPr>
                 <w:sz w:val="17"/>
               </w:rPr>
-              <w:t>Review report due. Email it to the author and to the course lead</w:t>
+              <w:t>Review report due. Email it to the author and to the instructor</w:t>
             </w:r>
           </w:p>
         </w:tc>
@@ -2104,7 +2104,7 @@
         </w:trPr>
         <w:tc>
           <w:tcPr>
-            <w:tcW w:type="dxa" w:w="2537"/>
+            <w:tcW w:type="dxa" w:w="2543"/>
             <w:tcBorders>
               <w:top w:val="single" w:sz="4" w:color="D5DDE1"/>
               <w:left w:val="single" w:sz="4" w:color="D5DDE1"/>
@@ -2128,7 +2128,7 @@
         </w:tc>
         <w:tc>
           <w:tcPr>
-            <w:tcW w:type="dxa" w:w="6874"/>
+            <w:tcW w:type="dxa" w:w="6868"/>
             <w:tcBorders>
               <w:top w:val="single" w:sz="4" w:color="D5DDE1"/>
               <w:left w:val="single" w:sz="4" w:color="D5DDE1"/>
@@ -2244,7 +2244,7 @@
     </w:p>
     <w:p>
       <w:r>
-        <w:t xml:space="preserve">Write in English. If English is impossible for you, Vietnamese is accepted. Send every file by email to the course lead, Vương Mỹ Lượng, at </w:t>
+        <w:t xml:space="preserve">Write in English. If English is impossible for you, Vietnamese is accepted. Send every file by email to the instructor, Vương Mỹ Lượng, at </w:t>
       </w:r>
       <w:r>
         <w:rPr>
@@ -2270,9 +2270,9 @@
         <w:tblLook w:firstColumn="1" w:firstRow="1" w:lastColumn="0" w:lastRow="0" w:noHBand="0" w:noVBand="1" w:val="04A0"/>
       </w:tblPr>
       <w:tblGrid>
-        <w:gridCol w:w="5311"/>
-        <w:gridCol w:w="2038"/>
-        <w:gridCol w:w="2062"/>
+        <w:gridCol w:w="5351"/>
+        <w:gridCol w:w="1982"/>
+        <w:gridCol w:w="2077"/>
       </w:tblGrid>
       <w:tr>
         <w:trPr>
@@ -2281,7 +2281,7 @@
         </w:trPr>
         <w:tc>
           <w:tcPr>
-            <w:tcW w:type="dxa" w:w="5310"/>
+            <w:tcW w:type="dxa" w:w="5351"/>
             <w:tcBorders>
               <w:top w:val="single" w:sz="4" w:color="04242F"/>
               <w:left w:val="single" w:sz="4" w:color="04242F"/>
@@ -2307,7 +2307,7 @@
         </w:tc>
         <w:tc>
           <w:tcPr>
-            <w:tcW w:type="dxa" w:w="2039"/>
+            <w:tcW w:type="dxa" w:w="1983"/>
             <w:tcBorders>
               <w:top w:val="single" w:sz="4" w:color="04242F"/>
               <w:left w:val="single" w:sz="4" w:color="04242F"/>
@@ -2333,7 +2333,7 @@
         </w:tc>
         <w:tc>
           <w:tcPr>
-            <w:tcW w:type="dxa" w:w="2062"/>
+            <w:tcW w:type="dxa" w:w="2078"/>
             <w:tcBorders>
               <w:top w:val="single" w:sz="4" w:color="04242F"/>
               <w:left w:val="single" w:sz="4" w:color="04242F"/>
@@ -2364,7 +2364,7 @@
         </w:trPr>
         <w:tc>
           <w:tcPr>
-            <w:tcW w:type="dxa" w:w="5310"/>
+            <w:tcW w:type="dxa" w:w="5351"/>
             <w:tcBorders>
               <w:top w:val="single" w:sz="4" w:color="D5DDE1"/>
               <w:left w:val="single" w:sz="4" w:color="D5DDE1"/>
@@ -2403,7 +2403,7 @@
         </w:tc>
         <w:tc>
           <w:tcPr>
-            <w:tcW w:type="dxa" w:w="2039"/>
+            <w:tcW w:type="dxa" w:w="1983"/>
             <w:tcBorders>
               <w:top w:val="single" w:sz="4" w:color="D5DDE1"/>
               <w:left w:val="single" w:sz="4" w:color="D5DDE1"/>
@@ -2420,13 +2420,13 @@
               <w:rPr>
                 <w:sz w:val="17"/>
               </w:rPr>
-              <w:t>Your reviewer and the course lead</w:t>
+              <w:t>Your reviewer and the instructor</w:t>
             </w:r>
           </w:p>
         </w:tc>
         <w:tc>
           <w:tcPr>
-            <w:tcW w:type="dxa" w:w="2062"/>
+            <w:tcW w:type="dxa" w:w="2078"/>
             <w:tcBorders>
               <w:top w:val="single" w:sz="4" w:color="D5DDE1"/>
               <w:left w:val="single" w:sz="4" w:color="D5DDE1"/>
@@ -2454,7 +2454,7 @@
         </w:trPr>
         <w:tc>
           <w:tcPr>
-            <w:tcW w:type="dxa" w:w="5310"/>
+            <w:tcW w:type="dxa" w:w="5351"/>
             <w:tcBorders>
               <w:top w:val="single" w:sz="4" w:color="D5DDE1"/>
               <w:left w:val="single" w:sz="4" w:color="D5DDE1"/>
@@ -2486,7 +2486,7 @@
         </w:tc>
         <w:tc>
           <w:tcPr>
-            <w:tcW w:type="dxa" w:w="2039"/>
+            <w:tcW w:type="dxa" w:w="1983"/>
             <w:tcBorders>
               <w:top w:val="single" w:sz="4" w:color="D5DDE1"/>
               <w:left w:val="single" w:sz="4" w:color="D5DDE1"/>
@@ -2504,13 +2504,13 @@
               <w:rPr>
                 <w:sz w:val="17"/>
               </w:rPr>
-              <w:t>The author and the course lead</w:t>
+              <w:t>The author and the instructor</w:t>
             </w:r>
           </w:p>
         </w:tc>
         <w:tc>
           <w:tcPr>
-            <w:tcW w:type="dxa" w:w="2062"/>
+            <w:tcW w:type="dxa" w:w="2078"/>
             <w:tcBorders>
               <w:top w:val="single" w:sz="4" w:color="D5DDE1"/>
               <w:left w:val="single" w:sz="4" w:color="D5DDE1"/>
@@ -2539,7 +2539,7 @@
         </w:trPr>
         <w:tc>
           <w:tcPr>
-            <w:tcW w:type="dxa" w:w="5310"/>
+            <w:tcW w:type="dxa" w:w="5351"/>
             <w:tcBorders>
               <w:top w:val="single" w:sz="4" w:color="D5DDE1"/>
               <w:left w:val="single" w:sz="4" w:color="D5DDE1"/>
@@ -2577,7 +2577,7 @@
         </w:tc>
         <w:tc>
           <w:tcPr>
-            <w:tcW w:type="dxa" w:w="2039"/>
+            <w:tcW w:type="dxa" w:w="1983"/>
             <w:tcBorders>
               <w:top w:val="single" w:sz="4" w:color="D5DDE1"/>
               <w:left w:val="single" w:sz="4" w:color="D5DDE1"/>
@@ -2593,13 +2593,13 @@
               <w:rPr>
                 <w:sz w:val="17"/>
               </w:rPr>
-              <w:t>The course lead</w:t>
+              <w:t>The instructor</w:t>
             </w:r>
           </w:p>
         </w:tc>
         <w:tc>
           <w:tcPr>
-            <w:tcW w:type="dxa" w:w="2062"/>
+            <w:tcW w:type="dxa" w:w="2078"/>
             <w:tcBorders>
               <w:top w:val="single" w:sz="4" w:color="D5DDE1"/>
               <w:left w:val="single" w:sz="4" w:color="D5DDE1"/>

</xml_diff>